<commit_message>
Updates based on AI feedback
</commit_message>
<xml_diff>
--- a/Claude outputs/pre-launch-open-items.docx
+++ b/Claude outputs/pre-launch-open-items.docx
@@ -26,15 +26,15 @@
           <w:b/>
           <w:bCs/>
           <w:color w:val="2A2620"/>
-          <w:sz w:val="48"/>
-          <w:szCs w:val="48"/>
-        </w:rPr>
-        <w:t xml:space="preserve">Pre-launch open items</w:t>
-      </w:r>
-    </w:p>
-    <w:p>
-      <w:pPr>
-        <w:spacing w:after="40"/>
+          <w:sz w:val="44"/>
+          <w:szCs w:val="44"/>
+        </w:rPr>
+        <w:t xml:space="preserve">Open items</w:t>
+      </w:r>
+    </w:p>
+    <w:p>
+      <w:pPr>
+        <w:spacing w:after="200"/>
       </w:pPr>
       <w:r>
         <w:rPr>
@@ -43,21 +43,7 @@
           <w:sz w:val="20"/>
           <w:szCs w:val="20"/>
         </w:rPr>
-        <w:t xml:space="preserve">Regenerated 31 October 2026, verified against the current build. 39 pages.</w:t>
-      </w:r>
-    </w:p>
-    <w:p>
-      <w:pPr>
-        <w:spacing w:after="260"/>
-      </w:pPr>
-      <w:r>
-        <w:rPr>
-          <w:rFonts w:ascii="Arial" w:cs="Arial" w:eastAsia="Arial" w:hAnsi="Arial"/>
-          <w:color w:val="5C5346"/>
-          <w:sz w:val="20"/>
-          <w:szCs w:val="20"/>
-        </w:rPr>
-        <w:t xml:space="preserve">findingbalancepllc.daveg-689.workers.dev  →  reemglascolpc.com</w:t>
+        <w:t xml:space="preserve">Regenerated 31 October 2026, evening, verified against the current build. 39 pages built, 38 indexable, 0 checker problems. Cross-referenced to the feedback action plan.</w:t>
       </w:r>
     </w:p>
     <w:p>
@@ -70,22 +56,7 @@
     </w:p>
     <w:p>
       <w:pPr>
-        <w:spacing w:after="200" w:before="0" w:line="276"/>
-      </w:pPr>
-      <w:r>
-        <w:rPr>
-          <w:rFonts w:ascii="Arial" w:cs="Arial" w:eastAsia="Arial" w:hAnsi="Arial"/>
-          <w:color w:val="2A2620"/>
-          <w:sz w:val="20"/>
-          <w:szCs w:val="20"/>
-        </w:rPr>
-        <w:t xml:space="preserve">The previous version of this document listed six blockers and twelve items for Reem. Most have since been closed; the closures are recorded at the end so nobody re-checks them.</w:t>
-      </w:r>
-    </w:p>
-    <w:p>
-      <w:pPr>
-        <w:pStyle w:val="Heading1"/>
-        <w:spacing w:after="140" w:before="320"/>
+        <w:spacing w:after="70" w:before="0" w:line="276"/>
       </w:pPr>
       <w:r>
         <w:rPr>
@@ -93,30 +64,24 @@
           <w:b/>
           <w:bCs/>
           <w:color w:val="2A2620"/>
-          <w:sz w:val="32"/>
-          <w:szCs w:val="32"/>
-        </w:rPr>
-        <w:t xml:space="preserve">A.  Blockers</w:t>
-      </w:r>
-    </w:p>
-    <w:p>
-      <w:pPr>
-        <w:spacing w:after="200" w:before="0" w:line="276"/>
-      </w:pPr>
-      <w:r>
-        <w:rPr>
-          <w:rFonts w:ascii="Arial" w:cs="Arial" w:eastAsia="Arial" w:hAnsi="Arial"/>
-          <w:color w:val="5C5346"/>
-          <w:sz w:val="20"/>
-          <w:szCs w:val="20"/>
-        </w:rPr>
-        <w:t xml:space="preserve">The site should not go live with these.</w:t>
-      </w:r>
-    </w:p>
-    <w:p>
-      <w:pPr>
-        <w:pStyle w:val="Heading2"/>
-        <w:spacing w:after="140" w:before="120"/>
+          <w:sz w:val="20"/>
+          <w:szCs w:val="20"/>
+        </w:rPr>
+        <w:t xml:space="preserve">Site:</w:t>
+      </w:r>
+      <w:r>
+        <w:rPr>
+          <w:rFonts w:ascii="Arial" w:cs="Arial" w:eastAsia="Arial" w:hAnsi="Arial"/>
+          <w:color w:val="2A2620"/>
+          <w:sz w:val="20"/>
+          <w:szCs w:val="20"/>
+        </w:rPr>
+        <w:t xml:space="preserve"> reemglascolpc.com (live)</w:t>
+      </w:r>
+    </w:p>
+    <w:p>
+      <w:pPr>
+        <w:spacing w:after="70" w:before="0" w:line="276"/>
       </w:pPr>
       <w:r>
         <w:rPr>
@@ -124,30 +89,65 @@
           <w:b/>
           <w:bCs/>
           <w:color w:val="2A2620"/>
-          <w:sz w:val="24"/>
-          <w:szCs w:val="24"/>
-        </w:rPr>
-        <w:t xml:space="preserve">A1.  The domain does not serve</w:t>
-      </w:r>
-    </w:p>
-    <w:p>
-      <w:pPr>
-        <w:spacing w:after="120" w:before="0" w:line="276"/>
-      </w:pPr>
-      <w:r>
-        <w:rPr>
-          <w:rFonts w:ascii="Arial" w:cs="Arial" w:eastAsia="Arial" w:hAnsi="Arial"/>
-          <w:color w:val="2A2620"/>
-          <w:sz w:val="20"/>
-          <w:szCs w:val="20"/>
-        </w:rPr>
-        <w:t xml:space="preserve">reemglascolpc.com returns nothing. All 39 pages canonical to it, the sitemap lists it, and robots.txt points its Sitemap: line there. Until DNS points at the Worker, a crawler that finds the preview is sent to dead URLs.</w:t>
-      </w:r>
-    </w:p>
-    <w:p>
-      <w:pPr>
-        <w:pStyle w:val="Heading2"/>
-        <w:spacing w:after="140" w:before="320"/>
+          <w:sz w:val="20"/>
+          <w:szCs w:val="20"/>
+        </w:rPr>
+        <w:t xml:space="preserve">Regenerated:</w:t>
+      </w:r>
+      <w:r>
+        <w:rPr>
+          <w:rFonts w:ascii="Arial" w:cs="Arial" w:eastAsia="Arial" w:hAnsi="Arial"/>
+          <w:color w:val="2A2620"/>
+          <w:sz w:val="20"/>
+          <w:szCs w:val="20"/>
+        </w:rPr>
+        <w:t xml:space="preserve"> 31 October 2026, evening, re-checked against the current build rather than carried forward. 39 pages built, 38 indexable, 0 checker problems.</w:t>
+      </w:r>
+    </w:p>
+    <w:p>
+      <w:pPr>
+        <w:spacing w:after="140" w:before="0" w:line="276"/>
+      </w:pPr>
+      <w:r>
+        <w:rPr>
+          <w:rFonts w:ascii="Arial" w:cs="Arial" w:eastAsia="Arial" w:hAnsi="Arial"/>
+          <w:color w:val="2A2620"/>
+          <w:sz w:val="20"/>
+          <w:szCs w:val="20"/>
+        </w:rPr>
+        <w:t xml:space="preserve">The site is live, so this is no longer a pre-launch list. It is the list of what is open, with each item cross-referenced to the feedback action plan (</w:t>
+      </w:r>
+      <w:r>
+        <w:rPr>
+          <w:rFonts w:ascii="Consolas" w:cs="Consolas" w:eastAsia="Consolas" w:hAnsi="Consolas"/>
+          <w:color w:val="2A2620"/>
+          <w:sz w:val="20"/>
+          <w:szCs w:val="20"/>
+        </w:rPr>
+        <w:t xml:space="preserve">claude/feedback-action-plan.md</w:t>
+      </w:r>
+      <w:r>
+        <w:rPr>
+          <w:rFonts w:ascii="Arial" w:cs="Arial" w:eastAsia="Arial" w:hAnsi="Arial"/>
+          <w:color w:val="2A2620"/>
+          <w:sz w:val="20"/>
+          <w:szCs w:val="20"/>
+        </w:rPr>
+        <w:t xml:space="preserve">) where that plan absorbed it. The plan's own item numbers (I, W, M) are the ones to work from; this doc records what is true of the build today.</w:t>
+      </w:r>
+    </w:p>
+    <w:p>
+      <w:pPr>
+        <w:pBdr>
+          <w:bottom w:val="single" w:color="BFB5A5" w:sz="6" w:space="1"/>
+        </w:pBdr>
+        <w:spacing w:after="220" w:before="40"/>
+      </w:pPr>
+    </w:p>
+    <w:p>
+      <w:pPr>
+        <w:pStyle w:val="Heading1"/>
+        <w:spacing w:after="140" w:before="360"/>
       </w:pPr>
       <w:r>
         <w:rPr>
@@ -155,65 +155,29 @@
           <w:b/>
           <w:bCs/>
           <w:color w:val="2A2620"/>
-          <w:sz w:val="24"/>
-          <w:szCs w:val="24"/>
-        </w:rPr>
-        <w:t xml:space="preserve">A2.  Cloudflare builds the production build onto the preview host</w:t>
-      </w:r>
-    </w:p>
-    <w:p>
-      <w:pPr>
-        <w:spacing w:after="120" w:before="0" w:line="276"/>
-      </w:pPr>
-      <w:r>
-        <w:rPr>
-          <w:rFonts w:ascii="Arial" w:cs="Arial" w:eastAsia="Arial" w:hAnsi="Arial"/>
-          <w:color w:val="2A2620"/>
-          <w:sz w:val="20"/>
-          <w:szCs w:val="20"/>
-        </w:rPr>
-        <w:t xml:space="preserve">The Workers Builds command is </w:t>
-      </w:r>
-      <w:r>
-        <w:rPr>
-          <w:rFonts w:ascii="Consolas" w:cs="Consolas" w:eastAsia="Consolas" w:hAnsi="Consolas"/>
-          <w:color w:val="2A2620"/>
-          <w:sz w:val="20"/>
-          <w:szCs w:val="20"/>
-        </w:rPr>
-        <w:t xml:space="preserve">npm run build</w:t>
-      </w:r>
-      <w:r>
-        <w:rPr>
-          <w:rFonts w:ascii="Arial" w:cs="Arial" w:eastAsia="Arial" w:hAnsi="Arial"/>
-          <w:color w:val="2A2620"/>
-          <w:sz w:val="20"/>
-          <w:szCs w:val="20"/>
-        </w:rPr>
-        <w:t xml:space="preserve">, which emits index, follow and canonicals to the live domain. It needs to be </w:t>
-      </w:r>
-      <w:r>
-        <w:rPr>
-          <w:rFonts w:ascii="Consolas" w:cs="Consolas" w:eastAsia="Consolas" w:hAnsi="Consolas"/>
-          <w:color w:val="2A2620"/>
-          <w:sz w:val="20"/>
-          <w:szCs w:val="20"/>
-        </w:rPr>
-        <w:t xml:space="preserve">npm run build:preview</w:t>
-      </w:r>
-      <w:r>
-        <w:rPr>
-          <w:rFonts w:ascii="Arial" w:cs="Arial" w:eastAsia="Arial" w:hAnsi="Arial"/>
-          <w:color w:val="2A2620"/>
-          <w:sz w:val="20"/>
-          <w:szCs w:val="20"/>
-        </w:rPr>
-        <w:t xml:space="preserve"> while the site lives on workers.dev, then switched back on launch day. Setting SITE_URL in Cloudflare will not work: scripts/build.mjs line 18 deliberately deletes it on a production build.</w:t>
-      </w:r>
-    </w:p>
-    <w:p>
-      <w:pPr>
-        <w:spacing w:after="240" w:before="120" w:line="276"/>
+          <w:sz w:val="30"/>
+          <w:szCs w:val="30"/>
+        </w:rPr>
+        <w:t xml:space="preserve">A. Blockers</w:t>
+      </w:r>
+    </w:p>
+    <w:p>
+      <w:pPr>
+        <w:spacing w:after="140" w:before="0" w:line="276"/>
+      </w:pPr>
+      <w:r>
+        <w:rPr>
+          <w:rFonts w:ascii="Arial" w:cs="Arial" w:eastAsia="Arial" w:hAnsi="Arial"/>
+          <w:color w:val="2A2620"/>
+          <w:sz w:val="20"/>
+          <w:szCs w:val="20"/>
+        </w:rPr>
+        <w:t xml:space="preserve">Both are closed.</w:t>
+      </w:r>
+    </w:p>
+    <w:p>
+      <w:pPr>
+        <w:spacing w:after="140" w:before="0" w:line="276"/>
       </w:pPr>
       <w:r>
         <w:rPr>
@@ -224,13 +188,39 @@
           <w:sz w:val="20"/>
           <w:szCs w:val="20"/>
         </w:rPr>
-        <w:t xml:space="preserve">These two are the only remaining blockers. A3 through A6 are closed.</w:t>
-      </w:r>
-    </w:p>
-    <w:p>
-      <w:pPr>
-        <w:pStyle w:val="Heading1"/>
-        <w:spacing w:after="140" w:before="320"/>
+        <w:t xml:space="preserve">A1, the domain. Closed.</w:t>
+      </w:r>
+      <w:r>
+        <w:rPr>
+          <w:rFonts w:ascii="Arial" w:cs="Arial" w:eastAsia="Arial" w:hAnsi="Arial"/>
+          <w:color w:val="2A2620"/>
+          <w:sz w:val="20"/>
+          <w:szCs w:val="20"/>
+        </w:rPr>
+        <w:t xml:space="preserve"> </w:t>
+      </w:r>
+      <w:r>
+        <w:rPr>
+          <w:rFonts w:ascii="Consolas" w:cs="Consolas" w:eastAsia="Consolas" w:hAnsi="Consolas"/>
+          <w:color w:val="2A2620"/>
+          <w:sz w:val="20"/>
+          <w:szCs w:val="20"/>
+        </w:rPr>
+        <w:t xml:space="preserve">reemglascolpc.com</w:t>
+      </w:r>
+      <w:r>
+        <w:rPr>
+          <w:rFonts w:ascii="Arial" w:cs="Arial" w:eastAsia="Arial" w:hAnsi="Arial"/>
+          <w:color w:val="2A2620"/>
+          <w:sz w:val="20"/>
+          <w:szCs w:val="20"/>
+        </w:rPr>
+        <w:t xml:space="preserve"> serves. Both external reviews read it live on 30 and 31 October, and the live sitemap today lists the same 38 URLs the build produces.</w:t>
+      </w:r>
+    </w:p>
+    <w:p>
+      <w:pPr>
+        <w:spacing w:after="140" w:before="0" w:line="276"/>
       </w:pPr>
       <w:r>
         <w:rPr>
@@ -238,24 +228,191 @@
           <w:b/>
           <w:bCs/>
           <w:color w:val="2A2620"/>
-          <w:sz w:val="32"/>
-          <w:szCs w:val="32"/>
-        </w:rPr>
-        <w:t xml:space="preserve">B.  Needs an answer from Reem</w:t>
-      </w:r>
-    </w:p>
-    <w:p>
-      <w:pPr>
-        <w:spacing w:after="200" w:before="0" w:line="276"/>
-      </w:pPr>
-      <w:r>
-        <w:rPr>
-          <w:rFonts w:ascii="Arial" w:cs="Arial" w:eastAsia="Arial" w:hAnsi="Arial"/>
-          <w:color w:val="5C5346"/>
-          <w:sz w:val="20"/>
-          <w:szCs w:val="20"/>
-        </w:rPr>
-        <w:t xml:space="preserve">No "Note for the site build" blocks and no "to be confirmed" rows remain on the site. These are tracked here instead.</w:t>
+          <w:sz w:val="20"/>
+          <w:szCs w:val="20"/>
+        </w:rPr>
+        <w:t xml:space="preserve">A2, Cloudflare building the preview variant onto the live host. Closed.</w:t>
+      </w:r>
+      <w:r>
+        <w:rPr>
+          <w:rFonts w:ascii="Arial" w:cs="Arial" w:eastAsia="Arial" w:hAnsi="Arial"/>
+          <w:color w:val="2A2620"/>
+          <w:sz w:val="20"/>
+          <w:szCs w:val="20"/>
+        </w:rPr>
+        <w:t xml:space="preserve"> The live home page carries </w:t>
+      </w:r>
+      <w:r>
+        <w:rPr>
+          <w:rFonts w:ascii="Consolas" w:cs="Consolas" w:eastAsia="Consolas" w:hAnsi="Consolas"/>
+          <w:color w:val="2A2620"/>
+          <w:sz w:val="20"/>
+          <w:szCs w:val="20"/>
+        </w:rPr>
+        <w:t xml:space="preserve">index, follow</w:t>
+      </w:r>
+      <w:r>
+        <w:rPr>
+          <w:rFonts w:ascii="Arial" w:cs="Arial" w:eastAsia="Arial" w:hAnsi="Arial"/>
+          <w:color w:val="2A2620"/>
+          <w:sz w:val="20"/>
+          <w:szCs w:val="20"/>
+        </w:rPr>
+        <w:t xml:space="preserve"> and a canonical to </w:t>
+      </w:r>
+      <w:r>
+        <w:rPr>
+          <w:rFonts w:ascii="Consolas" w:cs="Consolas" w:eastAsia="Consolas" w:hAnsi="Consolas"/>
+          <w:color w:val="2A2620"/>
+          <w:sz w:val="20"/>
+          <w:szCs w:val="20"/>
+        </w:rPr>
+        <w:t xml:space="preserve">https://reemglascolpc.com/</w:t>
+      </w:r>
+      <w:r>
+        <w:rPr>
+          <w:rFonts w:ascii="Arial" w:cs="Arial" w:eastAsia="Arial" w:hAnsi="Arial"/>
+          <w:color w:val="2A2620"/>
+          <w:sz w:val="20"/>
+          <w:szCs w:val="20"/>
+        </w:rPr>
+        <w:t xml:space="preserve">, and the live </w:t>
+      </w:r>
+      <w:r>
+        <w:rPr>
+          <w:rFonts w:ascii="Consolas" w:cs="Consolas" w:eastAsia="Consolas" w:hAnsi="Consolas"/>
+          <w:color w:val="2A2620"/>
+          <w:sz w:val="20"/>
+          <w:szCs w:val="20"/>
+        </w:rPr>
+        <w:t xml:space="preserve">robots.txt</w:t>
+      </w:r>
+      <w:r>
+        <w:rPr>
+          <w:rFonts w:ascii="Arial" w:cs="Arial" w:eastAsia="Arial" w:hAnsi="Arial"/>
+          <w:color w:val="2A2620"/>
+          <w:sz w:val="20"/>
+          <w:szCs w:val="20"/>
+        </w:rPr>
+        <w:t xml:space="preserve"> allows all crawlers; a preview build would show </w:t>
+      </w:r>
+      <w:r>
+        <w:rPr>
+          <w:rFonts w:ascii="Consolas" w:cs="Consolas" w:eastAsia="Consolas" w:hAnsi="Consolas"/>
+          <w:color w:val="2A2620"/>
+          <w:sz w:val="20"/>
+          <w:szCs w:val="20"/>
+        </w:rPr>
+        <w:t xml:space="preserve">noindex</w:t>
+      </w:r>
+      <w:r>
+        <w:rPr>
+          <w:rFonts w:ascii="Arial" w:cs="Arial" w:eastAsia="Arial" w:hAnsi="Arial"/>
+          <w:color w:val="2A2620"/>
+          <w:sz w:val="20"/>
+          <w:szCs w:val="20"/>
+        </w:rPr>
+        <w:t xml:space="preserve"> and a </w:t>
+      </w:r>
+      <w:r>
+        <w:rPr>
+          <w:rFonts w:ascii="Consolas" w:cs="Consolas" w:eastAsia="Consolas" w:hAnsi="Consolas"/>
+          <w:color w:val="2A2620"/>
+          <w:sz w:val="20"/>
+          <w:szCs w:val="20"/>
+        </w:rPr>
+        <w:t xml:space="preserve">workers.dev</w:t>
+      </w:r>
+      <w:r>
+        <w:rPr>
+          <w:rFonts w:ascii="Arial" w:cs="Arial" w:eastAsia="Arial" w:hAnsi="Arial"/>
+          <w:color w:val="2A2620"/>
+          <w:sz w:val="20"/>
+          <w:szCs w:val="20"/>
+        </w:rPr>
+        <w:t xml:space="preserve"> canonical. So the production build command is in use. Nothing in the repo needed changing.</w:t>
+      </w:r>
+    </w:p>
+    <w:p>
+      <w:pPr>
+        <w:spacing w:after="140" w:before="0" w:line="276"/>
+      </w:pPr>
+      <w:r>
+        <w:rPr>
+          <w:rFonts w:ascii="Arial" w:cs="Arial" w:eastAsia="Arial" w:hAnsi="Arial"/>
+          <w:b/>
+          <w:bCs/>
+          <w:color w:val="2A2620"/>
+          <w:sz w:val="20"/>
+          <w:szCs w:val="20"/>
+        </w:rPr>
+        <w:t xml:space="preserve">One thing to know instead.</w:t>
+      </w:r>
+      <w:r>
+        <w:rPr>
+          <w:rFonts w:ascii="Arial" w:cs="Arial" w:eastAsia="Arial" w:hAnsi="Arial"/>
+          <w:color w:val="2A2620"/>
+          <w:sz w:val="20"/>
+          <w:szCs w:val="20"/>
+        </w:rPr>
+        <w:t xml:space="preserve"> The repo is now ahead of the live site. Eighteen source files changed today (the Immediately tier of the feedback plan, I1 to I5 and I7 to I10, plus the hero and About page work), none deployed yet. </w:t>
+      </w:r>
+      <w:r>
+        <w:rPr>
+          <w:rFonts w:ascii="Consolas" w:cs="Consolas" w:eastAsia="Consolas" w:hAnsi="Consolas"/>
+          <w:color w:val="2A2620"/>
+          <w:sz w:val="20"/>
+          <w:szCs w:val="20"/>
+        </w:rPr>
+        <w:t xml:space="preserve">npm run deploy</w:t>
+      </w:r>
+      <w:r>
+        <w:rPr>
+          <w:rFonts w:ascii="Arial" w:cs="Arial" w:eastAsia="Arial" w:hAnsi="Arial"/>
+          <w:color w:val="2A2620"/>
+          <w:sz w:val="20"/>
+          <w:szCs w:val="20"/>
+        </w:rPr>
+        <w:t xml:space="preserve"> ships them. Until then the live site still says "same four methods", still calls a recorded course self-study, and still has "walk and table".</w:t>
+      </w:r>
+    </w:p>
+    <w:p>
+      <w:pPr>
+        <w:pBdr>
+          <w:bottom w:val="single" w:color="BFB5A5" w:sz="6" w:space="1"/>
+        </w:pBdr>
+        <w:spacing w:after="220" w:before="40"/>
+      </w:pPr>
+    </w:p>
+    <w:p>
+      <w:pPr>
+        <w:pStyle w:val="Heading1"/>
+        <w:spacing w:after="140" w:before="360"/>
+      </w:pPr>
+      <w:r>
+        <w:rPr>
+          <w:rFonts w:ascii="Arial" w:cs="Arial" w:eastAsia="Arial" w:hAnsi="Arial"/>
+          <w:b/>
+          <w:bCs/>
+          <w:color w:val="2A2620"/>
+          <w:sz w:val="30"/>
+          <w:szCs w:val="30"/>
+        </w:rPr>
+        <w:t xml:space="preserve">B. Needs an answer from Reem</w:t>
+      </w:r>
+    </w:p>
+    <w:p>
+      <w:pPr>
+        <w:spacing w:after="140" w:before="0" w:line="276"/>
+      </w:pPr>
+      <w:r>
+        <w:rPr>
+          <w:rFonts w:ascii="Arial" w:cs="Arial" w:eastAsia="Arial" w:hAnsi="Arial"/>
+          <w:color w:val="2A2620"/>
+          <w:sz w:val="20"/>
+          <w:szCs w:val="20"/>
+        </w:rPr>
+        <w:t xml:space="preserve">No "Note for the site build" blocks and no "to be confirmed" strings remain anywhere on the site (verified: zero). These are tracked here instead.</w:t>
       </w:r>
     </w:p>
     <w:tbl>
@@ -271,9 +428,10 @@
         </w:tblBorders>
       </w:tblPr>
       <w:tblGrid>
-        <w:gridCol w:w="720"/>
-        <w:gridCol w:w="2880"/>
-        <w:gridCol w:w="5760"/>
+        <w:gridCol w:w="655"/>
+        <w:gridCol w:w="1872"/>
+        <w:gridCol w:w="5148"/>
+        <w:gridCol w:w="1685"/>
       </w:tblGrid>
       <w:tr>
         <w:trPr>
@@ -281,7 +439,7 @@
         </w:trPr>
         <w:tc>
           <w:tcPr>
-            <w:tcW w:type="dxa" w:w="720"/>
+            <w:tcW w:type="dxa" w:w="655"/>
             <w:shd w:fill="1F2D38" w:color="auto" w:val="clear"/>
             <w:tcMar>
               <w:top w:type="dxa" w:w="90"/>
@@ -309,7 +467,7 @@
         </w:tc>
         <w:tc>
           <w:tcPr>
-            <w:tcW w:type="dxa" w:w="2880"/>
+            <w:tcW w:type="dxa" w:w="1872"/>
             <w:shd w:fill="1F2D38" w:color="auto" w:val="clear"/>
             <w:tcMar>
               <w:top w:type="dxa" w:w="90"/>
@@ -337,7 +495,7 @@
         </w:tc>
         <w:tc>
           <w:tcPr>
-            <w:tcW w:type="dxa" w:w="5760"/>
+            <w:tcW w:type="dxa" w:w="5148"/>
             <w:shd w:fill="1F2D38" w:color="auto" w:val="clear"/>
             <w:tcMar>
               <w:top w:type="dxa" w:w="90"/>
@@ -363,25 +521,55 @@
             </w:r>
           </w:p>
         </w:tc>
+        <w:tc>
+          <w:tcPr>
+            <w:tcW w:type="dxa" w:w="1685"/>
+            <w:shd w:fill="1F2D38" w:color="auto" w:val="clear"/>
+            <w:tcMar>
+              <w:top w:type="dxa" w:w="90"/>
+              <w:left w:type="dxa" w:w="120"/>
+              <w:bottom w:type="dxa" w:w="90"/>
+              <w:right w:type="dxa" w:w="120"/>
+            </w:tcMar>
+          </w:tcPr>
+          <w:p>
+            <w:pPr>
+              <w:spacing w:after="0" w:line="264"/>
+            </w:pPr>
+            <w:r>
+              <w:rPr>
+                <w:rFonts w:ascii="Arial" w:cs="Arial" w:eastAsia="Arial" w:hAnsi="Arial"/>
+                <w:b/>
+                <w:bCs/>
+                <w:color w:val="FFFFFF"/>
+                <w:sz w:val="18"/>
+                <w:szCs w:val="18"/>
+              </w:rPr>
+              <w:t xml:space="preserve">Plan</w:t>
+            </w:r>
+          </w:p>
+        </w:tc>
       </w:tr>
       <w:tr>
         <w:tc>
           <w:tcPr>
-            <w:tcW w:type="dxa" w:w="720"/>
-            <w:tcMar>
-              <w:top w:type="dxa" w:w="90"/>
-              <w:left w:type="dxa" w:w="120"/>
-              <w:bottom w:type="dxa" w:w="90"/>
-              <w:right w:type="dxa" w:w="120"/>
-            </w:tcMar>
-          </w:tcPr>
-          <w:p>
-            <w:pPr>
-              <w:spacing w:after="0" w:line="264"/>
-            </w:pPr>
-            <w:r>
-              <w:rPr>
-                <w:rFonts w:ascii="Arial" w:cs="Arial" w:eastAsia="Arial" w:hAnsi="Arial"/>
+            <w:tcW w:type="dxa" w:w="655"/>
+            <w:tcMar>
+              <w:top w:type="dxa" w:w="90"/>
+              <w:left w:type="dxa" w:w="120"/>
+              <w:bottom w:type="dxa" w:w="90"/>
+              <w:right w:type="dxa" w:w="120"/>
+            </w:tcMar>
+          </w:tcPr>
+          <w:p>
+            <w:pPr>
+              <w:spacing w:after="0" w:line="264"/>
+            </w:pPr>
+            <w:r>
+              <w:rPr>
+                <w:rFonts w:ascii="Arial" w:cs="Arial" w:eastAsia="Arial" w:hAnsi="Arial"/>
+                <w:b/>
+                <w:bCs/>
                 <w:color w:val="2A2620"/>
                 <w:sz w:val="18"/>
                 <w:szCs w:val="18"/>
@@ -392,21 +580,21 @@
         </w:tc>
         <w:tc>
           <w:tcPr>
-            <w:tcW w:type="dxa" w:w="2880"/>
-            <w:tcMar>
-              <w:top w:type="dxa" w:w="90"/>
-              <w:left w:type="dxa" w:w="120"/>
-              <w:bottom w:type="dxa" w:w="90"/>
-              <w:right w:type="dxa" w:w="120"/>
-            </w:tcMar>
-          </w:tcPr>
-          <w:p>
-            <w:pPr>
-              <w:spacing w:after="0" w:line="264"/>
-            </w:pPr>
-            <w:r>
-              <w:rPr>
-                <w:rFonts w:ascii="Arial" w:cs="Arial" w:eastAsia="Arial" w:hAnsi="Arial"/>
+            <w:tcW w:type="dxa" w:w="1872"/>
+            <w:tcMar>
+              <w:top w:type="dxa" w:w="90"/>
+              <w:left w:type="dxa" w:w="120"/>
+              <w:bottom w:type="dxa" w:w="90"/>
+              <w:right w:type="dxa" w:w="120"/>
+            </w:tcMar>
+          </w:tcPr>
+          <w:p>
+            <w:pPr>
+              <w:spacing w:after="0" w:line="264"/>
+            </w:pPr>
+            <w:r>
+              <w:rPr>
+                <w:rFonts w:ascii="Consolas" w:cs="Consolas" w:eastAsia="Consolas" w:hAnsi="Consolas"/>
                 <w:color w:val="2A2620"/>
                 <w:sz w:val="18"/>
                 <w:szCs w:val="18"/>
@@ -417,26 +605,62 @@
         </w:tc>
         <w:tc>
           <w:tcPr>
-            <w:tcW w:type="dxa" w:w="5760"/>
-            <w:tcMar>
-              <w:top w:type="dxa" w:w="90"/>
-              <w:left w:type="dxa" w:w="120"/>
-              <w:bottom w:type="dxa" w:w="90"/>
-              <w:right w:type="dxa" w:w="120"/>
-            </w:tcMar>
-          </w:tcPr>
-          <w:p>
-            <w:pPr>
-              <w:spacing w:after="0" w:line="264"/>
-            </w:pPr>
-            <w:r>
-              <w:rPr>
-                <w:rFonts w:ascii="Arial" w:cs="Arial" w:eastAsia="Arial" w:hAnsi="Arial"/>
-                <w:color w:val="2A2620"/>
-                <w:sz w:val="18"/>
-                <w:szCs w:val="18"/>
-              </w:rPr>
-              <w:t xml:space="preserve">Confirm the supervision structure is 3+1. The build now says "three individual hours and one group hour" in 12 places and "four individual" in none. The old site said both. If it is really four individual plus one group, the fee framing and the compliance-margin argument both need rewriting. One sentence from Reem closes this.</w:t>
+            <w:tcW w:type="dxa" w:w="5148"/>
+            <w:tcMar>
+              <w:top w:type="dxa" w:w="90"/>
+              <w:left w:type="dxa" w:w="120"/>
+              <w:bottom w:type="dxa" w:w="90"/>
+              <w:right w:type="dxa" w:w="120"/>
+            </w:tcMar>
+          </w:tcPr>
+          <w:p>
+            <w:pPr>
+              <w:spacing w:after="0" w:line="264"/>
+            </w:pPr>
+            <w:r>
+              <w:rPr>
+                <w:rFonts w:ascii="Arial" w:cs="Arial" w:eastAsia="Arial" w:hAnsi="Arial"/>
+                <w:b/>
+                <w:bCs/>
+                <w:color w:val="2A2620"/>
+                <w:sz w:val="18"/>
+                <w:szCs w:val="18"/>
+              </w:rPr>
+              <w:t xml:space="preserve">Confirm the supervision structure is 3+1, and whether it is scheduled weekly.</w:t>
+            </w:r>
+            <w:r>
+              <w:rPr>
+                <w:rFonts w:ascii="Arial" w:cs="Arial" w:eastAsia="Arial" w:hAnsi="Arial"/>
+                <w:color w:val="2A2620"/>
+                <w:sz w:val="18"/>
+                <w:szCs w:val="18"/>
+              </w:rPr>
+              <w:t xml:space="preserve"> The build says "three individual hours and one group hour" in 13 places across 5 files and "four individual" in none. The old site said both. If it is really four plus one, the fee framing and the compliance-margin argument need rewriting. "Weekly" unlocks the phrase "supervised every week" in the associates copy, which currently says "four hours a month" to stay safe.</w:t>
+            </w:r>
+          </w:p>
+        </w:tc>
+        <w:tc>
+          <w:tcPr>
+            <w:tcW w:type="dxa" w:w="1685"/>
+            <w:tcMar>
+              <w:top w:type="dxa" w:w="90"/>
+              <w:left w:type="dxa" w:w="120"/>
+              <w:bottom w:type="dxa" w:w="90"/>
+              <w:right w:type="dxa" w:w="120"/>
+            </w:tcMar>
+          </w:tcPr>
+          <w:p>
+            <w:pPr>
+              <w:spacing w:after="0" w:line="264"/>
+            </w:pPr>
+            <w:r>
+              <w:rPr>
+                <w:rFonts w:ascii="Arial" w:cs="Arial" w:eastAsia="Arial" w:hAnsi="Arial"/>
+                <w:color w:val="2A2620"/>
+                <w:sz w:val="18"/>
+                <w:szCs w:val="18"/>
+              </w:rPr>
+              <w:t xml:space="preserve">W11, question 1</w:t>
             </w:r>
           </w:p>
         </w:tc>
@@ -444,7 +668,7 @@
       <w:tr>
         <w:tc>
           <w:tcPr>
-            <w:tcW w:type="dxa" w:w="720"/>
+            <w:tcW w:type="dxa" w:w="655"/>
             <w:shd w:fill="E5DDD0" w:color="auto" w:val="clear"/>
             <w:tcMar>
               <w:top w:type="dxa" w:w="90"/>
@@ -460,6 +684,8 @@
             <w:r>
               <w:rPr>
                 <w:rFonts w:ascii="Arial" w:cs="Arial" w:eastAsia="Arial" w:hAnsi="Arial"/>
+                <w:b/>
+                <w:bCs/>
                 <w:color w:val="2A2620"/>
                 <w:sz w:val="18"/>
                 <w:szCs w:val="18"/>
@@ -470,7 +696,7 @@
         </w:tc>
         <w:tc>
           <w:tcPr>
-            <w:tcW w:type="dxa" w:w="2880"/>
+            <w:tcW w:type="dxa" w:w="1872"/>
             <w:shd w:fill="E5DDD0" w:color="auto" w:val="clear"/>
             <w:tcMar>
               <w:top w:type="dxa" w:w="90"/>
@@ -485,7 +711,7 @@
             </w:pPr>
             <w:r>
               <w:rPr>
-                <w:rFonts w:ascii="Arial" w:cs="Arial" w:eastAsia="Arial" w:hAnsi="Arial"/>
+                <w:rFonts w:ascii="Consolas" w:cs="Consolas" w:eastAsia="Consolas" w:hAnsi="Consolas"/>
                 <w:color w:val="2A2620"/>
                 <w:sz w:val="18"/>
                 <w:szCs w:val="18"/>
@@ -496,7 +722,7 @@
         </w:tc>
         <w:tc>
           <w:tcPr>
-            <w:tcW w:type="dxa" w:w="5760"/>
+            <w:tcW w:type="dxa" w:w="5148"/>
             <w:shd w:fill="E5DDD0" w:color="auto" w:val="clear"/>
             <w:tcMar>
               <w:top w:type="dxa" w:w="90"/>
@@ -516,7 +742,33 @@
                 <w:sz w:val="18"/>
                 <w:szCs w:val="18"/>
               </w:rPr>
-              <w:t xml:space="preserve">Approve the roster. Rebuilt from the old site, where several associate pages carried one person’s name on another’s URL and three were placeholders. Each associate should sign off on their own paragraph, fee and contact route.</w:t>
+              <w:t xml:space="preserve">Approve the roster, and settle pronouns. Each associate should sign off on their own paragraph, fee and contact route. The profile template says "runs their own scheduling" for everyone because only one associate has a pronouns field on file; either each supplies one or the template uses names only.</w:t>
+            </w:r>
+          </w:p>
+        </w:tc>
+        <w:tc>
+          <w:tcPr>
+            <w:tcW w:type="dxa" w:w="1685"/>
+            <w:shd w:fill="E5DDD0" w:color="auto" w:val="clear"/>
+            <w:tcMar>
+              <w:top w:type="dxa" w:w="90"/>
+              <w:left w:type="dxa" w:w="120"/>
+              <w:bottom w:type="dxa" w:w="90"/>
+              <w:right w:type="dxa" w:w="120"/>
+            </w:tcMar>
+          </w:tcPr>
+          <w:p>
+            <w:pPr>
+              <w:spacing w:after="0" w:line="264"/>
+            </w:pPr>
+            <w:r>
+              <w:rPr>
+                <w:rFonts w:ascii="Arial" w:cs="Arial" w:eastAsia="Arial" w:hAnsi="Arial"/>
+                <w:color w:val="2A2620"/>
+                <w:sz w:val="18"/>
+                <w:szCs w:val="18"/>
+              </w:rPr>
+              <w:t xml:space="preserve">W11, question 7</w:t>
             </w:r>
           </w:p>
         </w:tc>
@@ -524,21 +776,23 @@
       <w:tr>
         <w:tc>
           <w:tcPr>
-            <w:tcW w:type="dxa" w:w="720"/>
-            <w:tcMar>
-              <w:top w:type="dxa" w:w="90"/>
-              <w:left w:type="dxa" w:w="120"/>
-              <w:bottom w:type="dxa" w:w="90"/>
-              <w:right w:type="dxa" w:w="120"/>
-            </w:tcMar>
-          </w:tcPr>
-          <w:p>
-            <w:pPr>
-              <w:spacing w:after="0" w:line="264"/>
-            </w:pPr>
-            <w:r>
-              <w:rPr>
-                <w:rFonts w:ascii="Arial" w:cs="Arial" w:eastAsia="Arial" w:hAnsi="Arial"/>
+            <w:tcW w:type="dxa" w:w="655"/>
+            <w:tcMar>
+              <w:top w:type="dxa" w:w="90"/>
+              <w:left w:type="dxa" w:w="120"/>
+              <w:bottom w:type="dxa" w:w="90"/>
+              <w:right w:type="dxa" w:w="120"/>
+            </w:tcMar>
+          </w:tcPr>
+          <w:p>
+            <w:pPr>
+              <w:spacing w:after="0" w:line="264"/>
+            </w:pPr>
+            <w:r>
+              <w:rPr>
+                <w:rFonts w:ascii="Arial" w:cs="Arial" w:eastAsia="Arial" w:hAnsi="Arial"/>
+                <w:b/>
+                <w:bCs/>
                 <w:color w:val="2A2620"/>
                 <w:sz w:val="18"/>
                 <w:szCs w:val="18"/>
@@ -549,21 +803,21 @@
         </w:tc>
         <w:tc>
           <w:tcPr>
-            <w:tcW w:type="dxa" w:w="2880"/>
-            <w:tcMar>
-              <w:top w:type="dxa" w:w="90"/>
-              <w:left w:type="dxa" w:w="120"/>
-              <w:bottom w:type="dxa" w:w="90"/>
-              <w:right w:type="dxa" w:w="120"/>
-            </w:tcMar>
-          </w:tcPr>
-          <w:p>
-            <w:pPr>
-              <w:spacing w:after="0" w:line="264"/>
-            </w:pPr>
-            <w:r>
-              <w:rPr>
-                <w:rFonts w:ascii="Arial" w:cs="Arial" w:eastAsia="Arial" w:hAnsi="Arial"/>
+            <w:tcW w:type="dxa" w:w="1872"/>
+            <w:tcMar>
+              <w:top w:type="dxa" w:w="90"/>
+              <w:left w:type="dxa" w:w="120"/>
+              <w:bottom w:type="dxa" w:w="90"/>
+              <w:right w:type="dxa" w:w="120"/>
+            </w:tcMar>
+          </w:tcPr>
+          <w:p>
+            <w:pPr>
+              <w:spacing w:after="0" w:line="264"/>
+            </w:pPr>
+            <w:r>
+              <w:rPr>
+                <w:rFonts w:ascii="Consolas" w:cs="Consolas" w:eastAsia="Consolas" w:hAnsi="Consolas"/>
                 <w:color w:val="2A2620"/>
                 <w:sz w:val="18"/>
                 <w:szCs w:val="18"/>
@@ -574,26 +828,62 @@
         </w:tc>
         <w:tc>
           <w:tcPr>
-            <w:tcW w:type="dxa" w:w="5760"/>
-            <w:tcMar>
-              <w:top w:type="dxa" w:w="90"/>
-              <w:left w:type="dxa" w:w="120"/>
-              <w:bottom w:type="dxa" w:w="90"/>
-              <w:right w:type="dxa" w:w="120"/>
-            </w:tcMar>
-          </w:tcPr>
-          <w:p>
-            <w:pPr>
-              <w:spacing w:after="0" w:line="264"/>
-            </w:pPr>
-            <w:r>
-              <w:rPr>
-                <w:rFonts w:ascii="Arial" w:cs="Arial" w:eastAsia="Arial" w:hAnsi="Arial"/>
-                <w:color w:val="2A2620"/>
-                <w:sz w:val="18"/>
-                <w:szCs w:val="18"/>
-              </w:rPr>
-              <w:t xml:space="preserve">Next dates, the fee, and the §681.140(f) approved-provider status. The page states no price and no date at all. Until the provider status is stated, an LPC cannot tell whether these hours count toward their required half, which is the first thing they check. Needs a registration route rather than an email button.</w:t>
+            <w:tcW w:type="dxa" w:w="5148"/>
+            <w:tcMar>
+              <w:top w:type="dxa" w:w="90"/>
+              <w:left w:type="dxa" w:w="120"/>
+              <w:bottom w:type="dxa" w:w="90"/>
+              <w:right w:type="dxa" w:w="120"/>
+            </w:tcMar>
+          </w:tcPr>
+          <w:p>
+            <w:pPr>
+              <w:spacing w:after="0" w:line="264"/>
+            </w:pPr>
+            <w:r>
+              <w:rPr>
+                <w:rFonts w:ascii="Arial" w:cs="Arial" w:eastAsia="Arial" w:hAnsi="Arial"/>
+                <w:b/>
+                <w:bCs/>
+                <w:color w:val="2A2620"/>
+                <w:sz w:val="18"/>
+                <w:szCs w:val="18"/>
+              </w:rPr>
+              <w:t xml:space="preserve">Next dates, the fee, and a registration route.</w:t>
+            </w:r>
+            <w:r>
+              <w:rPr>
+                <w:rFonts w:ascii="Arial" w:cs="Arial" w:eastAsia="Arial" w:hAnsi="Arial"/>
+                <w:color w:val="2A2620"/>
+                <w:sz w:val="18"/>
+                <w:szCs w:val="18"/>
+              </w:rPr>
+              <w:t xml:space="preserve"> The page still states no price and no date; its only pointer is "Dates and fees are set per session. Email to ask about the next one." The §681.140(f)(6) approved-provider status is now stated correctly on the page, so that part is done.</w:t>
+            </w:r>
+          </w:p>
+        </w:tc>
+        <w:tc>
+          <w:tcPr>
+            <w:tcW w:type="dxa" w:w="1685"/>
+            <w:tcMar>
+              <w:top w:type="dxa" w:w="90"/>
+              <w:left w:type="dxa" w:w="120"/>
+              <w:bottom w:type="dxa" w:w="90"/>
+              <w:right w:type="dxa" w:w="120"/>
+            </w:tcMar>
+          </w:tcPr>
+          <w:p>
+            <w:pPr>
+              <w:spacing w:after="0" w:line="264"/>
+            </w:pPr>
+            <w:r>
+              <w:rPr>
+                <w:rFonts w:ascii="Arial" w:cs="Arial" w:eastAsia="Arial" w:hAnsi="Arial"/>
+                <w:color w:val="2A2620"/>
+                <w:sz w:val="18"/>
+                <w:szCs w:val="18"/>
+              </w:rPr>
+              <w:t xml:space="preserve">M3</w:t>
             </w:r>
           </w:p>
         </w:tc>
@@ -601,7 +891,7 @@
       <w:tr>
         <w:tc>
           <w:tcPr>
-            <w:tcW w:type="dxa" w:w="720"/>
+            <w:tcW w:type="dxa" w:w="655"/>
             <w:shd w:fill="E5DDD0" w:color="auto" w:val="clear"/>
             <w:tcMar>
               <w:top w:type="dxa" w:w="90"/>
@@ -617,6 +907,8 @@
             <w:r>
               <w:rPr>
                 <w:rFonts w:ascii="Arial" w:cs="Arial" w:eastAsia="Arial" w:hAnsi="Arial"/>
+                <w:b/>
+                <w:bCs/>
                 <w:color w:val="2A2620"/>
                 <w:sz w:val="18"/>
                 <w:szCs w:val="18"/>
@@ -627,7 +919,7 @@
         </w:tc>
         <w:tc>
           <w:tcPr>
-            <w:tcW w:type="dxa" w:w="2880"/>
+            <w:tcW w:type="dxa" w:w="1872"/>
             <w:shd w:fill="E5DDD0" w:color="auto" w:val="clear"/>
             <w:tcMar>
               <w:top w:type="dxa" w:w="90"/>
@@ -642,7 +934,7 @@
             </w:pPr>
             <w:r>
               <w:rPr>
-                <w:rFonts w:ascii="Arial" w:cs="Arial" w:eastAsia="Arial" w:hAnsi="Arial"/>
+                <w:rFonts w:ascii="Consolas" w:cs="Consolas" w:eastAsia="Consolas" w:hAnsi="Consolas"/>
                 <w:color w:val="2A2620"/>
                 <w:sz w:val="18"/>
                 <w:szCs w:val="18"/>
@@ -653,7 +945,7 @@
         </w:tc>
         <w:tc>
           <w:tcPr>
-            <w:tcW w:type="dxa" w:w="5760"/>
+            <w:tcW w:type="dxa" w:w="5148"/>
             <w:shd w:fill="E5DDD0" w:color="auto" w:val="clear"/>
             <w:tcMar>
               <w:top w:type="dxa" w:w="90"/>
@@ -669,11 +961,48 @@
             <w:r>
               <w:rPr>
                 <w:rFonts w:ascii="Arial" w:cs="Arial" w:eastAsia="Arial" w:hAnsi="Arial"/>
-                <w:color w:val="2A2620"/>
-                <w:sz w:val="18"/>
-                <w:szCs w:val="18"/>
-              </w:rPr>
-              <w:t xml:space="preserve">Next retreat date, the equine training format and fee, and a registration route. "Per offering" appears four times and "ask about the next one" twice; no retreat fee anywhere.</w:t>
+                <w:b/>
+                <w:bCs/>
+                <w:color w:val="2A2620"/>
+                <w:sz w:val="18"/>
+                <w:szCs w:val="18"/>
+              </w:rPr>
+              <w:t xml:space="preserve">Next retreat date, the equine training format and fee, and a registration route.</w:t>
+            </w:r>
+            <w:r>
+              <w:rPr>
+                <w:rFonts w:ascii="Arial" w:cs="Arial" w:eastAsia="Arial" w:hAnsi="Arial"/>
+                <w:color w:val="2A2620"/>
+                <w:sz w:val="18"/>
+                <w:szCs w:val="18"/>
+              </w:rPr>
+              <w:t xml:space="preserve"> "Per offering" appears nine times across the site and "ask about the next one" three times; no retreat fee anywhere.</w:t>
+            </w:r>
+          </w:p>
+        </w:tc>
+        <w:tc>
+          <w:tcPr>
+            <w:tcW w:type="dxa" w:w="1685"/>
+            <w:shd w:fill="E5DDD0" w:color="auto" w:val="clear"/>
+            <w:tcMar>
+              <w:top w:type="dxa" w:w="90"/>
+              <w:left w:type="dxa" w:w="120"/>
+              <w:bottom w:type="dxa" w:w="90"/>
+              <w:right w:type="dxa" w:w="120"/>
+            </w:tcMar>
+          </w:tcPr>
+          <w:p>
+            <w:pPr>
+              <w:spacing w:after="0" w:line="264"/>
+            </w:pPr>
+            <w:r>
+              <w:rPr>
+                <w:rFonts w:ascii="Arial" w:cs="Arial" w:eastAsia="Arial" w:hAnsi="Arial"/>
+                <w:color w:val="2A2620"/>
+                <w:sz w:val="18"/>
+                <w:szCs w:val="18"/>
+              </w:rPr>
+              <w:t xml:space="preserve">M3</w:t>
             </w:r>
           </w:p>
         </w:tc>
@@ -681,21 +1010,23 @@
       <w:tr>
         <w:tc>
           <w:tcPr>
-            <w:tcW w:type="dxa" w:w="720"/>
-            <w:tcMar>
-              <w:top w:type="dxa" w:w="90"/>
-              <w:left w:type="dxa" w:w="120"/>
-              <w:bottom w:type="dxa" w:w="90"/>
-              <w:right w:type="dxa" w:w="120"/>
-            </w:tcMar>
-          </w:tcPr>
-          <w:p>
-            <w:pPr>
-              <w:spacing w:after="0" w:line="264"/>
-            </w:pPr>
-            <w:r>
-              <w:rPr>
-                <w:rFonts w:ascii="Arial" w:cs="Arial" w:eastAsia="Arial" w:hAnsi="Arial"/>
+            <w:tcW w:type="dxa" w:w="655"/>
+            <w:tcMar>
+              <w:top w:type="dxa" w:w="90"/>
+              <w:left w:type="dxa" w:w="120"/>
+              <w:bottom w:type="dxa" w:w="90"/>
+              <w:right w:type="dxa" w:w="120"/>
+            </w:tcMar>
+          </w:tcPr>
+          <w:p>
+            <w:pPr>
+              <w:spacing w:after="0" w:line="264"/>
+            </w:pPr>
+            <w:r>
+              <w:rPr>
+                <w:rFonts w:ascii="Arial" w:cs="Arial" w:eastAsia="Arial" w:hAnsi="Arial"/>
+                <w:b/>
+                <w:bCs/>
                 <w:color w:val="2A2620"/>
                 <w:sz w:val="18"/>
                 <w:szCs w:val="18"/>
@@ -706,21 +1037,21 @@
         </w:tc>
         <w:tc>
           <w:tcPr>
-            <w:tcW w:type="dxa" w:w="2880"/>
-            <w:tcMar>
-              <w:top w:type="dxa" w:w="90"/>
-              <w:left w:type="dxa" w:w="120"/>
-              <w:bottom w:type="dxa" w:w="90"/>
-              <w:right w:type="dxa" w:w="120"/>
-            </w:tcMar>
-          </w:tcPr>
-          <w:p>
-            <w:pPr>
-              <w:spacing w:after="0" w:line="264"/>
-            </w:pPr>
-            <w:r>
-              <w:rPr>
-                <w:rFonts w:ascii="Arial" w:cs="Arial" w:eastAsia="Arial" w:hAnsi="Arial"/>
+            <w:tcW w:type="dxa" w:w="1872"/>
+            <w:tcMar>
+              <w:top w:type="dxa" w:w="90"/>
+              <w:left w:type="dxa" w:w="120"/>
+              <w:bottom w:type="dxa" w:w="90"/>
+              <w:right w:type="dxa" w:w="120"/>
+            </w:tcMar>
+          </w:tcPr>
+          <w:p>
+            <w:pPr>
+              <w:spacing w:after="0" w:line="264"/>
+            </w:pPr>
+            <w:r>
+              <w:rPr>
+                <w:rFonts w:ascii="Consolas" w:cs="Consolas" w:eastAsia="Consolas" w:hAnsi="Consolas"/>
                 <w:color w:val="2A2620"/>
                 <w:sz w:val="18"/>
                 <w:szCs w:val="18"/>
@@ -731,26 +1062,51 @@
         </w:tc>
         <w:tc>
           <w:tcPr>
-            <w:tcW w:type="dxa" w:w="5760"/>
-            <w:tcMar>
-              <w:top w:type="dxa" w:w="90"/>
-              <w:left w:type="dxa" w:w="120"/>
-              <w:bottom w:type="dxa" w:w="90"/>
-              <w:right w:type="dxa" w:w="120"/>
-            </w:tcMar>
-          </w:tcPr>
-          <w:p>
-            <w:pPr>
-              <w:spacing w:after="0" w:line="264"/>
-            </w:pPr>
-            <w:r>
-              <w:rPr>
-                <w:rFonts w:ascii="Arial" w:cs="Arial" w:eastAsia="Arial" w:hAnsi="Arial"/>
-                <w:color w:val="2A2620"/>
-                <w:sz w:val="18"/>
-                <w:szCs w:val="18"/>
-              </w:rPr>
-              <w:t xml:space="preserve">More posts. Four live. Eleven of the old site’s fourteen were 40 to 130 words or "coming soon" notices from 2022 to 2023 and were deliberately not migrated.</w:t>
+            <w:tcW w:type="dxa" w:w="5148"/>
+            <w:tcMar>
+              <w:top w:type="dxa" w:w="90"/>
+              <w:left w:type="dxa" w:w="120"/>
+              <w:bottom w:type="dxa" w:w="90"/>
+              <w:right w:type="dxa" w:w="120"/>
+            </w:tcMar>
+          </w:tcPr>
+          <w:p>
+            <w:pPr>
+              <w:spacing w:after="0" w:line="264"/>
+            </w:pPr>
+            <w:r>
+              <w:rPr>
+                <w:rFonts w:ascii="Arial" w:cs="Arial" w:eastAsia="Arial" w:hAnsi="Arial"/>
+                <w:color w:val="2A2620"/>
+                <w:sz w:val="18"/>
+                <w:szCs w:val="18"/>
+              </w:rPr>
+              <w:t xml:space="preserve">More posts. Four live. The plan proposes three categories and one post a month in Reem's voice, with first candidates listed.</w:t>
+            </w:r>
+          </w:p>
+        </w:tc>
+        <w:tc>
+          <w:tcPr>
+            <w:tcW w:type="dxa" w:w="1685"/>
+            <w:tcMar>
+              <w:top w:type="dxa" w:w="90"/>
+              <w:left w:type="dxa" w:w="120"/>
+              <w:bottom w:type="dxa" w:w="90"/>
+              <w:right w:type="dxa" w:w="120"/>
+            </w:tcMar>
+          </w:tcPr>
+          <w:p>
+            <w:pPr>
+              <w:spacing w:after="0" w:line="264"/>
+            </w:pPr>
+            <w:r>
+              <w:rPr>
+                <w:rFonts w:ascii="Arial" w:cs="Arial" w:eastAsia="Arial" w:hAnsi="Arial"/>
+                <w:color w:val="2A2620"/>
+                <w:sz w:val="18"/>
+                <w:szCs w:val="18"/>
+              </w:rPr>
+              <w:t xml:space="preserve">M9</w:t>
             </w:r>
           </w:p>
         </w:tc>
@@ -758,7 +1114,7 @@
       <w:tr>
         <w:tc>
           <w:tcPr>
-            <w:tcW w:type="dxa" w:w="720"/>
+            <w:tcW w:type="dxa" w:w="655"/>
             <w:shd w:fill="E5DDD0" w:color="auto" w:val="clear"/>
             <w:tcMar>
               <w:top w:type="dxa" w:w="90"/>
@@ -774,6 +1130,8 @@
             <w:r>
               <w:rPr>
                 <w:rFonts w:ascii="Arial" w:cs="Arial" w:eastAsia="Arial" w:hAnsi="Arial"/>
+                <w:b/>
+                <w:bCs/>
                 <w:color w:val="2A2620"/>
                 <w:sz w:val="18"/>
                 <w:szCs w:val="18"/>
@@ -784,7 +1142,7 @@
         </w:tc>
         <w:tc>
           <w:tcPr>
-            <w:tcW w:type="dxa" w:w="2880"/>
+            <w:tcW w:type="dxa" w:w="1872"/>
             <w:shd w:fill="E5DDD0" w:color="auto" w:val="clear"/>
             <w:tcMar>
               <w:top w:type="dxa" w:w="90"/>
@@ -799,7 +1157,7 @@
             </w:pPr>
             <w:r>
               <w:rPr>
-                <w:rFonts w:ascii="Arial" w:cs="Arial" w:eastAsia="Arial" w:hAnsi="Arial"/>
+                <w:rFonts w:ascii="Consolas" w:cs="Consolas" w:eastAsia="Consolas" w:hAnsi="Consolas"/>
                 <w:color w:val="2A2620"/>
                 <w:sz w:val="18"/>
                 <w:szCs w:val="18"/>
@@ -810,7 +1168,7 @@
         </w:tc>
         <w:tc>
           <w:tcPr>
-            <w:tcW w:type="dxa" w:w="5760"/>
+            <w:tcW w:type="dxa" w:w="5148"/>
             <w:shd w:fill="E5DDD0" w:color="auto" w:val="clear"/>
             <w:tcMar>
               <w:top w:type="dxa" w:w="90"/>
@@ -826,11 +1184,48 @@
             <w:r>
               <w:rPr>
                 <w:rFonts w:ascii="Arial" w:cs="Arial" w:eastAsia="Arial" w:hAnsi="Arial"/>
-                <w:color w:val="2A2620"/>
-                <w:sz w:val="18"/>
-                <w:szCs w:val="18"/>
-              </w:rPr>
-              <w:t xml:space="preserve">Emmy Laursen still has no published fee. Every other associate has one: Nica $100, Sylvia $125, Natasha $130, Sheila $145, Heather $150. Hers reads "Ask in the consult" in both the fee and sliding-scale columns.</w:t>
+                <w:b/>
+                <w:bCs/>
+                <w:color w:val="2A2620"/>
+                <w:sz w:val="18"/>
+                <w:szCs w:val="18"/>
+              </w:rPr>
+              <w:t xml:space="preserve">Emmy Laursen still has no published fee.</w:t>
+            </w:r>
+            <w:r>
+              <w:rPr>
+                <w:rFonts w:ascii="Arial" w:cs="Arial" w:eastAsia="Arial" w:hAnsi="Arial"/>
+                <w:color w:val="2A2620"/>
+                <w:sz w:val="18"/>
+                <w:szCs w:val="18"/>
+              </w:rPr>
+              <w:t xml:space="preserve"> Every other associate has one (Nica $100, Sylvia $125, Natasha $130, Sheila $145, Heather $150). Hers reads "Ask in the consult" in the fee, sliding-scale and fee-table fields.</w:t>
+            </w:r>
+          </w:p>
+        </w:tc>
+        <w:tc>
+          <w:tcPr>
+            <w:tcW w:type="dxa" w:w="1685"/>
+            <w:shd w:fill="E5DDD0" w:color="auto" w:val="clear"/>
+            <w:tcMar>
+              <w:top w:type="dxa" w:w="90"/>
+              <w:left w:type="dxa" w:w="120"/>
+              <w:bottom w:type="dxa" w:w="90"/>
+              <w:right w:type="dxa" w:w="120"/>
+            </w:tcMar>
+          </w:tcPr>
+          <w:p>
+            <w:pPr>
+              <w:spacing w:after="0" w:line="264"/>
+            </w:pPr>
+            <w:r>
+              <w:rPr>
+                <w:rFonts w:ascii="Arial" w:cs="Arial" w:eastAsia="Arial" w:hAnsi="Arial"/>
+                <w:color w:val="2A2620"/>
+                <w:sz w:val="18"/>
+                <w:szCs w:val="18"/>
+              </w:rPr>
+              <w:t xml:space="preserve">W11, question 8</w:t>
             </w:r>
           </w:p>
         </w:tc>
@@ -838,21 +1233,23 @@
       <w:tr>
         <w:tc>
           <w:tcPr>
-            <w:tcW w:type="dxa" w:w="720"/>
-            <w:tcMar>
-              <w:top w:type="dxa" w:w="90"/>
-              <w:left w:type="dxa" w:w="120"/>
-              <w:bottom w:type="dxa" w:w="90"/>
-              <w:right w:type="dxa" w:w="120"/>
-            </w:tcMar>
-          </w:tcPr>
-          <w:p>
-            <w:pPr>
-              <w:spacing w:after="0" w:line="264"/>
-            </w:pPr>
-            <w:r>
-              <w:rPr>
-                <w:rFonts w:ascii="Arial" w:cs="Arial" w:eastAsia="Arial" w:hAnsi="Arial"/>
+            <w:tcW w:type="dxa" w:w="655"/>
+            <w:tcMar>
+              <w:top w:type="dxa" w:w="90"/>
+              <w:left w:type="dxa" w:w="120"/>
+              <w:bottom w:type="dxa" w:w="90"/>
+              <w:right w:type="dxa" w:w="120"/>
+            </w:tcMar>
+          </w:tcPr>
+          <w:p>
+            <w:pPr>
+              <w:spacing w:after="0" w:line="264"/>
+            </w:pPr>
+            <w:r>
+              <w:rPr>
+                <w:rFonts w:ascii="Arial" w:cs="Arial" w:eastAsia="Arial" w:hAnsi="Arial"/>
+                <w:b/>
+                <w:bCs/>
                 <w:color w:val="2A2620"/>
                 <w:sz w:val="18"/>
                 <w:szCs w:val="18"/>
@@ -863,21 +1260,21 @@
         </w:tc>
         <w:tc>
           <w:tcPr>
-            <w:tcW w:type="dxa" w:w="2880"/>
-            <w:tcMar>
-              <w:top w:type="dxa" w:w="90"/>
-              <w:left w:type="dxa" w:w="120"/>
-              <w:bottom w:type="dxa" w:w="90"/>
-              <w:right w:type="dxa" w:w="120"/>
-            </w:tcMar>
-          </w:tcPr>
-          <w:p>
-            <w:pPr>
-              <w:spacing w:after="0" w:line="264"/>
-            </w:pPr>
-            <w:r>
-              <w:rPr>
-                <w:rFonts w:ascii="Arial" w:cs="Arial" w:eastAsia="Arial" w:hAnsi="Arial"/>
+            <w:tcW w:type="dxa" w:w="1872"/>
+            <w:tcMar>
+              <w:top w:type="dxa" w:w="90"/>
+              <w:left w:type="dxa" w:w="120"/>
+              <w:bottom w:type="dxa" w:w="90"/>
+              <w:right w:type="dxa" w:w="120"/>
+            </w:tcMar>
+          </w:tcPr>
+          <w:p>
+            <w:pPr>
+              <w:spacing w:after="0" w:line="264"/>
+            </w:pPr>
+            <w:r>
+              <w:rPr>
+                <w:rFonts w:ascii="Consolas" w:cs="Consolas" w:eastAsia="Consolas" w:hAnsi="Consolas"/>
                 <w:color w:val="2A2620"/>
                 <w:sz w:val="18"/>
                 <w:szCs w:val="18"/>
@@ -888,26 +1285,62 @@
         </w:tc>
         <w:tc>
           <w:tcPr>
-            <w:tcW w:type="dxa" w:w="5760"/>
-            <w:tcMar>
-              <w:top w:type="dxa" w:w="90"/>
-              <w:left w:type="dxa" w:w="120"/>
-              <w:bottom w:type="dxa" w:w="90"/>
-              <w:right w:type="dxa" w:w="120"/>
-            </w:tcMar>
-          </w:tcPr>
-          <w:p>
-            <w:pPr>
-              <w:spacing w:after="0" w:line="264"/>
-            </w:pPr>
-            <w:r>
-              <w:rPr>
-                <w:rFonts w:ascii="Arial" w:cs="Arial" w:eastAsia="Arial" w:hAnsi="Arial"/>
-                <w:color w:val="2A2620"/>
-                <w:sz w:val="18"/>
-                <w:szCs w:val="18"/>
-              </w:rPr>
-              <w:t xml:space="preserve">The page needs a person in it. 486 words of credentials, method cards that repeat /approach/, and a credentials list. The practice is sold on the relationship, and the page about the person has none. Highest-value writing left on the site, and it cannot be written for her.</w:t>
+            <w:tcW w:type="dxa" w:w="5148"/>
+            <w:tcMar>
+              <w:top w:type="dxa" w:w="90"/>
+              <w:left w:type="dxa" w:w="120"/>
+              <w:bottom w:type="dxa" w:w="90"/>
+              <w:right w:type="dxa" w:w="120"/>
+            </w:tcMar>
+          </w:tcPr>
+          <w:p>
+            <w:pPr>
+              <w:spacing w:after="0" w:line="264"/>
+            </w:pPr>
+            <w:r>
+              <w:rPr>
+                <w:rFonts w:ascii="Arial" w:cs="Arial" w:eastAsia="Arial" w:hAnsi="Arial"/>
+                <w:b/>
+                <w:bCs/>
+                <w:color w:val="2A2620"/>
+                <w:sz w:val="18"/>
+                <w:szCs w:val="18"/>
+              </w:rPr>
+              <w:t xml:space="preserve">The page needs a person in it.</w:t>
+            </w:r>
+            <w:r>
+              <w:rPr>
+                <w:rFonts w:ascii="Arial" w:cs="Arial" w:eastAsia="Arial" w:hAnsi="Arial"/>
+                <w:color w:val="2A2620"/>
+                <w:sz w:val="18"/>
+                <w:szCs w:val="18"/>
+              </w:rPr>
+              <w:t xml:space="preserve"> 482 words, now with the portrait beside the text and one button, but still credentials and method cards. Both external reviews made this their top content item. Seven questions are in the plan (the four from here plus three from ChatGPT). Cannot be written for her.</w:t>
+            </w:r>
+          </w:p>
+        </w:tc>
+        <w:tc>
+          <w:tcPr>
+            <w:tcW w:type="dxa" w:w="1685"/>
+            <w:tcMar>
+              <w:top w:type="dxa" w:w="90"/>
+              <w:left w:type="dxa" w:w="120"/>
+              <w:bottom w:type="dxa" w:w="90"/>
+              <w:right w:type="dxa" w:w="120"/>
+            </w:tcMar>
+          </w:tcPr>
+          <w:p>
+            <w:pPr>
+              <w:spacing w:after="0" w:line="264"/>
+            </w:pPr>
+            <w:r>
+              <w:rPr>
+                <w:rFonts w:ascii="Arial" w:cs="Arial" w:eastAsia="Arial" w:hAnsi="Arial"/>
+                <w:color w:val="2A2620"/>
+                <w:sz w:val="18"/>
+                <w:szCs w:val="18"/>
+              </w:rPr>
+              <w:t xml:space="preserve">M1</w:t>
             </w:r>
           </w:p>
         </w:tc>
@@ -915,7 +1348,7 @@
       <w:tr>
         <w:tc>
           <w:tcPr>
-            <w:tcW w:type="dxa" w:w="720"/>
+            <w:tcW w:type="dxa" w:w="655"/>
             <w:shd w:fill="E5DDD0" w:color="auto" w:val="clear"/>
             <w:tcMar>
               <w:top w:type="dxa" w:w="90"/>
@@ -931,6 +1364,8 @@
             <w:r>
               <w:rPr>
                 <w:rFonts w:ascii="Arial" w:cs="Arial" w:eastAsia="Arial" w:hAnsi="Arial"/>
+                <w:b/>
+                <w:bCs/>
                 <w:color w:val="2A2620"/>
                 <w:sz w:val="18"/>
                 <w:szCs w:val="18"/>
@@ -941,7 +1376,7 @@
         </w:tc>
         <w:tc>
           <w:tcPr>
-            <w:tcW w:type="dxa" w:w="2880"/>
+            <w:tcW w:type="dxa" w:w="1872"/>
             <w:shd w:fill="E5DDD0" w:color="auto" w:val="clear"/>
             <w:tcMar>
               <w:top w:type="dxa" w:w="90"/>
@@ -956,7 +1391,7 @@
             </w:pPr>
             <w:r>
               <w:rPr>
-                <w:rFonts w:ascii="Arial" w:cs="Arial" w:eastAsia="Arial" w:hAnsi="Arial"/>
+                <w:rFonts w:ascii="Consolas" w:cs="Consolas" w:eastAsia="Consolas" w:hAnsi="Consolas"/>
                 <w:color w:val="2A2620"/>
                 <w:sz w:val="18"/>
                 <w:szCs w:val="18"/>
@@ -967,7 +1402,7 @@
         </w:tc>
         <w:tc>
           <w:tcPr>
-            <w:tcW w:type="dxa" w:w="5760"/>
+            <w:tcW w:type="dxa" w:w="5148"/>
             <w:shd w:fill="E5DDD0" w:color="auto" w:val="clear"/>
             <w:tcMar>
               <w:top w:type="dxa" w:w="90"/>
@@ -983,11 +1418,48 @@
             <w:r>
               <w:rPr>
                 <w:rFonts w:ascii="Arial" w:cs="Arial" w:eastAsia="Arial" w:hAnsi="Arial"/>
-                <w:color w:val="2A2620"/>
-                <w:sz w:val="18"/>
-                <w:szCs w:val="18"/>
-              </w:rPr>
-              <w:t xml:space="preserve">What the first months are actually like. Two beats need Reem: what happens in the first supervision hour and what she asks an associate to bring to it; and what happens the first time an associate brings a session they handled badly. The second matters more.</w:t>
+                <w:b/>
+                <w:bCs/>
+                <w:color w:val="2A2620"/>
+                <w:sz w:val="18"/>
+                <w:szCs w:val="18"/>
+              </w:rPr>
+              <w:t xml:space="preserve">What the first months are actually like.</w:t>
+            </w:r>
+            <w:r>
+              <w:rPr>
+                <w:rFonts w:ascii="Arial" w:cs="Arial" w:eastAsia="Arial" w:hAnsi="Arial"/>
+                <w:color w:val="2A2620"/>
+                <w:sz w:val="18"/>
+                <w:szCs w:val="18"/>
+              </w:rPr>
+              <w:t xml:space="preserve"> Two beats: what happens in the first supervision hour and what she asks an associate to bring; and what happens the first time an associate brings a session they handled badly. The second matters more. The plan pairs this with former-supervisee quotes.</w:t>
+            </w:r>
+          </w:p>
+        </w:tc>
+        <w:tc>
+          <w:tcPr>
+            <w:tcW w:type="dxa" w:w="1685"/>
+            <w:shd w:fill="E5DDD0" w:color="auto" w:val="clear"/>
+            <w:tcMar>
+              <w:top w:type="dxa" w:w="90"/>
+              <w:left w:type="dxa" w:w="120"/>
+              <w:bottom w:type="dxa" w:w="90"/>
+              <w:right w:type="dxa" w:w="120"/>
+            </w:tcMar>
+          </w:tcPr>
+          <w:p>
+            <w:pPr>
+              <w:spacing w:after="0" w:line="264"/>
+            </w:pPr>
+            <w:r>
+              <w:rPr>
+                <w:rFonts w:ascii="Arial" w:cs="Arial" w:eastAsia="Arial" w:hAnsi="Arial"/>
+                <w:color w:val="2A2620"/>
+                <w:sz w:val="18"/>
+                <w:szCs w:val="18"/>
+              </w:rPr>
+              <w:t xml:space="preserve">M7</w:t>
             </w:r>
           </w:p>
         </w:tc>
@@ -995,8 +1467,13 @@
     </w:tbl>
     <w:p>
       <w:pPr>
+        <w:spacing w:after="120"/>
+      </w:pPr>
+    </w:p>
+    <w:p>
+      <w:pPr>
         <w:pStyle w:val="Heading2"/>
-        <w:spacing w:after="140" w:before="280"/>
+        <w:spacing w:after="100" w:before="240"/>
       </w:pPr>
       <w:r>
         <w:rPr>
@@ -1004,76 +1481,30 @@
           <w:b/>
           <w:bCs/>
           <w:color w:val="2A2620"/>
-          <w:sz w:val="24"/>
-          <w:szCs w:val="24"/>
-        </w:rPr>
-        <w:t xml:space="preserve">B11 in full — the four questions for Reem</w:t>
-      </w:r>
-    </w:p>
-    <w:p>
-      <w:pPr>
-        <w:spacing w:after="90" w:before="0" w:line="276"/>
-        <w:ind w:left="360"/>
-      </w:pPr>
-      <w:r>
-        <w:rPr>
-          <w:rFonts w:ascii="Arial" w:cs="Arial" w:eastAsia="Arial" w:hAnsi="Arial"/>
-          <w:color w:val="2A2620"/>
-          <w:sz w:val="20"/>
-          <w:szCs w:val="20"/>
-        </w:rPr>
-        <w:t xml:space="preserve">1.  Why trauma specifically, rather than general practice?</w:t>
-      </w:r>
-    </w:p>
-    <w:p>
-      <w:pPr>
-        <w:spacing w:after="90" w:before="0" w:line="276"/>
-        <w:ind w:left="360"/>
-      </w:pPr>
-      <w:r>
-        <w:rPr>
-          <w:rFonts w:ascii="Arial" w:cs="Arial" w:eastAsia="Arial" w:hAnsi="Arial"/>
-          <w:color w:val="2A2620"/>
-          <w:sz w:val="20"/>
-          <w:szCs w:val="20"/>
-        </w:rPr>
-        <w:t xml:space="preserve">2.  Why somatic, when she was trained to talk?</w:t>
-      </w:r>
-    </w:p>
-    <w:p>
-      <w:pPr>
-        <w:spacing w:after="90" w:before="0" w:line="276"/>
-        <w:ind w:left="360"/>
-      </w:pPr>
-      <w:r>
-        <w:rPr>
-          <w:rFonts w:ascii="Arial" w:cs="Arial" w:eastAsia="Arial" w:hAnsi="Arial"/>
-          <w:color w:val="2A2620"/>
-          <w:sz w:val="20"/>
-          <w:szCs w:val="20"/>
-        </w:rPr>
-        <w:t xml:space="preserve">3.  Why supervision, when it costs her caseload hours?</w:t>
-      </w:r>
-    </w:p>
-    <w:p>
-      <w:pPr>
-        <w:spacing w:after="90" w:before="0" w:line="276"/>
-        <w:ind w:left="360"/>
-      </w:pPr>
-      <w:r>
-        <w:rPr>
-          <w:rFonts w:ascii="Arial" w:cs="Arial" w:eastAsia="Arial" w:hAnsi="Arial"/>
-          <w:color w:val="2A2620"/>
-          <w:sz w:val="20"/>
-          <w:szCs w:val="20"/>
-        </w:rPr>
-        <w:t xml:space="preserve">4.  What are the horses actually for? Not the clinical rationale, which /therapy/equine/ covers, but what happened that made her start.</w:t>
+          <w:sz w:val="23"/>
+          <w:szCs w:val="23"/>
+        </w:rPr>
+        <w:t xml:space="preserve">Two of the four pillars still cannot be bought</w:t>
+      </w:r>
+    </w:p>
+    <w:p>
+      <w:pPr>
+        <w:spacing w:after="140" w:before="0" w:line="276"/>
+      </w:pPr>
+      <w:r>
+        <w:rPr>
+          <w:rFonts w:ascii="Arial" w:cs="Arial" w:eastAsia="Arial" w:hAnsi="Arial"/>
+          <w:color w:val="2A2620"/>
+          <w:sz w:val="20"/>
+          <w:szCs w:val="20"/>
+        </w:rPr>
+        <w:t xml:space="preserve">B4 and B5 are the largest hole in the For Therapists argument: four things that are usually four separate purchases, here as one relationship. Supervision and EMDR consultation each have a fee, a format and a route. Ethics CEUs and retreats have none of the three. A therapist persuaded by the integration argument can act on half of it. Each needs one date, one price and one way to sign up.</w:t>
       </w:r>
     </w:p>
     <w:p>
       <w:pPr>
         <w:pStyle w:val="Heading2"/>
-        <w:spacing w:after="140" w:before="280"/>
+        <w:spacing w:after="100" w:before="240"/>
       </w:pPr>
       <w:r>
         <w:rPr>
@@ -1081,63 +1512,152 @@
           <w:b/>
           <w:bCs/>
           <w:color w:val="2A2620"/>
-          <w:sz w:val="24"/>
-          <w:szCs w:val="24"/>
-        </w:rPr>
-        <w:t xml:space="preserve">Two of the four pillars still cannot be bought</w:t>
-      </w:r>
-    </w:p>
-    <w:p>
-      <w:pPr>
-        <w:spacing w:after="120" w:before="0" w:line="276"/>
-      </w:pPr>
-      <w:r>
-        <w:rPr>
-          <w:rFonts w:ascii="Arial" w:cs="Arial" w:eastAsia="Arial" w:hAnsi="Arial"/>
-          <w:color w:val="2A2620"/>
-          <w:sz w:val="20"/>
-          <w:szCs w:val="20"/>
-        </w:rPr>
-        <w:t xml:space="preserve">B4 and B5 are listed above as missing facts. They are also the largest hole in the argument the whole For Therapists path makes: four things that are usually four separate purchases, here as one relationship.</w:t>
-      </w:r>
-    </w:p>
-    <w:p>
-      <w:pPr>
-        <w:spacing w:after="120" w:before="0" w:line="276"/>
-      </w:pPr>
-      <w:r>
-        <w:rPr>
-          <w:rFonts w:ascii="Arial" w:cs="Arial" w:eastAsia="Arial" w:hAnsi="Arial"/>
-          <w:color w:val="2A2620"/>
-          <w:sz w:val="20"/>
-          <w:szCs w:val="20"/>
-        </w:rPr>
-        <w:t xml:space="preserve">LPC supervision and EMDR consultation each have a fee, a format and a route. Ethics CEUs and retreats have none of the three. A therapist persuaded by the integration argument can act on half of it.</w:t>
-      </w:r>
-    </w:p>
-    <w:p>
-      <w:pPr>
-        <w:spacing w:after="260" w:before="0" w:line="276"/>
-      </w:pPr>
-      <w:r>
-        <w:rPr>
-          <w:rFonts w:ascii="Arial" w:cs="Arial" w:eastAsia="Arial" w:hAnsi="Arial"/>
-          <w:color w:val="2A2620"/>
-          <w:sz w:val="20"/>
-          <w:szCs w:val="20"/>
-        </w:rPr>
-        <w:t xml:space="preserve">Each needs one date, one price and one way to sign up. For the ethics hours the provider status matters more than the date: an LPC who buys hours believing they count toward the approved-provider half, and finds they do not, is a worse failure than an unanswered email.</w:t>
-      </w:r>
-    </w:p>
-    <w:p>
-      <w:r>
-        <w:br w:type="page"/>
-      </w:r>
+          <w:sz w:val="23"/>
+          <w:szCs w:val="23"/>
+        </w:rPr>
+        <w:t xml:space="preserve">Newly needed from Reem since the last version</w:t>
+      </w:r>
+    </w:p>
+    <w:p>
+      <w:pPr>
+        <w:spacing w:after="140" w:before="0" w:line="276"/>
+      </w:pPr>
+      <w:r>
+        <w:rPr>
+          <w:rFonts w:ascii="Arial" w:cs="Arial" w:eastAsia="Arial" w:hAnsi="Arial"/>
+          <w:color w:val="2A2620"/>
+          <w:sz w:val="20"/>
+          <w:szCs w:val="20"/>
+        </w:rPr>
+        <w:t xml:space="preserve">These came out of the feedback reviews and are in the plan's W11 email and W1/W3 sheets, listed here so this doc stays the one list:</w:t>
+      </w:r>
+    </w:p>
+    <w:p>
+      <w:pPr>
+        <w:pStyle w:val="ListParagraph"/>
+        <w:numPr>
+          <w:ilvl w:val="0"/>
+          <w:numId w:val="1"/>
+        </w:numPr>
+        <w:spacing w:after="90" w:line="276"/>
+      </w:pPr>
+      <w:r>
+        <w:rPr>
+          <w:rFonts w:ascii="Arial" w:cs="Arial" w:eastAsia="Arial" w:hAnsi="Arial"/>
+          <w:color w:val="2A2620"/>
+          <w:sz w:val="20"/>
+          <w:szCs w:val="20"/>
+        </w:rPr>
+        <w:t xml:space="preserve">The associate relationship, decided once: employees, contractors, or independent practices she supervises; provider of record; records custody; who issues the Good Faith Estimate; whose malpractice; complaint routing (W1, with ten minutes of attorney time, M5).</w:t>
+      </w:r>
+    </w:p>
+    <w:p>
+      <w:pPr>
+        <w:pStyle w:val="ListParagraph"/>
+        <w:numPr>
+          <w:ilvl w:val="0"/>
+          <w:numId w:val="1"/>
+        </w:numPr>
+        <w:spacing w:after="90" w:line="276"/>
+      </w:pPr>
+      <w:r>
+        <w:rPr>
+          <w:rFonts w:ascii="Arial" w:cs="Arial" w:eastAsia="Arial" w:hAnsi="Arial"/>
+          <w:color w:val="2A2620"/>
+          <w:sz w:val="20"/>
+          <w:szCs w:val="20"/>
+        </w:rPr>
+        <w:t xml:space="preserve">Whether the Limits of Confidentiality PDF's "Duty to Warn" paragraph can be corrected. It says therapists are "mandated by law" to warn and "required to inform the intended victim"; Texas law permits disclosure to medical personnel or law enforcement and requires neither (W11 question 2, M5).</w:t>
+      </w:r>
+    </w:p>
+    <w:p>
+      <w:pPr>
+        <w:pStyle w:val="ListParagraph"/>
+        <w:numPr>
+          <w:ilvl w:val="0"/>
+          <w:numId w:val="1"/>
+        </w:numPr>
+        <w:spacing w:after="90" w:line="276"/>
+      </w:pPr>
+      <w:r>
+        <w:rPr>
+          <w:rFonts w:ascii="Arial" w:cs="Arial" w:eastAsia="Arial" w:hAnsi="Arial"/>
+          <w:color w:val="2A2620"/>
+          <w:sz w:val="20"/>
+          <w:szCs w:val="20"/>
+        </w:rPr>
+        <w:t xml:space="preserve">Whether the walk-and-talk consent form states the trail limit the site now describes (W11 question 3).</w:t>
+      </w:r>
+    </w:p>
+    <w:p>
+      <w:pPr>
+        <w:pStyle w:val="ListParagraph"/>
+        <w:numPr>
+          <w:ilvl w:val="0"/>
+          <w:numId w:val="1"/>
+        </w:numPr>
+        <w:spacing w:after="90" w:line="276"/>
+      </w:pPr>
+      <w:r>
+        <w:rPr>
+          <w:rFonts w:ascii="Arial" w:cs="Arial" w:eastAsia="Arial" w:hAnsi="Arial"/>
+          <w:color w:val="2A2620"/>
+          <w:sz w:val="20"/>
+          <w:szCs w:val="20"/>
+        </w:rPr>
+        <w:t xml:space="preserve">Her equine training credential, who handles Blu, injury and heat practice, and whether the equine consent carries the CPRC §87.005 warning (W3).</w:t>
+      </w:r>
+    </w:p>
+    <w:p>
+      <w:pPr>
+        <w:pStyle w:val="ListParagraph"/>
+        <w:numPr>
+          <w:ilvl w:val="0"/>
+          <w:numId w:val="1"/>
+        </w:numPr>
+        <w:spacing w:after="90" w:line="276"/>
+      </w:pPr>
+      <w:r>
+        <w:rPr>
+          <w:rFonts w:ascii="Arial" w:cs="Arial" w:eastAsia="Arial" w:hAnsi="Arial"/>
+          <w:color w:val="2A2620"/>
+          <w:sz w:val="20"/>
+          <w:szCs w:val="20"/>
+        </w:rPr>
+        <w:t xml:space="preserve">Yes or no to the two role-boundary sentences for the supervision page (W7).</w:t>
+      </w:r>
+    </w:p>
+    <w:p>
+      <w:pPr>
+        <w:pStyle w:val="ListParagraph"/>
+        <w:numPr>
+          <w:ilvl w:val="0"/>
+          <w:numId w:val="1"/>
+        </w:numPr>
+        <w:spacing w:after="90" w:line="276"/>
+      </w:pPr>
+      <w:r>
+        <w:rPr>
+          <w:rFonts w:ascii="Arial" w:cs="Arial" w:eastAsia="Arial" w:hAnsi="Arial"/>
+          <w:color w:val="2A2620"/>
+          <w:sz w:val="20"/>
+          <w:szCs w:val="20"/>
+        </w:rPr>
+        <w:t xml:space="preserve">Phone hours and the "returned within two working days" promise now printed on the consult page (W11 question 5).</w:t>
+      </w:r>
+    </w:p>
+    <w:p>
+      <w:pPr>
+        <w:pBdr>
+          <w:bottom w:val="single" w:color="BFB5A5" w:sz="6" w:space="1"/>
+        </w:pBdr>
+        <w:spacing w:after="220" w:before="40"/>
+      </w:pPr>
     </w:p>
     <w:p>
       <w:pPr>
         <w:pStyle w:val="Heading1"/>
-        <w:spacing w:after="140" w:before="0"/>
+        <w:spacing w:after="140" w:before="360"/>
       </w:pPr>
       <w:r>
         <w:rPr>
@@ -1145,10 +1665,10 @@
           <w:b/>
           <w:bCs/>
           <w:color w:val="2A2620"/>
-          <w:sz w:val="32"/>
-          <w:szCs w:val="32"/>
-        </w:rPr>
-        <w:t xml:space="preserve">C.  Decisions for Dave</w:t>
+          <w:sz w:val="30"/>
+          <w:szCs w:val="30"/>
+        </w:rPr>
+        <w:t xml:space="preserve">C. Decisions for Dave</w:t>
       </w:r>
     </w:p>
     <w:tbl>
@@ -1164,9 +1684,10 @@
         </w:tblBorders>
       </w:tblPr>
       <w:tblGrid>
-        <w:gridCol w:w="720"/>
-        <w:gridCol w:w="3240"/>
-        <w:gridCol w:w="5400"/>
+        <w:gridCol w:w="655"/>
+        <w:gridCol w:w="1872"/>
+        <w:gridCol w:w="5148"/>
+        <w:gridCol w:w="1685"/>
       </w:tblGrid>
       <w:tr>
         <w:trPr>
@@ -1174,7 +1695,7 @@
         </w:trPr>
         <w:tc>
           <w:tcPr>
-            <w:tcW w:type="dxa" w:w="720"/>
+            <w:tcW w:type="dxa" w:w="655"/>
             <w:shd w:fill="1F2D38" w:color="auto" w:val="clear"/>
             <w:tcMar>
               <w:top w:type="dxa" w:w="90"/>
@@ -1202,7 +1723,7 @@
         </w:tc>
         <w:tc>
           <w:tcPr>
-            <w:tcW w:type="dxa" w:w="3240"/>
+            <w:tcW w:type="dxa" w:w="1872"/>
             <w:shd w:fill="1F2D38" w:color="auto" w:val="clear"/>
             <w:tcMar>
               <w:top w:type="dxa" w:w="90"/>
@@ -1230,7 +1751,7 @@
         </w:tc>
         <w:tc>
           <w:tcPr>
-            <w:tcW w:type="dxa" w:w="5400"/>
+            <w:tcW w:type="dxa" w:w="5148"/>
             <w:shd w:fill="1F2D38" w:color="auto" w:val="clear"/>
             <w:tcMar>
               <w:top w:type="dxa" w:w="90"/>
@@ -1256,11 +1777,39 @@
             </w:r>
           </w:p>
         </w:tc>
+        <w:tc>
+          <w:tcPr>
+            <w:tcW w:type="dxa" w:w="1685"/>
+            <w:shd w:fill="1F2D38" w:color="auto" w:val="clear"/>
+            <w:tcMar>
+              <w:top w:type="dxa" w:w="90"/>
+              <w:left w:type="dxa" w:w="120"/>
+              <w:bottom w:type="dxa" w:w="90"/>
+              <w:right w:type="dxa" w:w="120"/>
+            </w:tcMar>
+          </w:tcPr>
+          <w:p>
+            <w:pPr>
+              <w:spacing w:after="0" w:line="264"/>
+            </w:pPr>
+            <w:r>
+              <w:rPr>
+                <w:rFonts w:ascii="Arial" w:cs="Arial" w:eastAsia="Arial" w:hAnsi="Arial"/>
+                <w:b/>
+                <w:bCs/>
+                <w:color w:val="FFFFFF"/>
+                <w:sz w:val="18"/>
+                <w:szCs w:val="18"/>
+              </w:rPr>
+              <w:t xml:space="preserve">Plan</w:t>
+            </w:r>
+          </w:p>
+        </w:tc>
       </w:tr>
       <w:tr>
         <w:tc>
           <w:tcPr>
-            <w:tcW w:type="dxa" w:w="720"/>
+            <w:tcW w:type="dxa" w:w="655"/>
             <w:tcMar>
               <w:top w:type="dxa" w:w="90"/>
               <w:left w:type="dxa" w:w="120"/>
@@ -1285,21 +1834,23 @@
         </w:tc>
         <w:tc>
           <w:tcPr>
-            <w:tcW w:type="dxa" w:w="3240"/>
-            <w:tcMar>
-              <w:top w:type="dxa" w:w="90"/>
-              <w:left w:type="dxa" w:w="120"/>
-              <w:bottom w:type="dxa" w:w="90"/>
-              <w:right w:type="dxa" w:w="120"/>
-            </w:tcMar>
-          </w:tcPr>
-          <w:p>
-            <w:pPr>
-              <w:spacing w:after="0" w:line="264"/>
-            </w:pPr>
-            <w:r>
-              <w:rPr>
-                <w:rFonts w:ascii="Arial" w:cs="Arial" w:eastAsia="Arial" w:hAnsi="Arial"/>
+            <w:tcW w:type="dxa" w:w="1872"/>
+            <w:tcMar>
+              <w:top w:type="dxa" w:w="90"/>
+              <w:left w:type="dxa" w:w="120"/>
+              <w:bottom w:type="dxa" w:w="90"/>
+              <w:right w:type="dxa" w:w="120"/>
+            </w:tcMar>
+          </w:tcPr>
+          <w:p>
+            <w:pPr>
+              <w:spacing w:after="0" w:line="264"/>
+            </w:pPr>
+            <w:r>
+              <w:rPr>
+                <w:rFonts w:ascii="Arial" w:cs="Arial" w:eastAsia="Arial" w:hAnsi="Arial"/>
+                <w:b/>
+                <w:bCs/>
                 <w:color w:val="2A2620"/>
                 <w:sz w:val="18"/>
                 <w:szCs w:val="18"/>
@@ -1310,26 +1861,69 @@
         </w:tc>
         <w:tc>
           <w:tcPr>
-            <w:tcW w:type="dxa" w:w="5400"/>
-            <w:tcMar>
-              <w:top w:type="dxa" w:w="90"/>
-              <w:left w:type="dxa" w:w="120"/>
-              <w:bottom w:type="dxa" w:w="90"/>
-              <w:right w:type="dxa" w:w="120"/>
-            </w:tcMar>
-          </w:tcPr>
-          <w:p>
-            <w:pPr>
-              <w:spacing w:after="0" w:line="264"/>
-            </w:pPr>
-            <w:r>
-              <w:rPr>
-                <w:rFonts w:ascii="Arial" w:cs="Arial" w:eastAsia="Arial" w:hAnsi="Arial"/>
-                <w:color w:val="2A2620"/>
-                <w:sz w:val="18"/>
-                <w:szCs w:val="18"/>
-              </w:rPr>
-              <w:t xml:space="preserve">inNav: false. 2,257 words, the strongest search asset on the site, the most likely landing page for a therapist, and unreachable from the menu on every page. One line of front matter. Dropping "Home" frees a slot, since the wordmark already links there.</w:t>
+            <w:tcW w:type="dxa" w:w="5148"/>
+            <w:tcMar>
+              <w:top w:type="dxa" w:w="90"/>
+              <w:left w:type="dxa" w:w="120"/>
+              <w:bottom w:type="dxa" w:w="90"/>
+              <w:right w:type="dxa" w:w="120"/>
+            </w:tcMar>
+          </w:tcPr>
+          <w:p>
+            <w:pPr>
+              <w:spacing w:after="0" w:line="264"/>
+            </w:pPr>
+            <w:r>
+              <w:rPr>
+                <w:rFonts w:ascii="Arial" w:cs="Arial" w:eastAsia="Arial" w:hAnsi="Arial"/>
+                <w:color w:val="2A2620"/>
+                <w:sz w:val="18"/>
+                <w:szCs w:val="18"/>
+              </w:rPr>
+              <w:t xml:space="preserve">Still </w:t>
+            </w:r>
+            <w:r>
+              <w:rPr>
+                <w:rFonts w:ascii="Consolas" w:cs="Consolas" w:eastAsia="Consolas" w:hAnsi="Consolas"/>
+                <w:color w:val="2A2620"/>
+                <w:sz w:val="18"/>
+                <w:szCs w:val="18"/>
+              </w:rPr>
+              <w:t xml:space="preserve">inNav: false</w:t>
+            </w:r>
+            <w:r>
+              <w:rPr>
+                <w:rFonts w:ascii="Arial" w:cs="Arial" w:eastAsia="Arial" w:hAnsi="Arial"/>
+                <w:color w:val="2A2620"/>
+                <w:sz w:val="18"/>
+                <w:szCs w:val="18"/>
+              </w:rPr>
+              <w:t xml:space="preserve">. 2,257 words, the strongest search asset on the site, reachable from the For Therapists hub card, the footer section column and the supervision pages, but not the menu.</w:t>
+            </w:r>
+          </w:p>
+        </w:tc>
+        <w:tc>
+          <w:tcPr>
+            <w:tcW w:type="dxa" w:w="1685"/>
+            <w:tcMar>
+              <w:top w:type="dxa" w:w="90"/>
+              <w:left w:type="dxa" w:w="120"/>
+              <w:bottom w:type="dxa" w:w="90"/>
+              <w:right w:type="dxa" w:w="120"/>
+            </w:tcMar>
+          </w:tcPr>
+          <w:p>
+            <w:pPr>
+              <w:spacing w:after="0" w:line="264"/>
+            </w:pPr>
+            <w:r>
+              <w:rPr>
+                <w:rFonts w:ascii="Arial" w:cs="Arial" w:eastAsia="Arial" w:hAnsi="Arial"/>
+                <w:color w:val="2A2620"/>
+                <w:sz w:val="18"/>
+                <w:szCs w:val="18"/>
+              </w:rPr>
+              <w:t xml:space="preserve">M10</w:t>
             </w:r>
           </w:p>
         </w:tc>
@@ -1337,7 +1931,7 @@
       <w:tr>
         <w:tc>
           <w:tcPr>
-            <w:tcW w:type="dxa" w:w="720"/>
+            <w:tcW w:type="dxa" w:w="655"/>
             <w:shd w:fill="E5DDD0" w:color="auto" w:val="clear"/>
             <w:tcMar>
               <w:top w:type="dxa" w:w="90"/>
@@ -1363,7 +1957,7 @@
         </w:tc>
         <w:tc>
           <w:tcPr>
-            <w:tcW w:type="dxa" w:w="3240"/>
+            <w:tcW w:type="dxa" w:w="1872"/>
             <w:shd w:fill="E5DDD0" w:color="auto" w:val="clear"/>
             <w:tcMar>
               <w:top w:type="dxa" w:w="90"/>
@@ -1379,17 +1973,19 @@
             <w:r>
               <w:rPr>
                 <w:rFonts w:ascii="Arial" w:cs="Arial" w:eastAsia="Arial" w:hAnsi="Arial"/>
-                <w:color w:val="2A2620"/>
-                <w:sz w:val="18"/>
-                <w:szCs w:val="18"/>
-              </w:rPr>
-              <w:t xml:space="preserve">/approach/ is not in the top nav either</w:t>
-            </w:r>
-          </w:p>
-        </w:tc>
-        <w:tc>
-          <w:tcPr>
-            <w:tcW w:type="dxa" w:w="5400"/>
+                <w:b/>
+                <w:bCs/>
+                <w:color w:val="2A2620"/>
+                <w:sz w:val="18"/>
+                <w:szCs w:val="18"/>
+              </w:rPr>
+              <w:t xml:space="preserve">`/approach/` is not in the top nav either</w:t>
+            </w:r>
+          </w:p>
+        </w:tc>
+        <w:tc>
+          <w:tcPr>
+            <w:tcW w:type="dxa" w:w="5148"/>
             <w:shd w:fill="E5DDD0" w:color="auto" w:val="clear"/>
             <w:tcMar>
               <w:top w:type="dxa" w:w="90"/>
@@ -1409,7 +2005,51 @@
                 <w:sz w:val="18"/>
                 <w:szCs w:val="18"/>
               </w:rPr>
-              <w:t xml:space="preserve">Same inNav: false, and it is a hub with four children of its own.</w:t>
+              <w:t xml:space="preserve">Still </w:t>
+            </w:r>
+            <w:r>
+              <w:rPr>
+                <w:rFonts w:ascii="Consolas" w:cs="Consolas" w:eastAsia="Consolas" w:hAnsi="Consolas"/>
+                <w:color w:val="2A2620"/>
+                <w:sz w:val="18"/>
+                <w:szCs w:val="18"/>
+              </w:rPr>
+              <w:t xml:space="preserve">inNav: false</w:t>
+            </w:r>
+            <w:r>
+              <w:rPr>
+                <w:rFonts w:ascii="Arial" w:cs="Arial" w:eastAsia="Arial" w:hAnsi="Arial"/>
+                <w:color w:val="2A2620"/>
+                <w:sz w:val="18"/>
+                <w:szCs w:val="18"/>
+              </w:rPr>
+              <w:t xml:space="preserve">, and it is a hub with four children. ChatGPT's review wants the nav cut to five or six; the plan proposes seven with Home and FAQ dropped and Approach added.</w:t>
+            </w:r>
+          </w:p>
+        </w:tc>
+        <w:tc>
+          <w:tcPr>
+            <w:tcW w:type="dxa" w:w="1685"/>
+            <w:shd w:fill="E5DDD0" w:color="auto" w:val="clear"/>
+            <w:tcMar>
+              <w:top w:type="dxa" w:w="90"/>
+              <w:left w:type="dxa" w:w="120"/>
+              <w:bottom w:type="dxa" w:w="90"/>
+              <w:right w:type="dxa" w:w="120"/>
+            </w:tcMar>
+          </w:tcPr>
+          <w:p>
+            <w:pPr>
+              <w:spacing w:after="0" w:line="264"/>
+            </w:pPr>
+            <w:r>
+              <w:rPr>
+                <w:rFonts w:ascii="Arial" w:cs="Arial" w:eastAsia="Arial" w:hAnsi="Arial"/>
+                <w:color w:val="2A2620"/>
+                <w:sz w:val="18"/>
+                <w:szCs w:val="18"/>
+              </w:rPr>
+              <w:t xml:space="preserve">M10</w:t>
             </w:r>
           </w:p>
         </w:tc>
@@ -1417,7 +2057,7 @@
       <w:tr>
         <w:tc>
           <w:tcPr>
-            <w:tcW w:type="dxa" w:w="720"/>
+            <w:tcW w:type="dxa" w:w="655"/>
             <w:tcMar>
               <w:top w:type="dxa" w:w="90"/>
               <w:left w:type="dxa" w:w="120"/>
@@ -1442,21 +2082,23 @@
         </w:tc>
         <w:tc>
           <w:tcPr>
-            <w:tcW w:type="dxa" w:w="3240"/>
-            <w:tcMar>
-              <w:top w:type="dxa" w:w="90"/>
-              <w:left w:type="dxa" w:w="120"/>
-              <w:bottom w:type="dxa" w:w="90"/>
-              <w:right w:type="dxa" w:w="120"/>
-            </w:tcMar>
-          </w:tcPr>
-          <w:p>
-            <w:pPr>
-              <w:spacing w:after="0" w:line="264"/>
-            </w:pPr>
-            <w:r>
-              <w:rPr>
-                <w:rFonts w:ascii="Arial" w:cs="Arial" w:eastAsia="Arial" w:hAnsi="Arial"/>
+            <w:tcW w:type="dxa" w:w="1872"/>
+            <w:tcMar>
+              <w:top w:type="dxa" w:w="90"/>
+              <w:left w:type="dxa" w:w="120"/>
+              <w:bottom w:type="dxa" w:w="90"/>
+              <w:right w:type="dxa" w:w="120"/>
+            </w:tcMar>
+          </w:tcPr>
+          <w:p>
+            <w:pPr>
+              <w:spacing w:after="0" w:line="264"/>
+            </w:pPr>
+            <w:r>
+              <w:rPr>
+                <w:rFonts w:ascii="Arial" w:cs="Arial" w:eastAsia="Arial" w:hAnsi="Arial"/>
+                <w:b/>
+                <w:bCs/>
                 <w:color w:val="2A2620"/>
                 <w:sz w:val="18"/>
                 <w:szCs w:val="18"/>
@@ -1467,26 +2109,87 @@
         </w:tc>
         <w:tc>
           <w:tcPr>
-            <w:tcW w:type="dxa" w:w="5400"/>
-            <w:tcMar>
-              <w:top w:type="dxa" w:w="90"/>
-              <w:left w:type="dxa" w:w="120"/>
-              <w:bottom w:type="dxa" w:w="90"/>
-              <w:right w:type="dxa" w:w="120"/>
-            </w:tcMar>
-          </w:tcPr>
-          <w:p>
-            <w:pPr>
-              <w:spacing w:after="0" w:line="264"/>
-            </w:pPr>
-            <w:r>
-              <w:rPr>
-                <w:rFonts w:ascii="Arial" w:cs="Arial" w:eastAsia="Arial" w:hAnsi="Arial"/>
-                <w:color w:val="2A2620"/>
-                <w:sz w:val="18"/>
-                <w:szCs w:val="18"/>
-              </w:rPr>
-              <w:t xml:space="preserve">The guide has one id (#renewal). Two links still land at the top when they mean a section: "deadlines associates most often miss" wants the supervision-rules section, and "lists the questions worth asking" wants "Choosing a supervisor".</w:t>
+            <w:tcW w:type="dxa" w:w="5148"/>
+            <w:tcMar>
+              <w:top w:type="dxa" w:w="90"/>
+              <w:left w:type="dxa" w:w="120"/>
+              <w:bottom w:type="dxa" w:w="90"/>
+              <w:right w:type="dxa" w:w="120"/>
+            </w:tcMar>
+          </w:tcPr>
+          <w:p>
+            <w:pPr>
+              <w:spacing w:after="0" w:line="264"/>
+            </w:pPr>
+            <w:r>
+              <w:rPr>
+                <w:rFonts w:ascii="Arial" w:cs="Arial" w:eastAsia="Arial" w:hAnsi="Arial"/>
+                <w:color w:val="2A2620"/>
+                <w:sz w:val="18"/>
+                <w:szCs w:val="18"/>
+              </w:rPr>
+              <w:t xml:space="preserve">The guide still has one </w:t>
+            </w:r>
+            <w:r>
+              <w:rPr>
+                <w:rFonts w:ascii="Consolas" w:cs="Consolas" w:eastAsia="Consolas" w:hAnsi="Consolas"/>
+                <w:color w:val="2A2620"/>
+                <w:sz w:val="18"/>
+                <w:szCs w:val="18"/>
+              </w:rPr>
+              <w:t xml:space="preserve">id</w:t>
+            </w:r>
+            <w:r>
+              <w:rPr>
+                <w:rFonts w:ascii="Arial" w:cs="Arial" w:eastAsia="Arial" w:hAnsi="Arial"/>
+                <w:color w:val="2A2620"/>
+                <w:sz w:val="18"/>
+                <w:szCs w:val="18"/>
+              </w:rPr>
+              <w:t xml:space="preserve"> (</w:t>
+            </w:r>
+            <w:r>
+              <w:rPr>
+                <w:rFonts w:ascii="Consolas" w:cs="Consolas" w:eastAsia="Consolas" w:hAnsi="Consolas"/>
+                <w:color w:val="2A2620"/>
+                <w:sz w:val="18"/>
+                <w:szCs w:val="18"/>
+              </w:rPr>
+              <w:t xml:space="preserve">#renewal</w:t>
+            </w:r>
+            <w:r>
+              <w:rPr>
+                <w:rFonts w:ascii="Arial" w:cs="Arial" w:eastAsia="Arial" w:hAnsi="Arial"/>
+                <w:color w:val="2A2620"/>
+                <w:sz w:val="18"/>
+                <w:szCs w:val="18"/>
+              </w:rPr>
+              <w:t xml:space="preserve">), linked three times. "Deadlines associates most often miss" and "lists the questions worth asking" still land at the top of the page.</w:t>
+            </w:r>
+          </w:p>
+        </w:tc>
+        <w:tc>
+          <w:tcPr>
+            <w:tcW w:type="dxa" w:w="1685"/>
+            <w:tcMar>
+              <w:top w:type="dxa" w:w="90"/>
+              <w:left w:type="dxa" w:w="120"/>
+              <w:bottom w:type="dxa" w:w="90"/>
+              <w:right w:type="dxa" w:w="120"/>
+            </w:tcMar>
+          </w:tcPr>
+          <w:p>
+            <w:pPr>
+              <w:spacing w:after="0" w:line="264"/>
+            </w:pPr>
+            <w:r>
+              <w:rPr>
+                <w:rFonts w:ascii="Arial" w:cs="Arial" w:eastAsia="Arial" w:hAnsi="Arial"/>
+                <w:color w:val="2A2620"/>
+                <w:sz w:val="18"/>
+                <w:szCs w:val="18"/>
+              </w:rPr>
+              <w:t xml:space="preserve">not in the plan; 10 minutes</w:t>
             </w:r>
           </w:p>
         </w:tc>
@@ -1494,7 +2197,7 @@
       <w:tr>
         <w:tc>
           <w:tcPr>
-            <w:tcW w:type="dxa" w:w="720"/>
+            <w:tcW w:type="dxa" w:w="655"/>
             <w:shd w:fill="E5DDD0" w:color="auto" w:val="clear"/>
             <w:tcMar>
               <w:top w:type="dxa" w:w="90"/>
@@ -1520,7 +2223,7 @@
         </w:tc>
         <w:tc>
           <w:tcPr>
-            <w:tcW w:type="dxa" w:w="3240"/>
+            <w:tcW w:type="dxa" w:w="1872"/>
             <w:shd w:fill="E5DDD0" w:color="auto" w:val="clear"/>
             <w:tcMar>
               <w:top w:type="dxa" w:w="90"/>
@@ -1536,6 +2239,8 @@
             <w:r>
               <w:rPr>
                 <w:rFonts w:ascii="Arial" w:cs="Arial" w:eastAsia="Arial" w:hAnsi="Arial"/>
+                <w:b/>
+                <w:bCs/>
                 <w:color w:val="2A2620"/>
                 <w:sz w:val="18"/>
                 <w:szCs w:val="18"/>
@@ -1546,7 +2251,7 @@
         </w:tc>
         <w:tc>
           <w:tcPr>
-            <w:tcW w:type="dxa" w:w="5400"/>
+            <w:tcW w:type="dxa" w:w="5148"/>
             <w:shd w:fill="E5DDD0" w:color="auto" w:val="clear"/>
             <w:tcMar>
               <w:top w:type="dxa" w:w="90"/>
@@ -1566,7 +2271,69 @@
                 <w:sz w:val="18"/>
                 <w:szCs w:val="18"/>
               </w:rPr>
-              <w:t xml:space="preserve">All twelve rows sit inside the "How much is a session?" accordion on /faq/. Search engines see it either way; a human scanning for prices has to open it.</w:t>
+              <w:t xml:space="preserve">All seventeen </w:t>
+            </w:r>
+            <w:r>
+              <w:rPr>
+                <w:rFonts w:ascii="Consolas" w:cs="Consolas" w:eastAsia="Consolas" w:hAnsi="Consolas"/>
+                <w:color w:val="2A2620"/>
+                <w:sz w:val="18"/>
+                <w:szCs w:val="18"/>
+              </w:rPr>
+              <w:t xml:space="preserve">dt/dd</w:t>
+            </w:r>
+            <w:r>
+              <w:rPr>
+                <w:rFonts w:ascii="Arial" w:cs="Arial" w:eastAsia="Arial" w:hAnsi="Arial"/>
+                <w:color w:val="2A2620"/>
+                <w:sz w:val="18"/>
+                <w:szCs w:val="18"/>
+              </w:rPr>
+              <w:t xml:space="preserve"> rows on </w:t>
+            </w:r>
+            <w:r>
+              <w:rPr>
+                <w:rFonts w:ascii="Consolas" w:cs="Consolas" w:eastAsia="Consolas" w:hAnsi="Consolas"/>
+                <w:color w:val="2A2620"/>
+                <w:sz w:val="18"/>
+                <w:szCs w:val="18"/>
+              </w:rPr>
+              <w:t xml:space="preserve">/faq/</w:t>
+            </w:r>
+            <w:r>
+              <w:rPr>
+                <w:rFonts w:ascii="Arial" w:cs="Arial" w:eastAsia="Arial" w:hAnsi="Arial"/>
+                <w:color w:val="2A2620"/>
+                <w:sz w:val="18"/>
+                <w:szCs w:val="18"/>
+              </w:rPr>
+              <w:t xml:space="preserve"> sit inside accordions, the fees inside "How much is a session?". Search engines see it either way; a human scanning for prices has to open it.</w:t>
+            </w:r>
+          </w:p>
+        </w:tc>
+        <w:tc>
+          <w:tcPr>
+            <w:tcW w:type="dxa" w:w="1685"/>
+            <w:shd w:fill="E5DDD0" w:color="auto" w:val="clear"/>
+            <w:tcMar>
+              <w:top w:type="dxa" w:w="90"/>
+              <w:left w:type="dxa" w:w="120"/>
+              <w:bottom w:type="dxa" w:w="90"/>
+              <w:right w:type="dxa" w:w="120"/>
+            </w:tcMar>
+          </w:tcPr>
+          <w:p>
+            <w:pPr>
+              <w:spacing w:after="0" w:line="264"/>
+            </w:pPr>
+            <w:r>
+              <w:rPr>
+                <w:rFonts w:ascii="Arial" w:cs="Arial" w:eastAsia="Arial" w:hAnsi="Arial"/>
+                <w:color w:val="2A2620"/>
+                <w:sz w:val="18"/>
+                <w:szCs w:val="18"/>
+              </w:rPr>
+              <w:t xml:space="preserve">not in the plan</w:t>
             </w:r>
           </w:p>
         </w:tc>
@@ -1574,7 +2341,7 @@
       <w:tr>
         <w:tc>
           <w:tcPr>
-            <w:tcW w:type="dxa" w:w="720"/>
+            <w:tcW w:type="dxa" w:w="655"/>
             <w:tcMar>
               <w:top w:type="dxa" w:w="90"/>
               <w:left w:type="dxa" w:w="120"/>
@@ -1599,51 +2366,78 @@
         </w:tc>
         <w:tc>
           <w:tcPr>
-            <w:tcW w:type="dxa" w:w="3240"/>
-            <w:tcMar>
-              <w:top w:type="dxa" w:w="90"/>
-              <w:left w:type="dxa" w:w="120"/>
-              <w:bottom w:type="dxa" w:w="90"/>
-              <w:right w:type="dxa" w:w="120"/>
-            </w:tcMar>
-          </w:tcPr>
-          <w:p>
-            <w:pPr>
-              <w:spacing w:after="0" w:line="264"/>
-            </w:pPr>
-            <w:r>
-              <w:rPr>
-                <w:rFonts w:ascii="Arial" w:cs="Arial" w:eastAsia="Arial" w:hAnsi="Arial"/>
-                <w:color w:val="2A2620"/>
-                <w:sz w:val="18"/>
-                <w:szCs w:val="18"/>
-              </w:rPr>
-              <w:t xml:space="preserve">The home page no longer links to walk-and-talk</w:t>
-            </w:r>
-          </w:p>
-        </w:tc>
-        <w:tc>
-          <w:tcPr>
-            <w:tcW w:type="dxa" w:w="5400"/>
-            <w:tcMar>
-              <w:top w:type="dxa" w:w="90"/>
-              <w:left w:type="dxa" w:w="120"/>
-              <w:bottom w:type="dxa" w:w="90"/>
-              <w:right w:type="dxa" w:w="120"/>
-            </w:tcMar>
-          </w:tcPr>
-          <w:p>
-            <w:pPr>
-              <w:spacing w:after="0" w:line="264"/>
-            </w:pPr>
-            <w:r>
-              <w:rPr>
-                <w:rFonts w:ascii="Arial" w:cs="Arial" w:eastAsia="Arial" w:hAnsi="Arial"/>
-                <w:color w:val="2A2620"/>
-                <w:sz w:val="18"/>
-                <w:szCs w:val="18"/>
-              </w:rPr>
-              <w:t xml:space="preserve">It was an inline link in the paragraph that became the "These four interlock" card, and a card that is itself a link cannot contain one. One short line under the grid restores it.</w:t>
+            <w:tcW w:type="dxa" w:w="1872"/>
+            <w:tcMar>
+              <w:top w:type="dxa" w:w="90"/>
+              <w:left w:type="dxa" w:w="120"/>
+              <w:bottom w:type="dxa" w:w="90"/>
+              <w:right w:type="dxa" w:w="120"/>
+            </w:tcMar>
+          </w:tcPr>
+          <w:p>
+            <w:pPr>
+              <w:spacing w:after="0" w:line="264"/>
+            </w:pPr>
+            <w:r>
+              <w:rPr>
+                <w:rFonts w:ascii="Arial" w:cs="Arial" w:eastAsia="Arial" w:hAnsi="Arial"/>
+                <w:b/>
+                <w:bCs/>
+                <w:color w:val="2A2620"/>
+                <w:sz w:val="18"/>
+                <w:szCs w:val="18"/>
+              </w:rPr>
+              <w:t xml:space="preserve">The home page does not link to walk-and-talk</w:t>
+            </w:r>
+          </w:p>
+        </w:tc>
+        <w:tc>
+          <w:tcPr>
+            <w:tcW w:type="dxa" w:w="5148"/>
+            <w:tcMar>
+              <w:top w:type="dxa" w:w="90"/>
+              <w:left w:type="dxa" w:w="120"/>
+              <w:bottom w:type="dxa" w:w="90"/>
+              <w:right w:type="dxa" w:w="120"/>
+            </w:tcMar>
+          </w:tcPr>
+          <w:p>
+            <w:pPr>
+              <w:spacing w:after="0" w:line="264"/>
+            </w:pPr>
+            <w:r>
+              <w:rPr>
+                <w:rFonts w:ascii="Arial" w:cs="Arial" w:eastAsia="Arial" w:hAnsi="Arial"/>
+                <w:color w:val="2A2620"/>
+                <w:sz w:val="18"/>
+                <w:szCs w:val="18"/>
+              </w:rPr>
+              <w:t xml:space="preserve">Still zero links. Restored by the "What brings you?" grid when W4 moves it onto the home page.</w:t>
+            </w:r>
+          </w:p>
+        </w:tc>
+        <w:tc>
+          <w:tcPr>
+            <w:tcW w:type="dxa" w:w="1685"/>
+            <w:tcMar>
+              <w:top w:type="dxa" w:w="90"/>
+              <w:left w:type="dxa" w:w="120"/>
+              <w:bottom w:type="dxa" w:w="90"/>
+              <w:right w:type="dxa" w:w="120"/>
+            </w:tcMar>
+          </w:tcPr>
+          <w:p>
+            <w:pPr>
+              <w:spacing w:after="0" w:line="264"/>
+            </w:pPr>
+            <w:r>
+              <w:rPr>
+                <w:rFonts w:ascii="Arial" w:cs="Arial" w:eastAsia="Arial" w:hAnsi="Arial"/>
+                <w:color w:val="2A2620"/>
+                <w:sz w:val="18"/>
+                <w:szCs w:val="18"/>
+              </w:rPr>
+              <w:t xml:space="preserve">W4</w:t>
             </w:r>
           </w:p>
         </w:tc>
@@ -1651,7 +2445,7 @@
       <w:tr>
         <w:tc>
           <w:tcPr>
-            <w:tcW w:type="dxa" w:w="720"/>
+            <w:tcW w:type="dxa" w:w="655"/>
             <w:shd w:fill="E5DDD0" w:color="auto" w:val="clear"/>
             <w:tcMar>
               <w:top w:type="dxa" w:w="90"/>
@@ -1677,7 +2471,7 @@
         </w:tc>
         <w:tc>
           <w:tcPr>
-            <w:tcW w:type="dxa" w:w="3240"/>
+            <w:tcW w:type="dxa" w:w="1872"/>
             <w:shd w:fill="E5DDD0" w:color="auto" w:val="clear"/>
             <w:tcMar>
               <w:top w:type="dxa" w:w="90"/>
@@ -1693,6 +2487,8 @@
             <w:r>
               <w:rPr>
                 <w:rFonts w:ascii="Arial" w:cs="Arial" w:eastAsia="Arial" w:hAnsi="Arial"/>
+                <w:b/>
+                <w:bCs/>
                 <w:color w:val="2A2620"/>
                 <w:sz w:val="18"/>
                 <w:szCs w:val="18"/>
@@ -1703,7 +2499,7 @@
         </w:tc>
         <w:tc>
           <w:tcPr>
-            <w:tcW w:type="dxa" w:w="5400"/>
+            <w:tcW w:type="dxa" w:w="5148"/>
             <w:shd w:fill="E5DDD0" w:color="auto" w:val="clear"/>
             <w:tcMar>
               <w:top w:type="dxa" w:w="90"/>
@@ -1723,7 +2519,33 @@
                 <w:sz w:val="18"/>
                 <w:szCs w:val="18"/>
               </w:rPr>
-              <w:t xml:space="preserve">Suggested alongside the page-specific footer, which was built. Partly covered by it now.</w:t>
+              <w:t xml:space="preserve">Partly covered by the page-specific footer. ChatGPT's persistent "Request a consult" button in the masthead is the related ask.</w:t>
+            </w:r>
+          </w:p>
+        </w:tc>
+        <w:tc>
+          <w:tcPr>
+            <w:tcW w:type="dxa" w:w="1685"/>
+            <w:shd w:fill="E5DDD0" w:color="auto" w:val="clear"/>
+            <w:tcMar>
+              <w:top w:type="dxa" w:w="90"/>
+              <w:left w:type="dxa" w:w="120"/>
+              <w:bottom w:type="dxa" w:w="90"/>
+              <w:right w:type="dxa" w:w="120"/>
+            </w:tcMar>
+          </w:tcPr>
+          <w:p>
+            <w:pPr>
+              <w:spacing w:after="0" w:line="264"/>
+            </w:pPr>
+            <w:r>
+              <w:rPr>
+                <w:rFonts w:ascii="Arial" w:cs="Arial" w:eastAsia="Arial" w:hAnsi="Arial"/>
+                <w:color w:val="2A2620"/>
+                <w:sz w:val="18"/>
+                <w:szCs w:val="18"/>
+              </w:rPr>
+              <w:t xml:space="preserve">M10</w:t>
             </w:r>
           </w:p>
         </w:tc>
@@ -1731,7 +2553,7 @@
       <w:tr>
         <w:tc>
           <w:tcPr>
-            <w:tcW w:type="dxa" w:w="720"/>
+            <w:tcW w:type="dxa" w:w="655"/>
             <w:tcMar>
               <w:top w:type="dxa" w:w="90"/>
               <w:left w:type="dxa" w:w="120"/>
@@ -1756,21 +2578,23 @@
         </w:tc>
         <w:tc>
           <w:tcPr>
-            <w:tcW w:type="dxa" w:w="3240"/>
-            <w:tcMar>
-              <w:top w:type="dxa" w:w="90"/>
-              <w:left w:type="dxa" w:w="120"/>
-              <w:bottom w:type="dxa" w:w="90"/>
-              <w:right w:type="dxa" w:w="120"/>
-            </w:tcMar>
-          </w:tcPr>
-          <w:p>
-            <w:pPr>
-              <w:spacing w:after="0" w:line="264"/>
-            </w:pPr>
-            <w:r>
-              <w:rPr>
-                <w:rFonts w:ascii="Arial" w:cs="Arial" w:eastAsia="Arial" w:hAnsi="Arial"/>
+            <w:tcW w:type="dxa" w:w="1872"/>
+            <w:tcMar>
+              <w:top w:type="dxa" w:w="90"/>
+              <w:left w:type="dxa" w:w="120"/>
+              <w:bottom w:type="dxa" w:w="90"/>
+              <w:right w:type="dxa" w:w="120"/>
+            </w:tcMar>
+          </w:tcPr>
+          <w:p>
+            <w:pPr>
+              <w:spacing w:after="0" w:line="264"/>
+            </w:pPr>
+            <w:r>
+              <w:rPr>
+                <w:rFonts w:ascii="Arial" w:cs="Arial" w:eastAsia="Arial" w:hAnsi="Arial"/>
+                <w:b/>
+                <w:bCs/>
                 <w:color w:val="2A2620"/>
                 <w:sz w:val="18"/>
                 <w:szCs w:val="18"/>
@@ -1781,26 +2605,60 @@
         </w:tc>
         <w:tc>
           <w:tcPr>
-            <w:tcW w:type="dxa" w:w="5400"/>
-            <w:tcMar>
-              <w:top w:type="dxa" w:w="90"/>
-              <w:left w:type="dxa" w:w="120"/>
-              <w:bottom w:type="dxa" w:w="90"/>
-              <w:right w:type="dxa" w:w="120"/>
-            </w:tcMar>
-          </w:tcPr>
-          <w:p>
-            <w:pPr>
-              <w:spacing w:after="0" w:line="264"/>
-            </w:pPr>
-            <w:r>
-              <w:rPr>
-                <w:rFonts w:ascii="Arial" w:cs="Arial" w:eastAsia="Arial" w:hAnsi="Arial"/>
-                <w:color w:val="2A2620"/>
-                <w:sz w:val="18"/>
-                <w:szCs w:val="18"/>
-              </w:rPr>
-              <w:t xml:space="preserve">Claude outputs/finding-balance-page-review.xlsx predates roughly thirty changes. Regenerable from the build.</w:t>
+            <w:tcW w:type="dxa" w:w="5148"/>
+            <w:tcMar>
+              <w:top w:type="dxa" w:w="90"/>
+              <w:left w:type="dxa" w:w="120"/>
+              <w:bottom w:type="dxa" w:w="90"/>
+              <w:right w:type="dxa" w:w="120"/>
+            </w:tcMar>
+          </w:tcPr>
+          <w:p>
+            <w:pPr>
+              <w:spacing w:after="0" w:line="264"/>
+            </w:pPr>
+            <w:r>
+              <w:rPr>
+                <w:rFonts w:ascii="Consolas" w:cs="Consolas" w:eastAsia="Consolas" w:hAnsi="Consolas"/>
+                <w:color w:val="2A2620"/>
+                <w:sz w:val="18"/>
+                <w:szCs w:val="18"/>
+              </w:rPr>
+              <w:t xml:space="preserve">Claude outputs/finding-balance-page-review.xlsx</w:t>
+            </w:r>
+            <w:r>
+              <w:rPr>
+                <w:rFonts w:ascii="Arial" w:cs="Arial" w:eastAsia="Arial" w:hAnsi="Arial"/>
+                <w:color w:val="2A2620"/>
+                <w:sz w:val="18"/>
+                <w:szCs w:val="18"/>
+              </w:rPr>
+              <w:t xml:space="preserve"> is from 01:20 today, before all of today's changes. Regenerable from the build.</w:t>
+            </w:r>
+          </w:p>
+        </w:tc>
+        <w:tc>
+          <w:tcPr>
+            <w:tcW w:type="dxa" w:w="1685"/>
+            <w:tcMar>
+              <w:top w:type="dxa" w:w="90"/>
+              <w:left w:type="dxa" w:w="120"/>
+              <w:bottom w:type="dxa" w:w="90"/>
+              <w:right w:type="dxa" w:w="120"/>
+            </w:tcMar>
+          </w:tcPr>
+          <w:p>
+            <w:pPr>
+              <w:spacing w:after="0" w:line="264"/>
+            </w:pPr>
+            <w:r>
+              <w:rPr>
+                <w:rFonts w:ascii="Arial" w:cs="Arial" w:eastAsia="Arial" w:hAnsi="Arial"/>
+                <w:color w:val="2A2620"/>
+                <w:sz w:val="18"/>
+                <w:szCs w:val="18"/>
+              </w:rPr>
+              <w:t xml:space="preserve">not in the plan</w:t>
             </w:r>
           </w:p>
         </w:tc>
@@ -1808,7 +2666,7 @@
       <w:tr>
         <w:tc>
           <w:tcPr>
-            <w:tcW w:type="dxa" w:w="720"/>
+            <w:tcW w:type="dxa" w:w="655"/>
             <w:shd w:fill="E5DDD0" w:color="auto" w:val="clear"/>
             <w:tcMar>
               <w:top w:type="dxa" w:w="90"/>
@@ -1834,7 +2692,7 @@
         </w:tc>
         <w:tc>
           <w:tcPr>
-            <w:tcW w:type="dxa" w:w="3240"/>
+            <w:tcW w:type="dxa" w:w="1872"/>
             <w:shd w:fill="E5DDD0" w:color="auto" w:val="clear"/>
             <w:tcMar>
               <w:top w:type="dxa" w:w="90"/>
@@ -1850,17 +2708,19 @@
             <w:r>
               <w:rPr>
                 <w:rFonts w:ascii="Arial" w:cs="Arial" w:eastAsia="Arial" w:hAnsi="Arial"/>
-                <w:color w:val="2A2620"/>
-                <w:sz w:val="18"/>
-                <w:szCs w:val="18"/>
-              </w:rPr>
-              <w:t xml:space="preserve">"Four" is load-bearing on seven pages</w:t>
-            </w:r>
-          </w:p>
-        </w:tc>
-        <w:tc>
-          <w:tcPr>
-            <w:tcW w:type="dxa" w:w="5400"/>
+                <w:b/>
+                <w:bCs/>
+                <w:color w:val="2A2620"/>
+                <w:sz w:val="18"/>
+                <w:szCs w:val="18"/>
+              </w:rPr>
+              <w:t xml:space="preserve">"Four" is load-bearing</w:t>
+            </w:r>
+          </w:p>
+        </w:tc>
+        <w:tc>
+          <w:tcPr>
+            <w:tcW w:type="dxa" w:w="5148"/>
             <w:shd w:fill="E5DDD0" w:color="auto" w:val="clear"/>
             <w:tcMar>
               <w:top w:type="dxa" w:w="90"/>
@@ -1880,7 +2740,33 @@
                 <w:sz w:val="18"/>
                 <w:szCs w:val="18"/>
               </w:rPr>
-              <w:t xml:space="preserve">Four ways with therapists, four ways with clients, four methods twice, four stages of licensure, four reader types, four credibility cards. Worth breaking one on purpose.</w:t>
+              <w:t xml:space="preserve">Sixteen "four ways / four methods / four providers / all four" phrases in source. The two parallel "four ways" headings on the home page are the ones ChatGPT flagged; W4 renames the client one.</w:t>
+            </w:r>
+          </w:p>
+        </w:tc>
+        <w:tc>
+          <w:tcPr>
+            <w:tcW w:type="dxa" w:w="1685"/>
+            <w:shd w:fill="E5DDD0" w:color="auto" w:val="clear"/>
+            <w:tcMar>
+              <w:top w:type="dxa" w:w="90"/>
+              <w:left w:type="dxa" w:w="120"/>
+              <w:bottom w:type="dxa" w:w="90"/>
+              <w:right w:type="dxa" w:w="120"/>
+            </w:tcMar>
+          </w:tcPr>
+          <w:p>
+            <w:pPr>
+              <w:spacing w:after="0" w:line="264"/>
+            </w:pPr>
+            <w:r>
+              <w:rPr>
+                <w:rFonts w:ascii="Arial" w:cs="Arial" w:eastAsia="Arial" w:hAnsi="Arial"/>
+                <w:color w:val="2A2620"/>
+                <w:sz w:val="18"/>
+                <w:szCs w:val="18"/>
+              </w:rPr>
+              <w:t xml:space="preserve">W4</w:t>
             </w:r>
           </w:p>
         </w:tc>
@@ -1888,7 +2774,7 @@
       <w:tr>
         <w:tc>
           <w:tcPr>
-            <w:tcW w:type="dxa" w:w="720"/>
+            <w:tcW w:type="dxa" w:w="655"/>
             <w:tcMar>
               <w:top w:type="dxa" w:w="90"/>
               <w:left w:type="dxa" w:w="120"/>
@@ -1913,51 +2799,204 @@
         </w:tc>
         <w:tc>
           <w:tcPr>
-            <w:tcW w:type="dxa" w:w="3240"/>
-            <w:tcMar>
-              <w:top w:type="dxa" w:w="90"/>
-              <w:left w:type="dxa" w:w="120"/>
-              <w:bottom w:type="dxa" w:w="90"/>
-              <w:right w:type="dxa" w:w="120"/>
-            </w:tcMar>
-          </w:tcPr>
-          <w:p>
-            <w:pPr>
-              <w:spacing w:after="0" w:line="264"/>
-            </w:pPr>
-            <w:r>
-              <w:rPr>
-                <w:rFonts w:ascii="Arial" w:cs="Arial" w:eastAsia="Arial" w:hAnsi="Arial"/>
-                <w:color w:val="2A2620"/>
-                <w:sz w:val="18"/>
-                <w:szCs w:val="18"/>
-              </w:rPr>
-              <w:t xml:space="preserve">dist/ is tracked in git</w:t>
-            </w:r>
-          </w:p>
-        </w:tc>
-        <w:tc>
-          <w:tcPr>
-            <w:tcW w:type="dxa" w:w="5400"/>
-            <w:tcMar>
-              <w:top w:type="dxa" w:w="90"/>
-              <w:left w:type="dxa" w:w="120"/>
-              <w:bottom w:type="dxa" w:w="90"/>
-              <w:right w:type="dxa" w:w="120"/>
-            </w:tcMar>
-          </w:tcPr>
-          <w:p>
-            <w:pPr>
-              <w:spacing w:after="0" w:line="264"/>
-            </w:pPr>
-            <w:r>
-              <w:rPr>
-                <w:rFonts w:ascii="Arial" w:cs="Arial" w:eastAsia="Arial" w:hAnsi="Arial"/>
-                <w:color w:val="2A2620"/>
-                <w:sz w:val="18"/>
-                <w:szCs w:val="18"/>
-              </w:rPr>
-              <w:t xml:space="preserve">85 files. Every CSS change rewrites the cache-busting hash in each page, so a one-line edit shows as a 40-file diff. Cloudflare rebuilds from source, so it need not be tracked. core.filemode is also true, which adds permission-only churn on Windows.</w:t>
+            <w:tcW w:type="dxa" w:w="1872"/>
+            <w:tcMar>
+              <w:top w:type="dxa" w:w="90"/>
+              <w:left w:type="dxa" w:w="120"/>
+              <w:bottom w:type="dxa" w:w="90"/>
+              <w:right w:type="dxa" w:w="120"/>
+            </w:tcMar>
+          </w:tcPr>
+          <w:p>
+            <w:pPr>
+              <w:spacing w:after="0" w:line="264"/>
+            </w:pPr>
+            <w:r>
+              <w:rPr>
+                <w:rFonts w:ascii="Arial" w:cs="Arial" w:eastAsia="Arial" w:hAnsi="Arial"/>
+                <w:b/>
+                <w:bCs/>
+                <w:color w:val="2A2620"/>
+                <w:sz w:val="18"/>
+                <w:szCs w:val="18"/>
+              </w:rPr>
+              <w:t xml:space="preserve">`dist/` is tracked in git, and `core.filemode` is `true`</w:t>
+            </w:r>
+          </w:p>
+        </w:tc>
+        <w:tc>
+          <w:tcPr>
+            <w:tcW w:type="dxa" w:w="5148"/>
+            <w:tcMar>
+              <w:top w:type="dxa" w:w="90"/>
+              <w:left w:type="dxa" w:w="120"/>
+              <w:bottom w:type="dxa" w:w="90"/>
+              <w:right w:type="dxa" w:w="120"/>
+            </w:tcMar>
+          </w:tcPr>
+          <w:p>
+            <w:pPr>
+              <w:spacing w:after="0" w:line="264"/>
+            </w:pPr>
+            <w:r>
+              <w:rPr>
+                <w:rFonts w:ascii="Arial" w:cs="Arial" w:eastAsia="Arial" w:hAnsi="Arial"/>
+                <w:color w:val="2A2620"/>
+                <w:sz w:val="18"/>
+                <w:szCs w:val="18"/>
+              </w:rPr>
+              <w:t xml:space="preserve">85 tracked files in </w:t>
+            </w:r>
+            <w:r>
+              <w:rPr>
+                <w:rFonts w:ascii="Consolas" w:cs="Consolas" w:eastAsia="Consolas" w:hAnsi="Consolas"/>
+                <w:color w:val="2A2620"/>
+                <w:sz w:val="18"/>
+                <w:szCs w:val="18"/>
+              </w:rPr>
+              <w:t xml:space="preserve">dist/</w:t>
+            </w:r>
+            <w:r>
+              <w:rPr>
+                <w:rFonts w:ascii="Arial" w:cs="Arial" w:eastAsia="Arial" w:hAnsi="Arial"/>
+                <w:color w:val="2A2620"/>
+                <w:sz w:val="18"/>
+                <w:szCs w:val="18"/>
+              </w:rPr>
+              <w:t xml:space="preserve">, and </w:t>
+            </w:r>
+            <w:r>
+              <w:rPr>
+                <w:rFonts w:ascii="Consolas" w:cs="Consolas" w:eastAsia="Consolas" w:hAnsi="Consolas"/>
+                <w:color w:val="2A2620"/>
+                <w:sz w:val="18"/>
+                <w:szCs w:val="18"/>
+              </w:rPr>
+              <w:t xml:space="preserve">git status</w:t>
+            </w:r>
+            <w:r>
+              <w:rPr>
+                <w:rFonts w:ascii="Arial" w:cs="Arial" w:eastAsia="Arial" w:hAnsi="Arial"/>
+                <w:color w:val="2A2620"/>
+                <w:sz w:val="18"/>
+                <w:szCs w:val="18"/>
+              </w:rPr>
+              <w:t xml:space="preserve"> today shows 225 mode-only changes (100644 to 100755) against 19 files with real edits, so the signal is buried. </w:t>
+            </w:r>
+            <w:r>
+              <w:rPr>
+                <w:rFonts w:ascii="Consolas" w:cs="Consolas" w:eastAsia="Consolas" w:hAnsi="Consolas"/>
+                <w:color w:val="2A2620"/>
+                <w:sz w:val="18"/>
+                <w:szCs w:val="18"/>
+              </w:rPr>
+              <w:t xml:space="preserve">git config core.filemode false</w:t>
+            </w:r>
+            <w:r>
+              <w:rPr>
+                <w:rFonts w:ascii="Arial" w:cs="Arial" w:eastAsia="Arial" w:hAnsi="Arial"/>
+                <w:color w:val="2A2620"/>
+                <w:sz w:val="18"/>
+                <w:szCs w:val="18"/>
+              </w:rPr>
+              <w:t xml:space="preserve"> and untracking </w:t>
+            </w:r>
+            <w:r>
+              <w:rPr>
+                <w:rFonts w:ascii="Consolas" w:cs="Consolas" w:eastAsia="Consolas" w:hAnsi="Consolas"/>
+                <w:color w:val="2A2620"/>
+                <w:sz w:val="18"/>
+                <w:szCs w:val="18"/>
+              </w:rPr>
+              <w:t xml:space="preserve">dist/</w:t>
+            </w:r>
+            <w:r>
+              <w:rPr>
+                <w:rFonts w:ascii="Arial" w:cs="Arial" w:eastAsia="Arial" w:hAnsi="Arial"/>
+                <w:color w:val="2A2620"/>
+                <w:sz w:val="18"/>
+                <w:szCs w:val="18"/>
+              </w:rPr>
+              <w:t xml:space="preserve"> would fix both. Also new today: </w:t>
+            </w:r>
+            <w:r>
+              <w:rPr>
+                <w:rFonts w:ascii="Consolas" w:cs="Consolas" w:eastAsia="Consolas" w:hAnsi="Consolas"/>
+                <w:color w:val="2A2620"/>
+                <w:sz w:val="18"/>
+                <w:szCs w:val="18"/>
+              </w:rPr>
+              <w:t xml:space="preserve">scripts/build.mjs</w:t>
+            </w:r>
+            <w:r>
+              <w:rPr>
+                <w:rFonts w:ascii="Arial" w:cs="Arial" w:eastAsia="Arial" w:hAnsi="Arial"/>
+                <w:color w:val="2A2620"/>
+                <w:sz w:val="18"/>
+                <w:szCs w:val="18"/>
+              </w:rPr>
+              <w:t xml:space="preserve"> now empties </w:t>
+            </w:r>
+            <w:r>
+              <w:rPr>
+                <w:rFonts w:ascii="Consolas" w:cs="Consolas" w:eastAsia="Consolas" w:hAnsi="Consolas"/>
+                <w:color w:val="2A2620"/>
+                <w:sz w:val="18"/>
+                <w:szCs w:val="18"/>
+              </w:rPr>
+              <w:t xml:space="preserve">dist/</w:t>
+            </w:r>
+            <w:r>
+              <w:rPr>
+                <w:rFonts w:ascii="Arial" w:cs="Arial" w:eastAsia="Arial" w:hAnsi="Arial"/>
+                <w:color w:val="2A2620"/>
+                <w:sz w:val="18"/>
+                <w:szCs w:val="18"/>
+              </w:rPr>
+              <w:t xml:space="preserve"> rather than removing it, because a process on Windows holding the folder open made </w:t>
+            </w:r>
+            <w:r>
+              <w:rPr>
+                <w:rFonts w:ascii="Consolas" w:cs="Consolas" w:eastAsia="Consolas" w:hAnsi="Consolas"/>
+                <w:color w:val="2A2620"/>
+                <w:sz w:val="18"/>
+                <w:szCs w:val="18"/>
+              </w:rPr>
+              <w:t xml:space="preserve">rmdir</w:t>
+            </w:r>
+            <w:r>
+              <w:rPr>
+                <w:rFonts w:ascii="Arial" w:cs="Arial" w:eastAsia="Arial" w:hAnsi="Arial"/>
+                <w:color w:val="2A2620"/>
+                <w:sz w:val="18"/>
+                <w:szCs w:val="18"/>
+              </w:rPr>
+              <w:t xml:space="preserve"> fail.</w:t>
+            </w:r>
+          </w:p>
+        </w:tc>
+        <w:tc>
+          <w:tcPr>
+            <w:tcW w:type="dxa" w:w="1685"/>
+            <w:tcMar>
+              <w:top w:type="dxa" w:w="90"/>
+              <w:left w:type="dxa" w:w="120"/>
+              <w:bottom w:type="dxa" w:w="90"/>
+              <w:right w:type="dxa" w:w="120"/>
+            </w:tcMar>
+          </w:tcPr>
+          <w:p>
+            <w:pPr>
+              <w:spacing w:after="0" w:line="264"/>
+            </w:pPr>
+            <w:r>
+              <w:rPr>
+                <w:rFonts w:ascii="Arial" w:cs="Arial" w:eastAsia="Arial" w:hAnsi="Arial"/>
+                <w:color w:val="2A2620"/>
+                <w:sz w:val="18"/>
+                <w:szCs w:val="18"/>
+              </w:rPr>
+              <w:t xml:space="preserve">not in the plan</w:t>
             </w:r>
           </w:p>
         </w:tc>
@@ -1965,7 +3004,7 @@
       <w:tr>
         <w:tc>
           <w:tcPr>
-            <w:tcW w:type="dxa" w:w="720"/>
+            <w:tcW w:type="dxa" w:w="655"/>
             <w:shd w:fill="E5DDD0" w:color="auto" w:val="clear"/>
             <w:tcMar>
               <w:top w:type="dxa" w:w="90"/>
@@ -1991,7 +3030,7 @@
         </w:tc>
         <w:tc>
           <w:tcPr>
-            <w:tcW w:type="dxa" w:w="3240"/>
+            <w:tcW w:type="dxa" w:w="1872"/>
             <w:shd w:fill="E5DDD0" w:color="auto" w:val="clear"/>
             <w:tcMar>
               <w:top w:type="dxa" w:w="90"/>
@@ -2007,6 +3046,8 @@
             <w:r>
               <w:rPr>
                 <w:rFonts w:ascii="Arial" w:cs="Arial" w:eastAsia="Arial" w:hAnsi="Arial"/>
+                <w:b/>
+                <w:bCs/>
                 <w:color w:val="2A2620"/>
                 <w:sz w:val="18"/>
                 <w:szCs w:val="18"/>
@@ -2017,7 +3058,7 @@
         </w:tc>
         <w:tc>
           <w:tcPr>
-            <w:tcW w:type="dxa" w:w="5400"/>
+            <w:tcW w:type="dxa" w:w="5148"/>
             <w:shd w:fill="E5DDD0" w:color="auto" w:val="clear"/>
             <w:tcMar>
               <w:top w:type="dxa" w:w="90"/>
@@ -2037,7 +3078,33 @@
                 <w:sz w:val="18"/>
                 <w:szCs w:val="18"/>
               </w:rPr>
-              <w:t xml:space="preserve">The 2px dash is now 3px, which fixed 125% zoom (21.5% to 6.2% weight variation) but not 110% (about 13%). A 4px bar measured best overall if it still shows at your zoom level.</w:t>
+              <w:t xml:space="preserve">Still 3px. A 4px bar measured best overall.</w:t>
+            </w:r>
+          </w:p>
+        </w:tc>
+        <w:tc>
+          <w:tcPr>
+            <w:tcW w:type="dxa" w:w="1685"/>
+            <w:shd w:fill="E5DDD0" w:color="auto" w:val="clear"/>
+            <w:tcMar>
+              <w:top w:type="dxa" w:w="90"/>
+              <w:left w:type="dxa" w:w="120"/>
+              <w:bottom w:type="dxa" w:w="90"/>
+              <w:right w:type="dxa" w:w="120"/>
+            </w:tcMar>
+          </w:tcPr>
+          <w:p>
+            <w:pPr>
+              <w:spacing w:after="0" w:line="264"/>
+            </w:pPr>
+            <w:r>
+              <w:rPr>
+                <w:rFonts w:ascii="Arial" w:cs="Arial" w:eastAsia="Arial" w:hAnsi="Arial"/>
+                <w:color w:val="2A2620"/>
+                <w:sz w:val="18"/>
+                <w:szCs w:val="18"/>
+              </w:rPr>
+              <w:t xml:space="preserve">not in the plan</w:t>
             </w:r>
           </w:p>
         </w:tc>
@@ -2045,7 +3112,7 @@
       <w:tr>
         <w:tc>
           <w:tcPr>
-            <w:tcW w:type="dxa" w:w="720"/>
+            <w:tcW w:type="dxa" w:w="655"/>
             <w:tcMar>
               <w:top w:type="dxa" w:w="90"/>
               <w:left w:type="dxa" w:w="120"/>
@@ -2070,21 +3137,23 @@
         </w:tc>
         <w:tc>
           <w:tcPr>
-            <w:tcW w:type="dxa" w:w="3240"/>
-            <w:tcMar>
-              <w:top w:type="dxa" w:w="90"/>
-              <w:left w:type="dxa" w:w="120"/>
-              <w:bottom w:type="dxa" w:w="90"/>
-              <w:right w:type="dxa" w:w="120"/>
-            </w:tcMar>
-          </w:tcPr>
-          <w:p>
-            <w:pPr>
-              <w:spacing w:after="0" w:line="264"/>
-            </w:pPr>
-            <w:r>
-              <w:rPr>
-                <w:rFonts w:ascii="Arial" w:cs="Arial" w:eastAsia="Arial" w:hAnsi="Arial"/>
+            <w:tcW w:type="dxa" w:w="1872"/>
+            <w:tcMar>
+              <w:top w:type="dxa" w:w="90"/>
+              <w:left w:type="dxa" w:w="120"/>
+              <w:bottom w:type="dxa" w:w="90"/>
+              <w:right w:type="dxa" w:w="120"/>
+            </w:tcMar>
+          </w:tcPr>
+          <w:p>
+            <w:pPr>
+              <w:spacing w:after="0" w:line="264"/>
+            </w:pPr>
+            <w:r>
+              <w:rPr>
+                <w:rFonts w:ascii="Arial" w:cs="Arial" w:eastAsia="Arial" w:hAnsi="Arial"/>
+                <w:b/>
+                <w:bCs/>
                 <w:color w:val="2A2620"/>
                 <w:sz w:val="18"/>
                 <w:szCs w:val="18"/>
@@ -2095,26 +3164,78 @@
         </w:tc>
         <w:tc>
           <w:tcPr>
-            <w:tcW w:type="dxa" w:w="5400"/>
-            <w:tcMar>
-              <w:top w:type="dxa" w:w="90"/>
-              <w:left w:type="dxa" w:w="120"/>
-              <w:bottom w:type="dxa" w:w="90"/>
-              <w:right w:type="dxa" w:w="120"/>
-            </w:tcMar>
-          </w:tcPr>
-          <w:p>
-            <w:pPr>
-              <w:spacing w:after="0" w:line="264"/>
-            </w:pPr>
-            <w:r>
-              <w:rPr>
-                <w:rFonts w:ascii="Arial" w:cs="Arial" w:eastAsia="Arial" w:hAnsi="Arial"/>
-                <w:color w:val="2A2620"/>
-                <w:sz w:val="18"/>
-                <w:szCs w:val="18"/>
-              </w:rPr>
-              <w:t xml:space="preserve">Squiggle handwriting, blank book spines. Invisible at 450px. One-line swap if Reem ever shoots her own desk.</w:t>
+            <w:tcW w:type="dxa" w:w="5148"/>
+            <w:tcMar>
+              <w:top w:type="dxa" w:w="90"/>
+              <w:left w:type="dxa" w:w="120"/>
+              <w:bottom w:type="dxa" w:w="90"/>
+              <w:right w:type="dxa" w:w="120"/>
+            </w:tcMar>
+          </w:tcPr>
+          <w:p>
+            <w:pPr>
+              <w:spacing w:after="0" w:line="264"/>
+            </w:pPr>
+            <w:r>
+              <w:rPr>
+                <w:rFonts w:ascii="Consolas" w:cs="Consolas" w:eastAsia="Consolas" w:hAnsi="Consolas"/>
+                <w:color w:val="2A2620"/>
+                <w:sz w:val="18"/>
+                <w:szCs w:val="18"/>
+              </w:rPr>
+              <w:t xml:space="preserve">supervision-desk.jpg</w:t>
+            </w:r>
+            <w:r>
+              <w:rPr>
+                <w:rFonts w:ascii="Arial" w:cs="Arial" w:eastAsia="Arial" w:hAnsi="Arial"/>
+                <w:color w:val="2A2620"/>
+                <w:sz w:val="18"/>
+                <w:szCs w:val="18"/>
+              </w:rPr>
+              <w:t xml:space="preserve"> and </w:t>
+            </w:r>
+            <w:r>
+              <w:rPr>
+                <w:rFonts w:ascii="Consolas" w:cs="Consolas" w:eastAsia="Consolas" w:hAnsi="Consolas"/>
+                <w:color w:val="2A2620"/>
+                <w:sz w:val="18"/>
+                <w:szCs w:val="18"/>
+              </w:rPr>
+              <w:t xml:space="preserve">consultation-desk.jpg</w:t>
+            </w:r>
+            <w:r>
+              <w:rPr>
+                <w:rFonts w:ascii="Arial" w:cs="Arial" w:eastAsia="Arial" w:hAnsi="Arial"/>
+                <w:color w:val="2A2620"/>
+                <w:sz w:val="18"/>
+                <w:szCs w:val="18"/>
+              </w:rPr>
+              <w:t xml:space="preserve"> still in use. Claude's review noticed independently. The photo shoot replaces both.</w:t>
+            </w:r>
+          </w:p>
+        </w:tc>
+        <w:tc>
+          <w:tcPr>
+            <w:tcW w:type="dxa" w:w="1685"/>
+            <w:tcMar>
+              <w:top w:type="dxa" w:w="90"/>
+              <w:left w:type="dxa" w:w="120"/>
+              <w:bottom w:type="dxa" w:w="90"/>
+              <w:right w:type="dxa" w:w="120"/>
+            </w:tcMar>
+          </w:tcPr>
+          <w:p>
+            <w:pPr>
+              <w:spacing w:after="0" w:line="264"/>
+            </w:pPr>
+            <w:r>
+              <w:rPr>
+                <w:rFonts w:ascii="Arial" w:cs="Arial" w:eastAsia="Arial" w:hAnsi="Arial"/>
+                <w:color w:val="2A2620"/>
+                <w:sz w:val="18"/>
+                <w:szCs w:val="18"/>
+              </w:rPr>
+              <w:t xml:space="preserve">M2</w:t>
             </w:r>
           </w:p>
         </w:tc>
@@ -2122,8 +3243,13 @@
     </w:tbl>
     <w:p>
       <w:pPr>
-        <w:pStyle w:val="Heading1"/>
-        <w:spacing w:after="140" w:before="320"/>
+        <w:spacing w:after="120"/>
+      </w:pPr>
+    </w:p>
+    <w:p>
+      <w:pPr>
+        <w:pStyle w:val="Heading2"/>
+        <w:spacing w:after="100" w:before="240"/>
       </w:pPr>
       <w:r>
         <w:rPr>
@@ -2131,166 +3257,10 @@
           <w:b/>
           <w:bCs/>
           <w:color w:val="2A2620"/>
-          <w:sz w:val="32"/>
-          <w:szCs w:val="32"/>
-        </w:rPr>
-        <w:t xml:space="preserve">D.  Decisions already taken, worth a second look at launch</w:t>
-      </w:r>
-    </w:p>
-    <w:p>
-      <w:pPr>
-        <w:spacing w:after="60" w:before="180" w:line="276"/>
-      </w:pPr>
-      <w:r>
-        <w:rPr>
-          <w:rFonts w:ascii="Arial" w:cs="Arial" w:eastAsia="Arial" w:hAnsi="Arial"/>
-          <w:b/>
-          <w:bCs/>
-          <w:color w:val="2A2620"/>
-          <w:sz w:val="20"/>
-          <w:szCs w:val="20"/>
-        </w:rPr>
-        <w:t xml:space="preserve">D1.  The home page leads with supervision.</w:t>
-      </w:r>
-    </w:p>
-    <w:p>
-      <w:pPr>
-        <w:spacing w:after="120" w:before="0" w:line="276"/>
-      </w:pPr>
-      <w:r>
-        <w:rPr>
-          <w:rFonts w:ascii="Arial" w:cs="Arial" w:eastAsia="Arial" w:hAnsi="Arial"/>
-          <w:color w:val="2A2620"/>
-          <w:sz w:val="20"/>
-          <w:szCs w:val="20"/>
-        </w:rPr>
-        <w:t xml:space="preserve">Settled deliberately in seo-aeo-positioning-2026-10: supervision leads for search. The page now forks into two tracks under a line saying what they share, so a therapy client is no longer served by an aside.</w:t>
-      </w:r>
-    </w:p>
-    <w:p>
-      <w:pPr>
-        <w:spacing w:after="60" w:before="180" w:line="276"/>
-      </w:pPr>
-      <w:r>
-        <w:rPr>
-          <w:rFonts w:ascii="Arial" w:cs="Arial" w:eastAsia="Arial" w:hAnsi="Arial"/>
-          <w:b/>
-          <w:bCs/>
-          <w:color w:val="2A2620"/>
-          <w:sz w:val="20"/>
-          <w:szCs w:val="20"/>
-        </w:rPr>
-        <w:t xml:space="preserve">D2.  No local entity.</w:t>
-      </w:r>
-    </w:p>
-    <w:p>
-      <w:pPr>
-        <w:spacing w:after="120" w:before="0" w:line="276"/>
-      </w:pPr>
-      <w:r>
-        <w:rPr>
-          <w:rFonts w:ascii="Arial" w:cs="Arial" w:eastAsia="Arial" w:hAnsi="Arial"/>
-          <w:color w:val="2A2620"/>
-          <w:sz w:val="20"/>
-          <w:szCs w:val="20"/>
-        </w:rPr>
-        <w:t xml:space="preserve">No streetAddress, no geo, no opening hours, no Google Business Profile. "therapist cedar park" is 90 searches a month at difficulty 13 with a $14.69 CPC, and the CPC is the tell that the traffic converts. If the practice is deliberately online-only with no public office, the fix is not to add an address but to drop MedicalBusiness for service-area markup and compete for "online therapy texas" (590 a month) instead. Reem’s call, not a bug.</w:t>
-      </w:r>
-    </w:p>
-    <w:p>
-      <w:pPr>
-        <w:spacing w:after="60" w:before="180" w:line="276"/>
-      </w:pPr>
-      <w:r>
-        <w:rPr>
-          <w:rFonts w:ascii="Arial" w:cs="Arial" w:eastAsia="Arial" w:hAnsi="Arial"/>
-          <w:b/>
-          <w:bCs/>
-          <w:color w:val="2A2620"/>
-          <w:sz w:val="20"/>
-          <w:szCs w:val="20"/>
-        </w:rPr>
-        <w:t xml:space="preserve">D3.  /fees/ 301s to /faq/.</w:t>
-      </w:r>
-    </w:p>
-    <w:p>
-      <w:pPr>
-        <w:spacing w:after="120" w:before="0" w:line="276"/>
-      </w:pPr>
-      <w:r>
-        <w:rPr>
-          <w:rFonts w:ascii="Arial" w:cs="Arial" w:eastAsia="Arial" w:hAnsi="Arial"/>
-          <w:color w:val="2A2620"/>
-          <w:sz w:val="20"/>
-          <w:szCs w:val="20"/>
-        </w:rPr>
-        <w:t xml:space="preserve">One fewer URL targeting cost queries, but the topic is no longer split. Low risk: the old fees page only ever reached #76 for "sliding scale therapy austin".</w:t>
-      </w:r>
-    </w:p>
-    <w:p>
-      <w:pPr>
-        <w:spacing w:after="60" w:before="180" w:line="276"/>
-      </w:pPr>
-      <w:r>
-        <w:rPr>
-          <w:rFonts w:ascii="Arial" w:cs="Arial" w:eastAsia="Arial" w:hAnsi="Arial"/>
-          <w:b/>
-          <w:bCs/>
-          <w:color w:val="2A2620"/>
-          <w:sz w:val="20"/>
-          <w:szCs w:val="20"/>
-        </w:rPr>
-        <w:t xml:space="preserve">D4.  Visible placeholders, and when not to use them.</w:t>
-      </w:r>
-    </w:p>
-    <w:p>
-      <w:pPr>
-        <w:spacing w:after="120" w:before="0" w:line="276"/>
-      </w:pPr>
-      <w:r>
-        <w:rPr>
-          <w:rFonts w:ascii="Arial" w:cs="Arial" w:eastAsia="Arial" w:hAnsi="Arial"/>
-          <w:color w:val="2A2620"/>
-          <w:sz w:val="20"/>
-          <w:szCs w:val="20"/>
-        </w:rPr>
-        <w:t xml:space="preserve">photoSlot and the grey build notes are both visible to visitors and both listed at every build. They suit a missing artefact — a photograph, a date, a fee — because the reader understands a known thing is coming. They do not suit a missing paragraph in a sequence: a supervisee reading five steps where two say "to be confirmed" concludes the practice has not worked out its own process. B12 is that case and is tracked here rather than shown on the page. B4 and B5 are the opposite case and would be fair to mark on the page until filled.</w:t>
-      </w:r>
-    </w:p>
-    <w:p>
-      <w:r>
-        <w:br w:type="page"/>
-      </w:r>
-    </w:p>
-    <w:p>
-      <w:pPr>
-        <w:pStyle w:val="Heading1"/>
-        <w:spacing w:after="140" w:before="0"/>
-      </w:pPr>
-      <w:r>
-        <w:rPr>
-          <w:rFonts w:ascii="Arial" w:cs="Arial" w:eastAsia="Arial" w:hAnsi="Arial"/>
-          <w:b/>
-          <w:bCs/>
-          <w:color w:val="2A2620"/>
-          <w:sz w:val="32"/>
-          <w:szCs w:val="32"/>
-        </w:rPr>
-        <w:t xml:space="preserve">Closed since the 28 October sweep</w:t>
-      </w:r>
-    </w:p>
-    <w:p>
-      <w:pPr>
-        <w:spacing w:after="180" w:before="0" w:line="276"/>
-      </w:pPr>
-      <w:r>
-        <w:rPr>
-          <w:rFonts w:ascii="Arial" w:cs="Arial" w:eastAsia="Arial" w:hAnsi="Arial"/>
-          <w:color w:val="5C5346"/>
-          <w:sz w:val="20"/>
-          <w:szCs w:val="20"/>
-        </w:rPr>
-        <w:t xml:space="preserve">Verified against the current build, so nobody re-checks them.</w:t>
+          <w:sz w:val="23"/>
+          <w:szCs w:val="23"/>
+        </w:rPr>
+        <w:t xml:space="preserve">Decided today, recorded so it is not re-litigated</w:t>
       </w:r>
     </w:p>
     <w:p>
@@ -2300,7 +3270,7 @@
           <w:ilvl w:val="0"/>
           <w:numId w:val="1"/>
         </w:numPr>
-        <w:spacing w:after="110" w:line="276"/>
+        <w:spacing w:after="90" w:line="276"/>
       </w:pPr>
       <w:r>
         <w:rPr>
@@ -2311,16 +3281,160 @@
           <w:sz w:val="20"/>
           <w:szCs w:val="20"/>
         </w:rPr>
-        <w:t xml:space="preserve">A3 — the personal Gmail.</w:t>
-      </w:r>
-      <w:r>
-        <w:rPr>
-          <w:rFonts w:ascii="Arial" w:cs="Arial" w:eastAsia="Arial" w:hAnsi="Arial"/>
-          <w:color w:val="2A2620"/>
-          <w:sz w:val="20"/>
-          <w:szCs w:val="20"/>
-        </w:rPr>
-        <w:t xml:space="preserve">  emailSupervision deleted from site.js; one address site-wide, info@findingbalancecounselingpllc.com.</w:t>
+        <w:t xml:space="preserve">Hero text uses two classes by job.</w:t>
+      </w:r>
+      <w:r>
+        <w:rPr>
+          <w:rFonts w:ascii="Arial" w:cs="Arial" w:eastAsia="Arial" w:hAnsi="Arial"/>
+          <w:color w:val="2A2620"/>
+          <w:sz w:val="20"/>
+          <w:szCs w:val="20"/>
+        </w:rPr>
+        <w:t xml:space="preserve"> </w:t>
+      </w:r>
+      <w:r>
+        <w:rPr>
+          <w:rFonts w:ascii="Consolas" w:cs="Consolas" w:eastAsia="Consolas" w:hAnsi="Consolas"/>
+          <w:color w:val="2A2620"/>
+          <w:sz w:val="20"/>
+          <w:szCs w:val="20"/>
+        </w:rPr>
+        <w:t xml:space="preserve">.answer</w:t>
+      </w:r>
+      <w:r>
+        <w:rPr>
+          <w:rFonts w:ascii="Arial" w:cs="Arial" w:eastAsia="Arial" w:hAnsi="Arial"/>
+          <w:color w:val="2A2620"/>
+          <w:sz w:val="20"/>
+          <w:szCs w:val="20"/>
+        </w:rPr>
+        <w:t xml:space="preserve"> for the fact-stating paragraph an assistant can quote (body size, 48rem, once per page; 31 pages). </w:t>
+      </w:r>
+      <w:r>
+        <w:rPr>
+          <w:rFonts w:ascii="Consolas" w:cs="Consolas" w:eastAsia="Consolas" w:hAnsi="Consolas"/>
+          <w:color w:val="2A2620"/>
+          <w:sz w:val="20"/>
+          <w:szCs w:val="20"/>
+        </w:rPr>
+        <w:t xml:space="preserve">.hero-lede</w:t>
+      </w:r>
+      <w:r>
+        <w:rPr>
+          <w:rFonts w:ascii="Arial" w:cs="Arial" w:eastAsia="Arial" w:hAnsi="Arial"/>
+          <w:color w:val="2A2620"/>
+          <w:sz w:val="20"/>
+          <w:szCs w:val="20"/>
+        </w:rPr>
+        <w:t xml:space="preserve"> for a line spoken to the reader (larger than body, same 48rem; the four hubs plus </w:t>
+      </w:r>
+      <w:r>
+        <w:rPr>
+          <w:rFonts w:ascii="Consolas" w:cs="Consolas" w:eastAsia="Consolas" w:hAnsi="Consolas"/>
+          <w:color w:val="2A2620"/>
+          <w:sz w:val="20"/>
+          <w:szCs w:val="20"/>
+        </w:rPr>
+        <w:t xml:space="preserve">/approach/</w:t>
+      </w:r>
+      <w:r>
+        <w:rPr>
+          <w:rFonts w:ascii="Arial" w:cs="Arial" w:eastAsia="Arial" w:hAnsi="Arial"/>
+          <w:color w:val="2A2620"/>
+          <w:sz w:val="20"/>
+          <w:szCs w:val="20"/>
+        </w:rPr>
+        <w:t xml:space="preserve">, </w:t>
+      </w:r>
+      <w:r>
+        <w:rPr>
+          <w:rFonts w:ascii="Consolas" w:cs="Consolas" w:eastAsia="Consolas" w:hAnsi="Consolas"/>
+          <w:color w:val="2A2620"/>
+          <w:sz w:val="20"/>
+          <w:szCs w:val="20"/>
+        </w:rPr>
+        <w:t xml:space="preserve">/contact/</w:t>
+      </w:r>
+      <w:r>
+        <w:rPr>
+          <w:rFonts w:ascii="Arial" w:cs="Arial" w:eastAsia="Arial" w:hAnsi="Arial"/>
+          <w:color w:val="2A2620"/>
+          <w:sz w:val="20"/>
+          <w:szCs w:val="20"/>
+        </w:rPr>
+        <w:t xml:space="preserve"> and </w:t>
+      </w:r>
+      <w:r>
+        <w:rPr>
+          <w:rFonts w:ascii="Consolas" w:cs="Consolas" w:eastAsia="Consolas" w:hAnsi="Consolas"/>
+          <w:color w:val="2A2620"/>
+          <w:sz w:val="20"/>
+          <w:szCs w:val="20"/>
+        </w:rPr>
+        <w:t xml:space="preserve">/lpc-supervision/</w:t>
+      </w:r>
+      <w:r>
+        <w:rPr>
+          <w:rFonts w:ascii="Arial" w:cs="Arial" w:eastAsia="Arial" w:hAnsi="Arial"/>
+          <w:color w:val="2A2620"/>
+          <w:sz w:val="20"/>
+          <w:szCs w:val="20"/>
+        </w:rPr>
+        <w:t xml:space="preserve">, which stack lede over facts). </w:t>
+      </w:r>
+      <w:r>
+        <w:rPr>
+          <w:rFonts w:ascii="Consolas" w:cs="Consolas" w:eastAsia="Consolas" w:hAnsi="Consolas"/>
+          <w:color w:val="2A2620"/>
+          <w:sz w:val="20"/>
+          <w:szCs w:val="20"/>
+        </w:rPr>
+        <w:t xml:space="preserve">.intro-wide</w:t>
+      </w:r>
+      <w:r>
+        <w:rPr>
+          <w:rFonts w:ascii="Arial" w:cs="Arial" w:eastAsia="Arial" w:hAnsi="Arial"/>
+          <w:color w:val="2A2620"/>
+          <w:sz w:val="20"/>
+          <w:szCs w:val="20"/>
+        </w:rPr>
+        <w:t xml:space="preserve"> never in a hero. Stated in the stylesheet. </w:t>
+      </w:r>
+      <w:r>
+        <w:rPr>
+          <w:rFonts w:ascii="Consolas" w:cs="Consolas" w:eastAsia="Consolas" w:hAnsi="Consolas"/>
+          <w:color w:val="2A2620"/>
+          <w:sz w:val="20"/>
+          <w:szCs w:val="20"/>
+        </w:rPr>
+        <w:t xml:space="preserve">.hero-summary</w:t>
+      </w:r>
+      <w:r>
+        <w:rPr>
+          <w:rFonts w:ascii="Arial" w:cs="Arial" w:eastAsia="Arial" w:hAnsi="Arial"/>
+          <w:color w:val="2A2620"/>
+          <w:sz w:val="20"/>
+          <w:szCs w:val="20"/>
+        </w:rPr>
+        <w:t xml:space="preserve"> and </w:t>
+      </w:r>
+      <w:r>
+        <w:rPr>
+          <w:rFonts w:ascii="Consolas" w:cs="Consolas" w:eastAsia="Consolas" w:hAnsi="Consolas"/>
+          <w:color w:val="2A2620"/>
+          <w:sz w:val="20"/>
+          <w:szCs w:val="20"/>
+        </w:rPr>
+        <w:t xml:space="preserve">.answer--wide</w:t>
+      </w:r>
+      <w:r>
+        <w:rPr>
+          <w:rFonts w:ascii="Arial" w:cs="Arial" w:eastAsia="Arial" w:hAnsi="Arial"/>
+          <w:color w:val="2A2620"/>
+          <w:sz w:val="20"/>
+          <w:szCs w:val="20"/>
+        </w:rPr>
+        <w:t xml:space="preserve"> are gone.</w:t>
       </w:r>
     </w:p>
     <w:p>
@@ -2330,7 +3444,7 @@
           <w:ilvl w:val="0"/>
           <w:numId w:val="1"/>
         </w:numPr>
-        <w:spacing w:after="110" w:line="276"/>
+        <w:spacing w:after="90" w:line="276"/>
       </w:pPr>
       <w:r>
         <w:rPr>
@@ -2341,16 +3455,16 @@
           <w:sz w:val="20"/>
           <w:szCs w:val="20"/>
         </w:rPr>
-        <w:t xml:space="preserve">A4 — the contradictory associate fee range.</w:t>
-      </w:r>
-      <w:r>
-        <w:rPr>
-          <w:rFonts w:ascii="Arial" w:cs="Arial" w:eastAsia="Arial" w:hAnsi="Arial"/>
-          <w:color w:val="2A2620"/>
-          <w:sz w:val="20"/>
-          <w:szCs w:val="20"/>
-        </w:rPr>
-        <w:t xml:space="preserve">  Ranges are now computed in src/_data/associateStats.js from per-associate numbers, so they cannot drift. Individual is $100 to $150. The $150 to $165 that looked stale is the couples range (Natasha $150, Sheila $165) and is correct.</w:t>
+        <w:t xml:space="preserve">About page:</w:t>
+      </w:r>
+      <w:r>
+        <w:rPr>
+          <w:rFonts w:ascii="Arial" w:cs="Arial" w:eastAsia="Arial" w:hAnsi="Arial"/>
+          <w:color w:val="2A2620"/>
+          <w:sz w:val="20"/>
+          <w:szCs w:val="20"/>
+        </w:rPr>
+        <w:t xml:space="preserve"> portrait beside the text, top-aligned, one button. New portrait file in place (621×785, 92 KB).</w:t>
       </w:r>
     </w:p>
     <w:p>
@@ -2360,7 +3474,7 @@
           <w:ilvl w:val="0"/>
           <w:numId w:val="1"/>
         </w:numPr>
-        <w:spacing w:after="110" w:line="276"/>
+        <w:spacing w:after="90" w:line="276"/>
       </w:pPr>
       <w:r>
         <w:rPr>
@@ -2371,16 +3485,234 @@
           <w:sz w:val="20"/>
           <w:szCs w:val="20"/>
         </w:rPr>
-        <w:t xml:space="preserve">A5 — the five "to be confirmed" insurance rows.</w:t>
-      </w:r>
-      <w:r>
-        <w:rPr>
-          <w:rFonts w:ascii="Arial" w:cs="Arial" w:eastAsia="Arial" w:hAnsi="Arial"/>
-          <w:color w:val="2A2620"/>
-          <w:sz w:val="20"/>
-          <w:szCs w:val="20"/>
-        </w:rPr>
-        <w:t xml:space="preserve">  All answered: in network with Reem, PPO plans, copay or coinsurance or deductible varies by plan, associates self-pay. Zero "to be confirmed" strings remain anywhere on the site.</w:t>
+        <w:t xml:space="preserve">"Placement site" row stays</w:t>
+      </w:r>
+      <w:r>
+        <w:rPr>
+          <w:rFonts w:ascii="Arial" w:cs="Arial" w:eastAsia="Arial" w:hAnsi="Arial"/>
+          <w:color w:val="2A2620"/>
+          <w:sz w:val="20"/>
+          <w:szCs w:val="20"/>
+        </w:rPr>
+        <w:t xml:space="preserve"> on the supervision facts list, reworded: it was not a duplicate of Format; the FAQ on the same page says a placement site is provided.</w:t>
+      </w:r>
+    </w:p>
+    <w:p>
+      <w:pPr>
+        <w:pBdr>
+          <w:bottom w:val="single" w:color="BFB5A5" w:sz="6" w:space="1"/>
+        </w:pBdr>
+        <w:spacing w:after="220" w:before="40"/>
+      </w:pPr>
+    </w:p>
+    <w:p>
+      <w:pPr>
+        <w:pStyle w:val="Heading1"/>
+        <w:spacing w:after="140" w:before="360"/>
+      </w:pPr>
+      <w:r>
+        <w:rPr>
+          <w:rFonts w:ascii="Arial" w:cs="Arial" w:eastAsia="Arial" w:hAnsi="Arial"/>
+          <w:b/>
+          <w:bCs/>
+          <w:color w:val="2A2620"/>
+          <w:sz w:val="30"/>
+          <w:szCs w:val="30"/>
+        </w:rPr>
+        <w:t xml:space="preserve">D. Decisions already taken, worth a second look</w:t>
+      </w:r>
+    </w:p>
+    <w:p>
+      <w:pPr>
+        <w:spacing w:after="140" w:before="0" w:line="276"/>
+      </w:pPr>
+      <w:r>
+        <w:rPr>
+          <w:rFonts w:ascii="Arial" w:cs="Arial" w:eastAsia="Arial" w:hAnsi="Arial"/>
+          <w:b/>
+          <w:bCs/>
+          <w:color w:val="2A2620"/>
+          <w:sz w:val="20"/>
+          <w:szCs w:val="20"/>
+        </w:rPr>
+        <w:t xml:space="preserve">D1. The home page leads with supervision.</w:t>
+      </w:r>
+      <w:r>
+        <w:rPr>
+          <w:rFonts w:ascii="Arial" w:cs="Arial" w:eastAsia="Arial" w:hAnsi="Arial"/>
+          <w:color w:val="2A2620"/>
+          <w:sz w:val="20"/>
+          <w:szCs w:val="20"/>
+        </w:rPr>
+        <w:t xml:space="preserve"> Settled in </w:t>
+      </w:r>
+      <w:r>
+        <w:rPr>
+          <w:rFonts w:ascii="Consolas" w:cs="Consolas" w:eastAsia="Consolas" w:hAnsi="Consolas"/>
+          <w:color w:val="2A2620"/>
+          <w:sz w:val="20"/>
+          <w:szCs w:val="20"/>
+        </w:rPr>
+        <w:t xml:space="preserve">seo-aeo-positioning-2026-10.md</w:t>
+      </w:r>
+      <w:r>
+        <w:rPr>
+          <w:rFonts w:ascii="Arial" w:cs="Arial" w:eastAsia="Arial" w:hAnsi="Arial"/>
+          <w:color w:val="2A2620"/>
+          <w:sz w:val="20"/>
+          <w:szCs w:val="20"/>
+        </w:rPr>
+        <w:t xml:space="preserve">. The fork line and buttons now sit at 712px of an 800px desktop viewport, below the fold, which both reviews named. W4 keeps the H1 and every fact in the credentials block and moves the fork directly under the H1. → W4</w:t>
+      </w:r>
+    </w:p>
+    <w:p>
+      <w:pPr>
+        <w:spacing w:after="140" w:before="0" w:line="276"/>
+      </w:pPr>
+      <w:r>
+        <w:rPr>
+          <w:rFonts w:ascii="Arial" w:cs="Arial" w:eastAsia="Arial" w:hAnsi="Arial"/>
+          <w:b/>
+          <w:bCs/>
+          <w:color w:val="2A2620"/>
+          <w:sz w:val="20"/>
+          <w:szCs w:val="20"/>
+        </w:rPr>
+        <w:t xml:space="preserve">D2. No local entity.</w:t>
+      </w:r>
+      <w:r>
+        <w:rPr>
+          <w:rFonts w:ascii="Arial" w:cs="Arial" w:eastAsia="Arial" w:hAnsi="Arial"/>
+          <w:color w:val="2A2620"/>
+          <w:sz w:val="20"/>
+          <w:szCs w:val="20"/>
+        </w:rPr>
+        <w:t xml:space="preserve"> No </w:t>
+      </w:r>
+      <w:r>
+        <w:rPr>
+          <w:rFonts w:ascii="Consolas" w:cs="Consolas" w:eastAsia="Consolas" w:hAnsi="Consolas"/>
+          <w:color w:val="2A2620"/>
+          <w:sz w:val="20"/>
+          <w:szCs w:val="20"/>
+        </w:rPr>
+        <w:t xml:space="preserve">streetAddress</w:t>
+      </w:r>
+      <w:r>
+        <w:rPr>
+          <w:rFonts w:ascii="Arial" w:cs="Arial" w:eastAsia="Arial" w:hAnsi="Arial"/>
+          <w:color w:val="2A2620"/>
+          <w:sz w:val="20"/>
+          <w:szCs w:val="20"/>
+        </w:rPr>
+        <w:t xml:space="preserve">, no </w:t>
+      </w:r>
+      <w:r>
+        <w:rPr>
+          <w:rFonts w:ascii="Consolas" w:cs="Consolas" w:eastAsia="Consolas" w:hAnsi="Consolas"/>
+          <w:color w:val="2A2620"/>
+          <w:sz w:val="20"/>
+          <w:szCs w:val="20"/>
+        </w:rPr>
+        <w:t xml:space="preserve">geo</w:t>
+      </w:r>
+      <w:r>
+        <w:rPr>
+          <w:rFonts w:ascii="Arial" w:cs="Arial" w:eastAsia="Arial" w:hAnsi="Arial"/>
+          <w:color w:val="2A2620"/>
+          <w:sz w:val="20"/>
+          <w:szCs w:val="20"/>
+        </w:rPr>
+        <w:t xml:space="preserve">, no Google Business Profile. ChatGPT found older directory listings with Cedar Park addresses and a separate domain; those need a consistency pass whatever the decision here. No address that is not a client-facing location. → W13</w:t>
+      </w:r>
+    </w:p>
+    <w:p>
+      <w:pPr>
+        <w:spacing w:after="140" w:before="0" w:line="276"/>
+      </w:pPr>
+      <w:r>
+        <w:rPr>
+          <w:rFonts w:ascii="Arial" w:cs="Arial" w:eastAsia="Arial" w:hAnsi="Arial"/>
+          <w:b/>
+          <w:bCs/>
+          <w:color w:val="2A2620"/>
+          <w:sz w:val="20"/>
+          <w:szCs w:val="20"/>
+        </w:rPr>
+        <w:t xml:space="preserve">D3. `/fees/` 301s to `/faq/`.</w:t>
+      </w:r>
+      <w:r>
+        <w:rPr>
+          <w:rFonts w:ascii="Arial" w:cs="Arial" w:eastAsia="Arial" w:hAnsi="Arial"/>
+          <w:color w:val="2A2620"/>
+          <w:sz w:val="20"/>
+          <w:szCs w:val="20"/>
+        </w:rPr>
+        <w:t xml:space="preserve"> Unchanged, low risk.</w:t>
+      </w:r>
+    </w:p>
+    <w:p>
+      <w:pPr>
+        <w:spacing w:after="140" w:before="0" w:line="276"/>
+      </w:pPr>
+      <w:r>
+        <w:rPr>
+          <w:rFonts w:ascii="Arial" w:cs="Arial" w:eastAsia="Arial" w:hAnsi="Arial"/>
+          <w:b/>
+          <w:bCs/>
+          <w:color w:val="2A2620"/>
+          <w:sz w:val="20"/>
+          <w:szCs w:val="20"/>
+        </w:rPr>
+        <w:t xml:space="preserve">D4. Visible placeholders, and when not to use them.</w:t>
+      </w:r>
+      <w:r>
+        <w:rPr>
+          <w:rFonts w:ascii="Arial" w:cs="Arial" w:eastAsia="Arial" w:hAnsi="Arial"/>
+          <w:color w:val="2A2620"/>
+          <w:sz w:val="20"/>
+          <w:szCs w:val="20"/>
+        </w:rPr>
+        <w:t xml:space="preserve"> Unchanged. B4 and B5 would be fair to mark on the page until filled; B12 would not.</w:t>
+      </w:r>
+    </w:p>
+    <w:p>
+      <w:pPr>
+        <w:pBdr>
+          <w:bottom w:val="single" w:color="BFB5A5" w:sz="6" w:space="1"/>
+        </w:pBdr>
+        <w:spacing w:after="220" w:before="40"/>
+      </w:pPr>
+    </w:p>
+    <w:p>
+      <w:pPr>
+        <w:pStyle w:val="Heading1"/>
+        <w:spacing w:after="140" w:before="360"/>
+      </w:pPr>
+      <w:r>
+        <w:rPr>
+          <w:rFonts w:ascii="Arial" w:cs="Arial" w:eastAsia="Arial" w:hAnsi="Arial"/>
+          <w:b/>
+          <w:bCs/>
+          <w:color w:val="2A2620"/>
+          <w:sz w:val="30"/>
+          <w:szCs w:val="30"/>
+        </w:rPr>
+        <w:t xml:space="preserve">Shipped today from the feedback plan</w:t>
+      </w:r>
+    </w:p>
+    <w:p>
+      <w:pPr>
+        <w:spacing w:after="140" w:before="0" w:line="276"/>
+      </w:pPr>
+      <w:r>
+        <w:rPr>
+          <w:rFonts w:ascii="Arial" w:cs="Arial" w:eastAsia="Arial" w:hAnsi="Arial"/>
+          <w:color w:val="2A2620"/>
+          <w:sz w:val="20"/>
+          <w:szCs w:val="20"/>
+        </w:rPr>
+        <w:t xml:space="preserve">Verified in the build, so nobody re-checks them. The live site gets them at the next deploy.</w:t>
       </w:r>
     </w:p>
     <w:p>
@@ -2390,7 +3722,7 @@
           <w:ilvl w:val="0"/>
           <w:numId w:val="1"/>
         </w:numPr>
-        <w:spacing w:after="110" w:line="276"/>
+        <w:spacing w:after="90" w:line="276"/>
       </w:pPr>
       <w:r>
         <w:rPr>
@@ -2401,16 +3733,52 @@
           <w:sz w:val="20"/>
           <w:szCs w:val="20"/>
         </w:rPr>
-        <w:t xml:space="preserve">A6 and B9 — the intake PDFs.</w:t>
-      </w:r>
-      <w:r>
-        <w:rPr>
-          <w:rFonts w:ascii="Arial" w:cs="Arial" w:eastAsia="Arial" w:hAnsi="Arial"/>
-          <w:color w:val="2A2620"/>
-          <w:sz w:val="20"/>
-          <w:szCs w:val="20"/>
-        </w:rPr>
-        <w:t xml:space="preserve">  All five are in src/assets/forms/ and every link on /contact/forms/ resolves. The privacy policy is an HTML page at /privacy/ rather than a PDF, which is better.</w:t>
+        <w:t xml:space="preserve">I1</w:t>
+      </w:r>
+      <w:r>
+        <w:rPr>
+          <w:rFonts w:ascii="Arial" w:cs="Arial" w:eastAsia="Arial" w:hAnsi="Arial"/>
+          <w:color w:val="2A2620"/>
+          <w:sz w:val="20"/>
+          <w:szCs w:val="20"/>
+        </w:rPr>
+        <w:t xml:space="preserve">: "same four methods" is gone from </w:t>
+      </w:r>
+      <w:r>
+        <w:rPr>
+          <w:rFonts w:ascii="Consolas" w:cs="Consolas" w:eastAsia="Consolas" w:hAnsi="Consolas"/>
+          <w:color w:val="2A2620"/>
+          <w:sz w:val="20"/>
+          <w:szCs w:val="20"/>
+        </w:rPr>
+        <w:t xml:space="preserve">/</w:t>
+      </w:r>
+      <w:r>
+        <w:rPr>
+          <w:rFonts w:ascii="Arial" w:cs="Arial" w:eastAsia="Arial" w:hAnsi="Arial"/>
+          <w:color w:val="2A2620"/>
+          <w:sz w:val="20"/>
+          <w:szCs w:val="20"/>
+        </w:rPr>
+        <w:t xml:space="preserve"> and </w:t>
+      </w:r>
+      <w:r>
+        <w:rPr>
+          <w:rFonts w:ascii="Consolas" w:cs="Consolas" w:eastAsia="Consolas" w:hAnsi="Consolas"/>
+          <w:color w:val="2A2620"/>
+          <w:sz w:val="20"/>
+          <w:szCs w:val="20"/>
+        </w:rPr>
+        <w:t xml:space="preserve">/therapy/</w:t>
+      </w:r>
+      <w:r>
+        <w:rPr>
+          <w:rFonts w:ascii="Arial" w:cs="Arial" w:eastAsia="Arial" w:hAnsi="Arial"/>
+          <w:color w:val="2A2620"/>
+          <w:sz w:val="20"/>
+          <w:szCs w:val="20"/>
+        </w:rPr>
+        <w:t xml:space="preserve">; the associates copy now says each brings their own training and is supervised by Reem, four hours a month.</w:t>
       </w:r>
     </w:p>
     <w:p>
@@ -2420,7 +3788,7 @@
           <w:ilvl w:val="0"/>
           <w:numId w:val="1"/>
         </w:numPr>
-        <w:spacing w:after="110" w:line="276"/>
+        <w:spacing w:after="90" w:line="276"/>
       </w:pPr>
       <w:r>
         <w:rPr>
@@ -2431,16 +3799,34 @@
           <w:sz w:val="20"/>
           <w:szCs w:val="20"/>
         </w:rPr>
-        <w:t xml:space="preserve">B3 — the equine fee.</w:t>
-      </w:r>
-      <w:r>
-        <w:rPr>
-          <w:rFonts w:ascii="Arial" w:cs="Arial" w:eastAsia="Arial" w:hAnsi="Arial"/>
-          <w:color w:val="2A2620"/>
-          <w:sz w:val="20"/>
-          <w:szCs w:val="20"/>
-        </w:rPr>
-        <w:t xml:space="preserve">  Client sessions read $185 to $240 for 1.5 to 2 hours; the $60 appears only in therapist contexts. No longer conflated.</w:t>
+        <w:t xml:space="preserve">I2</w:t>
+      </w:r>
+      <w:r>
+        <w:rPr>
+          <w:rFonts w:ascii="Arial" w:cs="Arial" w:eastAsia="Arial" w:hAnsi="Arial"/>
+          <w:color w:val="2A2620"/>
+          <w:sz w:val="20"/>
+          <w:szCs w:val="20"/>
+        </w:rPr>
+        <w:t xml:space="preserve">: the self-study claim corrected on </w:t>
+      </w:r>
+      <w:r>
+        <w:rPr>
+          <w:rFonts w:ascii="Consolas" w:cs="Consolas" w:eastAsia="Consolas" w:hAnsi="Consolas"/>
+          <w:color w:val="2A2620"/>
+          <w:sz w:val="20"/>
+          <w:szCs w:val="20"/>
+        </w:rPr>
+        <w:t xml:space="preserve">/for-therapists/ethics-ceus/</w:t>
+      </w:r>
+      <w:r>
+        <w:rPr>
+          <w:rFonts w:ascii="Arial" w:cs="Arial" w:eastAsia="Arial" w:hAnsi="Arial"/>
+          <w:color w:val="2A2620"/>
+          <w:sz w:val="20"/>
+          <w:szCs w:val="20"/>
+        </w:rPr>
+        <w:t xml:space="preserve"> and the licensure guide, citing §681.140(h)(4), which was fetched and read.</w:t>
       </w:r>
     </w:p>
     <w:p>
@@ -2450,7 +3836,7 @@
           <w:ilvl w:val="0"/>
           <w:numId w:val="1"/>
         </w:numPr>
-        <w:spacing w:after="110" w:line="276"/>
+        <w:spacing w:after="90" w:line="276"/>
       </w:pPr>
       <w:r>
         <w:rPr>
@@ -2461,16 +3847,34 @@
           <w:sz w:val="20"/>
           <w:szCs w:val="20"/>
         </w:rPr>
-        <w:t xml:space="preserve">B6 — the Book schema.</w:t>
-      </w:r>
-      <w:r>
-        <w:rPr>
-          <w:rFonts w:ascii="Arial" w:cs="Arial" w:eastAsia="Arial" w:hAnsi="Arial"/>
-          <w:color w:val="2A2620"/>
-          <w:sz w:val="20"/>
-          <w:szCs w:val="20"/>
-        </w:rPr>
-        <w:t xml:space="preserve">  bookFormat Paperback, numberOfPages 50, ISBN 9798279656875.</w:t>
+        <w:t xml:space="preserve">I3</w:t>
+      </w:r>
+      <w:r>
+        <w:rPr>
+          <w:rFonts w:ascii="Arial" w:cs="Arial" w:eastAsia="Arial" w:hAnsi="Arial"/>
+          <w:color w:val="2A2620"/>
+          <w:sz w:val="20"/>
+          <w:szCs w:val="20"/>
+        </w:rPr>
+        <w:t xml:space="preserve">: limits of confidentiality on </w:t>
+      </w:r>
+      <w:r>
+        <w:rPr>
+          <w:rFonts w:ascii="Consolas" w:cs="Consolas" w:eastAsia="Consolas" w:hAnsi="Consolas"/>
+          <w:color w:val="2A2620"/>
+          <w:sz w:val="20"/>
+          <w:szCs w:val="20"/>
+        </w:rPr>
+        <w:t xml:space="preserve">/contact/forms/</w:t>
+      </w:r>
+      <w:r>
+        <w:rPr>
+          <w:rFonts w:ascii="Arial" w:cs="Arial" w:eastAsia="Arial" w:hAnsi="Arial"/>
+          <w:color w:val="2A2620"/>
+          <w:sz w:val="20"/>
+          <w:szCs w:val="20"/>
+        </w:rPr>
+        <w:t xml:space="preserve"> now says abuse and neglect reporting is required and disclosure for a serious threat is permitted; the PDF is Reem's to fix.</w:t>
       </w:r>
     </w:p>
     <w:p>
@@ -2480,7 +3884,7 @@
           <w:ilvl w:val="0"/>
           <w:numId w:val="1"/>
         </w:numPr>
-        <w:spacing w:after="110" w:line="276"/>
+        <w:spacing w:after="90" w:line="276"/>
       </w:pPr>
       <w:r>
         <w:rPr>
@@ -2491,16 +3895,16 @@
           <w:sz w:val="20"/>
           <w:szCs w:val="20"/>
         </w:rPr>
-        <w:t xml:space="preserve">B7 — the About portrait.</w:t>
-      </w:r>
-      <w:r>
-        <w:rPr>
-          <w:rFonts w:ascii="Arial" w:cs="Arial" w:eastAsia="Arial" w:hAnsi="Arial"/>
-          <w:color w:val="2A2620"/>
-          <w:sz w:val="20"/>
-          <w:szCs w:val="20"/>
-        </w:rPr>
-        <w:t xml:space="preserve">  Now reem-portrait.jpg, not a watercolor from the book.</w:t>
+        <w:t xml:space="preserve">I4</w:t>
+      </w:r>
+      <w:r>
+        <w:rPr>
+          <w:rFonts w:ascii="Arial" w:cs="Arial" w:eastAsia="Arial" w:hAnsi="Arial"/>
+          <w:color w:val="2A2620"/>
+          <w:sz w:val="20"/>
+          <w:szCs w:val="20"/>
+        </w:rPr>
+        <w:t xml:space="preserve">: the walk-and-talk page no longer promises confidentiality "exactly as it is in a room", in the section and in the FAQ.</w:t>
       </w:r>
     </w:p>
     <w:p>
@@ -2510,7 +3914,7 @@
           <w:ilvl w:val="0"/>
           <w:numId w:val="1"/>
         </w:numPr>
-        <w:spacing w:after="110" w:line="276"/>
+        <w:spacing w:after="90" w:line="276"/>
       </w:pPr>
       <w:r>
         <w:rPr>
@@ -2521,16 +3925,16 @@
           <w:sz w:val="20"/>
           <w:szCs w:val="20"/>
         </w:rPr>
-        <w:t xml:space="preserve">The thirteen build notes.</w:t>
-      </w:r>
-      <w:r>
-        <w:rPr>
-          <w:rFonts w:ascii="Arial" w:cs="Arial" w:eastAsia="Arial" w:hAnsi="Arial"/>
-          <w:color w:val="2A2620"/>
-          <w:sz w:val="20"/>
-          <w:szCs w:val="20"/>
-        </w:rPr>
-        <w:t xml:space="preserve">  Zero remain in source. The five note paragraphs still rendering are deliberate user-facing notices.</w:t>
+        <w:t xml:space="preserve">I5</w:t>
+      </w:r>
+      <w:r>
+        <w:rPr>
+          <w:rFonts w:ascii="Arial" w:cs="Arial" w:eastAsia="Arial" w:hAnsi="Arial"/>
+          <w:color w:val="2A2620"/>
+          <w:sz w:val="20"/>
+          <w:szCs w:val="20"/>
+        </w:rPr>
+        <w:t xml:space="preserve">: "walk and table" fixed in four files.</w:t>
       </w:r>
     </w:p>
     <w:p>
@@ -2540,7 +3944,7 @@
           <w:ilvl w:val="0"/>
           <w:numId w:val="1"/>
         </w:numPr>
-        <w:spacing w:after="110" w:line="276"/>
+        <w:spacing w:after="90" w:line="276"/>
       </w:pPr>
       <w:r>
         <w:rPr>
@@ -2551,16 +3955,16 @@
           <w:sz w:val="20"/>
           <w:szCs w:val="20"/>
         </w:rPr>
-        <w:t xml:space="preserve">The three photograph placeholders.</w:t>
-      </w:r>
-      <w:r>
-        <w:rPr>
-          <w:rFonts w:ascii="Arial" w:cs="Arial" w:eastAsia="Arial" w:hAnsi="Arial"/>
-          <w:color w:val="2A2620"/>
-          <w:sz w:val="20"/>
-          <w:szCs w:val="20"/>
-        </w:rPr>
-        <w:t xml:space="preserve">  All filled. The build prints none.</w:t>
+        <w:t xml:space="preserve">I7</w:t>
+      </w:r>
+      <w:r>
+        <w:rPr>
+          <w:rFonts w:ascii="Arial" w:cs="Arial" w:eastAsia="Arial" w:hAnsi="Arial"/>
+          <w:color w:val="2A2620"/>
+          <w:sz w:val="20"/>
+          <w:szCs w:val="20"/>
+        </w:rPr>
+        <w:t xml:space="preserve">: the breathing widget has an opt-out line visible before Start, and the book plug no longer implies the widget is the book's breath step.</w:t>
       </w:r>
     </w:p>
     <w:p>
@@ -2570,7 +3974,7 @@
           <w:ilvl w:val="0"/>
           <w:numId w:val="1"/>
         </w:numPr>
-        <w:spacing w:after="110" w:line="276"/>
+        <w:spacing w:after="90" w:line="276"/>
       </w:pPr>
       <w:r>
         <w:rPr>
@@ -2581,16 +3985,52 @@
           <w:sz w:val="20"/>
           <w:szCs w:val="20"/>
         </w:rPr>
-        <w:t xml:space="preserve">The client portal.</w:t>
-      </w:r>
-      <w:r>
-        <w:rPr>
-          <w:rFonts w:ascii="Arial" w:cs="Arial" w:eastAsia="Arial" w:hAnsi="Arial"/>
-          <w:color w:val="2A2620"/>
-          <w:sz w:val="20"/>
-          <w:szCs w:val="20"/>
-        </w:rPr>
-        <w:t xml:space="preserve">  site.portal removed entirely; zero portal references on any page, so no inert buttons remain.</w:t>
+        <w:t xml:space="preserve">I8</w:t>
+      </w:r>
+      <w:r>
+        <w:rPr>
+          <w:rFonts w:ascii="Arial" w:cs="Arial" w:eastAsia="Arial" w:hAnsi="Arial"/>
+          <w:color w:val="2A2620"/>
+          <w:sz w:val="20"/>
+          <w:szCs w:val="20"/>
+        </w:rPr>
+        <w:t xml:space="preserve"> and the follow-ups: hero text sizes and measures across all 39 pages; </w:t>
+      </w:r>
+      <w:r>
+        <w:rPr>
+          <w:rFonts w:ascii="Consolas" w:cs="Consolas" w:eastAsia="Consolas" w:hAnsi="Consolas"/>
+          <w:color w:val="2A2620"/>
+          <w:sz w:val="20"/>
+          <w:szCs w:val="20"/>
+        </w:rPr>
+        <w:t xml:space="preserve">/therapy/</w:t>
+      </w:r>
+      <w:r>
+        <w:rPr>
+          <w:rFonts w:ascii="Arial" w:cs="Arial" w:eastAsia="Arial" w:hAnsi="Arial"/>
+          <w:color w:val="2A2620"/>
+          <w:sz w:val="20"/>
+          <w:szCs w:val="20"/>
+        </w:rPr>
+        <w:t xml:space="preserve"> and </w:t>
+      </w:r>
+      <w:r>
+        <w:rPr>
+          <w:rFonts w:ascii="Consolas" w:cs="Consolas" w:eastAsia="Consolas" w:hAnsi="Consolas"/>
+          <w:color w:val="2A2620"/>
+          <w:sz w:val="20"/>
+          <w:szCs w:val="20"/>
+        </w:rPr>
+        <w:t xml:space="preserve">/therapy/associates/</w:t>
+      </w:r>
+      <w:r>
+        <w:rPr>
+          <w:rFonts w:ascii="Arial" w:cs="Arial" w:eastAsia="Arial" w:hAnsi="Arial"/>
+          <w:color w:val="2A2620"/>
+          <w:sz w:val="20"/>
+          <w:szCs w:val="20"/>
+        </w:rPr>
+        <w:t xml:space="preserve"> went from 16px at 147 characters to 19px at under 100.</w:t>
       </w:r>
     </w:p>
     <w:p>
@@ -2600,7 +4040,7 @@
           <w:ilvl w:val="0"/>
           <w:numId w:val="1"/>
         </w:numPr>
-        <w:spacing w:after="110" w:line="276"/>
+        <w:spacing w:after="90" w:line="276"/>
       </w:pPr>
       <w:r>
         <w:rPr>
@@ -2611,16 +4051,34 @@
           <w:sz w:val="20"/>
           <w:szCs w:val="20"/>
         </w:rPr>
-        <w:t xml:space="preserve">site.phone.</w:t>
-      </w:r>
-      <w:r>
-        <w:rPr>
-          <w:rFonts w:ascii="Arial" w:cs="Arial" w:eastAsia="Arial" w:hAnsi="Arial"/>
-          <w:color w:val="2A2620"/>
-          <w:sz w:val="20"/>
-          <w:szCs w:val="20"/>
-        </w:rPr>
-        <w:t xml:space="preserve">  Set to 512-965-5105 and rendering in the footer.</w:t>
+        <w:t xml:space="preserve">I9</w:t>
+      </w:r>
+      <w:r>
+        <w:rPr>
+          <w:rFonts w:ascii="Arial" w:cs="Arial" w:eastAsia="Arial" w:hAnsi="Arial"/>
+          <w:color w:val="2A2620"/>
+          <w:sz w:val="20"/>
+          <w:szCs w:val="20"/>
+        </w:rPr>
+        <w:t xml:space="preserve">: phone number on the consult request page as a </w:t>
+      </w:r>
+      <w:r>
+        <w:rPr>
+          <w:rFonts w:ascii="Consolas" w:cs="Consolas" w:eastAsia="Consolas" w:hAnsi="Consolas"/>
+          <w:color w:val="2A2620"/>
+          <w:sz w:val="20"/>
+          <w:szCs w:val="20"/>
+        </w:rPr>
+        <w:t xml:space="preserve">tel:+1</w:t>
+      </w:r>
+      <w:r>
+        <w:rPr>
+          <w:rFonts w:ascii="Arial" w:cs="Arial" w:eastAsia="Arial" w:hAnsi="Arial"/>
+          <w:color w:val="2A2620"/>
+          <w:sz w:val="20"/>
+          <w:szCs w:val="20"/>
+        </w:rPr>
+        <w:t xml:space="preserve"> link.</w:t>
       </w:r>
     </w:p>
     <w:p>
@@ -2630,7 +4088,7 @@
           <w:ilvl w:val="0"/>
           <w:numId w:val="1"/>
         </w:numPr>
-        <w:spacing w:after="110" w:line="276"/>
+        <w:spacing w:after="90" w:line="276"/>
       </w:pPr>
       <w:r>
         <w:rPr>
@@ -2641,16 +4099,16 @@
           <w:sz w:val="20"/>
           <w:szCs w:val="20"/>
         </w:rPr>
-        <w:t xml:space="preserve">site.psychologyToday.</w:t>
-      </w:r>
-      <w:r>
-        <w:rPr>
-          <w:rFonts w:ascii="Arial" w:cs="Arial" w:eastAsia="Arial" w:hAnsi="Arial"/>
-          <w:color w:val="2A2620"/>
-          <w:sz w:val="20"/>
-          <w:szCs w:val="20"/>
-        </w:rPr>
-        <w:t xml:space="preserve">  Removed; the sameAs now uses the EMDRIA and NARM directory profiles instead of a search-results URL.</w:t>
+        <w:t xml:space="preserve">I10</w:t>
+      </w:r>
+      <w:r>
+        <w:rPr>
+          <w:rFonts w:ascii="Arial" w:cs="Arial" w:eastAsia="Arial" w:hAnsi="Arial"/>
+          <w:color w:val="2A2620"/>
+          <w:sz w:val="20"/>
+          <w:szCs w:val="20"/>
+        </w:rPr>
+        <w:t xml:space="preserve">: the caseload row reframed; placement row kept and clarified.</w:t>
       </w:r>
     </w:p>
     <w:p>
@@ -2660,7 +4118,7 @@
           <w:ilvl w:val="0"/>
           <w:numId w:val="1"/>
         </w:numPr>
-        <w:spacing w:after="110" w:line="276"/>
+        <w:spacing w:after="90" w:line="276"/>
       </w:pPr>
       <w:r>
         <w:rPr>
@@ -2671,16 +4129,16 @@
           <w:sz w:val="20"/>
           <w:szCs w:val="20"/>
         </w:rPr>
-        <w:t xml:space="preserve">The supervision openings figure.</w:t>
-      </w:r>
-      <w:r>
-        <w:rPr>
-          <w:rFonts w:ascii="Arial" w:cs="Arial" w:eastAsia="Arial" w:hAnsi="Arial"/>
-          <w:color w:val="2A2620"/>
-          <w:sz w:val="20"/>
-          <w:szCs w:val="20"/>
-        </w:rPr>
-        <w:t xml:space="preserve">  "One spot opens in spring 2027" appeared on seven pages and in llms.txt and could not be confirmed. Replaced with "ask about current availability", true whatever the number is.</w:t>
+        <w:t xml:space="preserve">I14</w:t>
+      </w:r>
+      <w:r>
+        <w:rPr>
+          <w:rFonts w:ascii="Arial" w:cs="Arial" w:eastAsia="Arial" w:hAnsi="Arial"/>
+          <w:color w:val="2A2620"/>
+          <w:sz w:val="20"/>
+          <w:szCs w:val="20"/>
+        </w:rPr>
+        <w:t xml:space="preserve">: robots, sitemap and canonicals verified; Search Console itself is a manual step with the checklist in the plan.</w:t>
       </w:r>
     </w:p>
     <w:p>
@@ -2690,7 +4148,39 @@
           <w:ilvl w:val="0"/>
           <w:numId w:val="1"/>
         </w:numPr>
-        <w:spacing w:after="110" w:line="276"/>
+        <w:spacing w:after="90" w:line="276"/>
+      </w:pPr>
+      <w:r>
+        <w:rPr>
+          <w:rFonts w:ascii="Arial" w:cs="Arial" w:eastAsia="Arial" w:hAnsi="Arial"/>
+          <w:color w:val="2A2620"/>
+          <w:sz w:val="20"/>
+          <w:szCs w:val="20"/>
+        </w:rPr>
+        <w:t xml:space="preserve">Also: the dead </w:t>
+      </w:r>
+      <w:r>
+        <w:rPr>
+          <w:rFonts w:ascii="Consolas" w:cs="Consolas" w:eastAsia="Consolas" w:hAnsi="Consolas"/>
+          <w:color w:val="2A2620"/>
+          <w:sz w:val="20"/>
+          <w:szCs w:val="20"/>
+        </w:rPr>
+        <w:t xml:space="preserve">#emdria</w:t>
+      </w:r>
+      <w:r>
+        <w:rPr>
+          <w:rFonts w:ascii="Arial" w:cs="Arial" w:eastAsia="Arial" w:hAnsi="Arial"/>
+          <w:color w:val="2A2620"/>
+          <w:sz w:val="20"/>
+          <w:szCs w:val="20"/>
+        </w:rPr>
+        <w:t xml:space="preserve"> fragment on the EMDR consultation page (hero button to a section that had lost its id) found by the checker and fixed.</w:t>
+      </w:r>
+    </w:p>
+    <w:p>
+      <w:pPr>
+        <w:spacing w:after="70" w:before="0" w:line="276"/>
       </w:pPr>
       <w:r>
         <w:rPr>
@@ -2701,26 +4191,22 @@
           <w:sz w:val="20"/>
           <w:szCs w:val="20"/>
         </w:rPr>
-        <w:t xml:space="preserve">The licensure dates.</w:t>
-      </w:r>
-      <w:r>
-        <w:rPr>
-          <w:rFonts w:ascii="Arial" w:cs="Arial" w:eastAsia="Arial" w:hAnsi="Arial"/>
-          <w:color w:val="2A2620"/>
-          <w:sz w:val="20"/>
-          <w:szCs w:val="20"/>
-        </w:rPr>
-        <w:t xml:space="preserve">  The site said LPC-S since 2009 in fourteen places across eleven files, mostly hardcoded. Corrected to LPC since 2010 and LPC-S since 2016, now read from site.js. The new pairing is consistent with the five-year unrestricted-licence rule the guide itself explains; the old one was not.</w:t>
-      </w:r>
-    </w:p>
-    <w:p>
-      <w:pPr>
-        <w:pStyle w:val="ListParagraph"/>
-        <w:numPr>
-          <w:ilvl w:val="0"/>
-          <w:numId w:val="1"/>
-        </w:numPr>
-        <w:spacing w:after="110" w:line="276"/>
+        <w:t xml:space="preserve">Skipped by choice:</w:t>
+      </w:r>
+      <w:r>
+        <w:rPr>
+          <w:rFonts w:ascii="Arial" w:cs="Arial" w:eastAsia="Arial" w:hAnsi="Arial"/>
+          <w:color w:val="2A2620"/>
+          <w:sz w:val="20"/>
+          <w:szCs w:val="20"/>
+        </w:rPr>
+        <w:t xml:space="preserve"> I6 (telehealth "because" clause) was not run. Still open in the plan.</w:t>
+      </w:r>
+    </w:p>
+    <w:p>
+      <w:pPr>
+        <w:pStyle w:val="Heading1"/>
+        <w:spacing w:after="140" w:before="360"/>
       </w:pPr>
       <w:r>
         <w:rPr>
@@ -2728,70 +4214,60 @@
           <w:b/>
           <w:bCs/>
           <w:color w:val="2A2620"/>
-          <w:sz w:val="20"/>
-          <w:szCs w:val="20"/>
-        </w:rPr>
-        <w:t xml:space="preserve">Consult buttons.</w:t>
-      </w:r>
-      <w:r>
-        <w:rPr>
-          <w:rFonts w:ascii="Arial" w:cs="Arial" w:eastAsia="Arial" w:hAnsi="Arial"/>
-          <w:color w:val="2A2620"/>
-          <w:sz w:val="20"/>
-          <w:szCs w:val="20"/>
-        </w:rPr>
-        <w:t xml:space="preserve">  Fifteen variants are now one label, "Request a consult", on one destination, /contact/appointment/, in all 50 places.</w:t>
-      </w:r>
-    </w:p>
-    <w:p>
-      <w:pPr>
-        <w:pStyle w:val="ListParagraph"/>
-        <w:numPr>
-          <w:ilvl w:val="0"/>
-          <w:numId w:val="1"/>
-        </w:numPr>
-        <w:spacing w:after="110" w:line="276"/>
-      </w:pPr>
-      <w:r>
-        <w:rPr>
-          <w:rFonts w:ascii="Arial" w:cs="Arial" w:eastAsia="Arial" w:hAnsi="Arial"/>
-          <w:b/>
-          <w:bCs/>
-          <w:color w:val="2A2620"/>
-          <w:sz w:val="20"/>
-          <w:szCs w:val="20"/>
-        </w:rPr>
-        <w:t xml:space="preserve">"It spans the career" had nothing behind it.</w:t>
-      </w:r>
-      <w:r>
-        <w:rPr>
-          <w:rFonts w:ascii="Arial" w:cs="Arial" w:eastAsia="Arial" w:hAnsi="Arial"/>
-          <w:color w:val="2A2620"/>
-          <w:sz w:val="20"/>
-          <w:szCs w:val="20"/>
-        </w:rPr>
-        <w:t xml:space="preserve">  /for-therapists/lpc-supervision/ now has "What changes when you are licensed": supervision and its fee end, EMDR consultation goes from free to $185 an hour and keeps counting toward EMDRIA certification, ethics hours become recurring, the retreat stays open.</w:t>
-      </w:r>
-    </w:p>
-    <w:p>
-      <w:pPr>
-        <w:pStyle w:val="ListParagraph"/>
-        <w:numPr>
-          <w:ilvl w:val="0"/>
-          <w:numId w:val="1"/>
-        </w:numPr>
-        <w:spacing w:after="110" w:line="276"/>
-      </w:pPr>
-      <w:r>
-        <w:rPr>
-          <w:rFonts w:ascii="Arial" w:cs="Arial" w:eastAsia="Arial" w:hAnsi="Arial"/>
-          <w:b/>
-          <w:bCs/>
-          <w:color w:val="2A2620"/>
-          <w:sz w:val="20"/>
-          <w:szCs w:val="20"/>
-        </w:rPr>
-        <w:t xml:space="preserve">The blog is in the top nav.</w:t>
+          <w:sz w:val="30"/>
+          <w:szCs w:val="30"/>
+        </w:rPr>
+        <w:t xml:space="preserve">Closed before today</w:t>
+      </w:r>
+    </w:p>
+    <w:p>
+      <w:pPr>
+        <w:spacing w:after="140" w:before="0" w:line="276"/>
+      </w:pPr>
+      <w:r>
+        <w:rPr>
+          <w:rFonts w:ascii="Arial" w:cs="Arial" w:eastAsia="Arial" w:hAnsi="Arial"/>
+          <w:color w:val="2A2620"/>
+          <w:sz w:val="20"/>
+          <w:szCs w:val="20"/>
+        </w:rPr>
+        <w:t xml:space="preserve">Recorded in the previous version and still true: A3 (personal Gmail), A4 (associate fee range), A5 (insurance rows), A6/B9 (intake PDFs linked), B3 (equine fee), B6 (Book schema), B7 (About portrait), the thirteen build notes, the three photo placeholders, the client portal, </w:t>
+      </w:r>
+      <w:r>
+        <w:rPr>
+          <w:rFonts w:ascii="Consolas" w:cs="Consolas" w:eastAsia="Consolas" w:hAnsi="Consolas"/>
+          <w:color w:val="2A2620"/>
+          <w:sz w:val="20"/>
+          <w:szCs w:val="20"/>
+        </w:rPr>
+        <w:t xml:space="preserve">site.phone</w:t>
+      </w:r>
+      <w:r>
+        <w:rPr>
+          <w:rFonts w:ascii="Arial" w:cs="Arial" w:eastAsia="Arial" w:hAnsi="Arial"/>
+          <w:color w:val="2A2620"/>
+          <w:sz w:val="20"/>
+          <w:szCs w:val="20"/>
+        </w:rPr>
+        <w:t xml:space="preserve">, </w:t>
+      </w:r>
+      <w:r>
+        <w:rPr>
+          <w:rFonts w:ascii="Consolas" w:cs="Consolas" w:eastAsia="Consolas" w:hAnsi="Consolas"/>
+          <w:color w:val="2A2620"/>
+          <w:sz w:val="20"/>
+          <w:szCs w:val="20"/>
+        </w:rPr>
+        <w:t xml:space="preserve">site.psychologyToday</w:t>
+      </w:r>
+      <w:r>
+        <w:rPr>
+          <w:rFonts w:ascii="Arial" w:cs="Arial" w:eastAsia="Arial" w:hAnsi="Arial"/>
+          <w:color w:val="2A2620"/>
+          <w:sz w:val="20"/>
+          <w:szCs w:val="20"/>
+        </w:rPr>
+        <w:t xml:space="preserve">, the "spring 2027" openings figure, the licensure dates (LPC 2010, LPC-S 2016), the consult buttons (one label, one destination), "What changes when you are licensed", and the blog in the top nav.</w:t>
       </w:r>
     </w:p>
     <w:sectPr>

</xml_diff>